<commit_message>
thesis data complete and charts too
</commit_message>
<xml_diff>
--- a/migration/Thesis Migration - Latest.docx
+++ b/migration/Thesis Migration - Latest.docx
@@ -5058,27 +5058,14 @@
       <w:r>
         <w:t>2.</w:t>
       </w:r>
-      <w:r>
-        <w:fldChar w:fldCharType="begin"/>
-      </w:r>
-      <w:r>
-        <w:instrText xml:space="preserve"> SEQ Figure \* ARABIC </w:instrText>
-      </w:r>
-      <w:r>
-        <w:fldChar w:fldCharType="separate"/>
-      </w:r>
-      <w:r>
-        <w:rPr>
-          <w:noProof/>
-        </w:rPr>
-        <w:t>1</w:t>
-      </w:r>
-      <w:r>
-        <w:rPr>
-          <w:noProof/>
-        </w:rPr>
-        <w:fldChar w:fldCharType="end"/>
-      </w:r>
+      <w:fldSimple w:instr=" SEQ Figure \* ARABIC ">
+        <w:r>
+          <w:rPr>
+            <w:noProof/>
+          </w:rPr>
+          <w:t>1</w:t>
+        </w:r>
+      </w:fldSimple>
       <w:r>
         <w:t xml:space="preserve"> Conceptual Framework of Migration Study</w:t>
       </w:r>
@@ -7381,6 +7368,18 @@
               </w:rPr>
               <w:t>Percent</w:t>
             </w:r>
+            <w:r>
+              <w:rPr>
+                <w:rFonts w:ascii="Calibri" w:eastAsia="Times New Roman" w:hAnsi="Calibri" w:cs="Calibri"/>
+                <w:color w:val="000000"/>
+                <w:kern w:val="0"/>
+                <w:sz w:val="22"/>
+                <w:szCs w:val="22"/>
+                <w:lang w:val="en-GB" w:eastAsia="en-GB" w:bidi="ne-NP"/>
+                <w14:ligatures w14:val="none"/>
+              </w:rPr>
+              <w:t>age (%)</w:t>
+            </w:r>
           </w:p>
         </w:tc>
         <w:tc>
@@ -7461,6 +7460,18 @@
               </w:rPr>
               <w:t>Percent</w:t>
             </w:r>
+            <w:r>
+              <w:rPr>
+                <w:rFonts w:ascii="Calibri" w:eastAsia="Times New Roman" w:hAnsi="Calibri" w:cs="Calibri"/>
+                <w:color w:val="000000"/>
+                <w:kern w:val="0"/>
+                <w:sz w:val="22"/>
+                <w:szCs w:val="22"/>
+                <w:lang w:val="en-GB" w:eastAsia="en-GB" w:bidi="ne-NP"/>
+                <w14:ligatures w14:val="none"/>
+              </w:rPr>
+              <w:t>age (%)</w:t>
+            </w:r>
           </w:p>
         </w:tc>
         <w:tc>
@@ -7541,6 +7552,18 @@
               </w:rPr>
               <w:t>Percent</w:t>
             </w:r>
+            <w:r>
+              <w:rPr>
+                <w:rFonts w:ascii="Calibri" w:eastAsia="Times New Roman" w:hAnsi="Calibri" w:cs="Calibri"/>
+                <w:color w:val="000000"/>
+                <w:kern w:val="0"/>
+                <w:sz w:val="22"/>
+                <w:szCs w:val="22"/>
+                <w:lang w:val="en-GB" w:eastAsia="en-GB" w:bidi="ne-NP"/>
+                <w14:ligatures w14:val="none"/>
+              </w:rPr>
+              <w:t>age (%)</w:t>
+            </w:r>
           </w:p>
         </w:tc>
       </w:tr>
@@ -8577,10 +8600,10 @@
         </w:rPr>
         <w:lastRenderedPageBreak/>
         <w:drawing>
-          <wp:inline distT="0" distB="0" distL="0" distR="0" wp14:anchorId="4D56C995" wp14:editId="158041A8">
-            <wp:extent cx="5052060" cy="3135630"/>
-            <wp:effectExtent l="0" t="0" r="15240" b="7620"/>
-            <wp:docPr id="529822045" name="Chart 1">
+          <wp:inline distT="0" distB="0" distL="0" distR="0" wp14:anchorId="07D2EBA8" wp14:editId="41A73072">
+            <wp:extent cx="5052060" cy="3265170"/>
+            <wp:effectExtent l="0" t="0" r="15240" b="11430"/>
+            <wp:docPr id="2016055610" name="Chart 1">
               <a:extLst xmlns:a="http://schemas.openxmlformats.org/drawingml/2006/main">
                 <a:ext uri="{FF2B5EF4-FFF2-40B4-BE49-F238E27FC236}">
                   <a16:creationId xmlns:a16="http://schemas.microsoft.com/office/drawing/2014/main" id="{00000000-0008-0000-0500-000006000000}"/>
@@ -8648,13 +8671,13 @@
     </w:p>
     <w:tbl>
       <w:tblPr>
-        <w:tblW w:w="3857" w:type="dxa"/>
+        <w:tblW w:w="4597" w:type="dxa"/>
         <w:tblLook w:val="04A0" w:firstRow="1" w:lastRow="0" w:firstColumn="1" w:lastColumn="0" w:noHBand="0" w:noVBand="1"/>
       </w:tblPr>
       <w:tblGrid>
         <w:gridCol w:w="1017"/>
         <w:gridCol w:w="1880"/>
-        <w:gridCol w:w="960"/>
+        <w:gridCol w:w="1700"/>
       </w:tblGrid>
       <w:tr>
         <w:trPr>
@@ -8750,7 +8773,7 @@
         </w:tc>
         <w:tc>
           <w:tcPr>
-            <w:tcW w:w="960" w:type="dxa"/>
+            <w:tcW w:w="1700" w:type="dxa"/>
             <w:tcBorders>
               <w:top w:val="single" w:sz="4" w:space="0" w:color="auto"/>
               <w:left w:val="nil"/>
@@ -8789,6 +8812,20 @@
                 <w14:ligatures w14:val="none"/>
               </w:rPr>
               <w:t>Percent</w:t>
+            </w:r>
+            <w:r>
+              <w:rPr>
+                <w:rFonts w:ascii="Calibri" w:eastAsia="Times New Roman" w:hAnsi="Calibri" w:cs="Calibri"/>
+                <w:b/>
+                <w:bCs/>
+                <w:color w:val="000000"/>
+                <w:kern w:val="0"/>
+                <w:sz w:val="22"/>
+                <w:szCs w:val="22"/>
+                <w:lang w:val="en-GB" w:eastAsia="en-GB" w:bidi="ne-NP"/>
+                <w14:ligatures w14:val="none"/>
+              </w:rPr>
+              <w:t>age (%)</w:t>
             </w:r>
           </w:p>
         </w:tc>
@@ -8880,7 +8917,7 @@
         </w:tc>
         <w:tc>
           <w:tcPr>
-            <w:tcW w:w="960" w:type="dxa"/>
+            <w:tcW w:w="1700" w:type="dxa"/>
             <w:tcBorders>
               <w:top w:val="nil"/>
               <w:left w:val="nil"/>
@@ -9007,7 +9044,7 @@
         </w:tc>
         <w:tc>
           <w:tcPr>
-            <w:tcW w:w="960" w:type="dxa"/>
+            <w:tcW w:w="1700" w:type="dxa"/>
             <w:tcBorders>
               <w:top w:val="nil"/>
               <w:left w:val="nil"/>
@@ -9136,7 +9173,7 @@
         </w:tc>
         <w:tc>
           <w:tcPr>
-            <w:tcW w:w="960" w:type="dxa"/>
+            <w:tcW w:w="1700" w:type="dxa"/>
             <w:tcBorders>
               <w:top w:val="nil"/>
               <w:left w:val="nil"/>
@@ -9263,7 +9300,7 @@
         </w:tc>
         <w:tc>
           <w:tcPr>
-            <w:tcW w:w="960" w:type="dxa"/>
+            <w:tcW w:w="1700" w:type="dxa"/>
             <w:tcBorders>
               <w:top w:val="nil"/>
               <w:left w:val="nil"/>
@@ -9390,7 +9427,7 @@
         </w:tc>
         <w:tc>
           <w:tcPr>
-            <w:tcW w:w="960" w:type="dxa"/>
+            <w:tcW w:w="1700" w:type="dxa"/>
             <w:tcBorders>
               <w:top w:val="nil"/>
               <w:left w:val="nil"/>
@@ -9554,20 +9591,14 @@
           <w:b/>
           <w:bCs/>
         </w:rPr>
+        <w:lastRenderedPageBreak/>
         <w:t>Dalit households have the lowest representation</w:t>
       </w:r>
       <w:r>
         <w:rPr>
           <w:rFonts w:ascii="Times New Roman" w:hAnsi="Times New Roman" w:cs="Times New Roman"/>
         </w:rPr>
-        <w:t xml:space="preserve">, with only 6 </w:t>
-      </w:r>
-      <w:r>
-        <w:rPr>
-          <w:rFonts w:ascii="Times New Roman" w:hAnsi="Times New Roman" w:cs="Times New Roman"/>
-        </w:rPr>
-        <w:lastRenderedPageBreak/>
-        <w:t xml:space="preserve">households or </w:t>
+        <w:t xml:space="preserve">, with only 6 households or </w:t>
       </w:r>
       <w:r>
         <w:rPr>
@@ -9598,10 +9629,10 @@
           <w:noProof/>
         </w:rPr>
         <w:drawing>
-          <wp:inline distT="0" distB="0" distL="0" distR="0" wp14:anchorId="42AF2431" wp14:editId="54552DA7">
-            <wp:extent cx="4572000" cy="2636520"/>
-            <wp:effectExtent l="0" t="0" r="0" b="11430"/>
-            <wp:docPr id="1348941862" name="Chart 1">
+          <wp:inline distT="0" distB="0" distL="0" distR="0" wp14:anchorId="20B4AA8E" wp14:editId="608C09A0">
+            <wp:extent cx="4572000" cy="2743200"/>
+            <wp:effectExtent l="0" t="0" r="0" b="0"/>
+            <wp:docPr id="1505492659" name="Chart 1">
               <a:extLst xmlns:a="http://schemas.openxmlformats.org/drawingml/2006/main">
                 <a:ext uri="{FF2B5EF4-FFF2-40B4-BE49-F238E27FC236}">
                   <a16:creationId xmlns:a16="http://schemas.microsoft.com/office/drawing/2014/main" id="{BFC834FE-EB00-B6DE-B2AC-977A6245A4B8}"/>
@@ -9656,13 +9687,13 @@
     </w:p>
     <w:tbl>
       <w:tblPr>
-        <w:tblW w:w="3709" w:type="dxa"/>
+        <w:tblW w:w="4693" w:type="dxa"/>
         <w:tblLook w:val="04A0" w:firstRow="1" w:lastRow="0" w:firstColumn="1" w:lastColumn="0" w:noHBand="0" w:noVBand="1"/>
       </w:tblPr>
       <w:tblGrid>
         <w:gridCol w:w="1009"/>
-        <w:gridCol w:w="1780"/>
-        <w:gridCol w:w="920"/>
+        <w:gridCol w:w="1984"/>
+        <w:gridCol w:w="1700"/>
       </w:tblGrid>
       <w:tr>
         <w:trPr>
@@ -9714,7 +9745,7 @@
         </w:tc>
         <w:tc>
           <w:tcPr>
-            <w:tcW w:w="1780" w:type="dxa"/>
+            <w:tcW w:w="1984" w:type="dxa"/>
             <w:tcBorders>
               <w:top w:val="single" w:sz="4" w:space="0" w:color="auto"/>
               <w:left w:val="nil"/>
@@ -9758,7 +9789,7 @@
         </w:tc>
         <w:tc>
           <w:tcPr>
-            <w:tcW w:w="920" w:type="dxa"/>
+            <w:tcW w:w="1700" w:type="dxa"/>
             <w:tcBorders>
               <w:top w:val="single" w:sz="4" w:space="0" w:color="auto"/>
               <w:left w:val="nil"/>
@@ -9797,6 +9828,20 @@
                 <w14:ligatures w14:val="none"/>
               </w:rPr>
               <w:t>Percent</w:t>
+            </w:r>
+            <w:r>
+              <w:rPr>
+                <w:rFonts w:ascii="Calibri" w:eastAsia="Times New Roman" w:hAnsi="Calibri" w:cs="Calibri"/>
+                <w:b/>
+                <w:bCs/>
+                <w:color w:val="000000"/>
+                <w:kern w:val="0"/>
+                <w:sz w:val="22"/>
+                <w:szCs w:val="22"/>
+                <w:lang w:val="en-GB" w:eastAsia="en-GB" w:bidi="ne-NP"/>
+                <w14:ligatures w14:val="none"/>
+              </w:rPr>
+              <w:t>age (%)</w:t>
             </w:r>
           </w:p>
         </w:tc>
@@ -9847,7 +9892,7 @@
         </w:tc>
         <w:tc>
           <w:tcPr>
-            <w:tcW w:w="1780" w:type="dxa"/>
+            <w:tcW w:w="1984" w:type="dxa"/>
             <w:tcBorders>
               <w:top w:val="nil"/>
               <w:left w:val="nil"/>
@@ -9888,7 +9933,7 @@
         </w:tc>
         <w:tc>
           <w:tcPr>
-            <w:tcW w:w="920" w:type="dxa"/>
+            <w:tcW w:w="1700" w:type="dxa"/>
             <w:tcBorders>
               <w:top w:val="nil"/>
               <w:left w:val="nil"/>
@@ -9974,7 +10019,7 @@
         </w:tc>
         <w:tc>
           <w:tcPr>
-            <w:tcW w:w="1780" w:type="dxa"/>
+            <w:tcW w:w="1984" w:type="dxa"/>
             <w:tcBorders>
               <w:top w:val="nil"/>
               <w:left w:val="nil"/>
@@ -10015,7 +10060,7 @@
         </w:tc>
         <w:tc>
           <w:tcPr>
-            <w:tcW w:w="920" w:type="dxa"/>
+            <w:tcW w:w="1700" w:type="dxa"/>
             <w:tcBorders>
               <w:top w:val="nil"/>
               <w:left w:val="nil"/>
@@ -10101,7 +10146,7 @@
         </w:tc>
         <w:tc>
           <w:tcPr>
-            <w:tcW w:w="1780" w:type="dxa"/>
+            <w:tcW w:w="1984" w:type="dxa"/>
             <w:tcBorders>
               <w:top w:val="nil"/>
               <w:left w:val="nil"/>
@@ -10142,7 +10187,7 @@
         </w:tc>
         <w:tc>
           <w:tcPr>
-            <w:tcW w:w="920" w:type="dxa"/>
+            <w:tcW w:w="1700" w:type="dxa"/>
             <w:tcBorders>
               <w:top w:val="nil"/>
               <w:left w:val="nil"/>
@@ -10228,7 +10273,7 @@
         </w:tc>
         <w:tc>
           <w:tcPr>
-            <w:tcW w:w="1780" w:type="dxa"/>
+            <w:tcW w:w="1984" w:type="dxa"/>
             <w:tcBorders>
               <w:top w:val="nil"/>
               <w:left w:val="nil"/>
@@ -10269,7 +10314,7 @@
         </w:tc>
         <w:tc>
           <w:tcPr>
-            <w:tcW w:w="920" w:type="dxa"/>
+            <w:tcW w:w="1700" w:type="dxa"/>
             <w:tcBorders>
               <w:top w:val="nil"/>
               <w:left w:val="nil"/>
@@ -10355,7 +10400,7 @@
         </w:tc>
         <w:tc>
           <w:tcPr>
-            <w:tcW w:w="1780" w:type="dxa"/>
+            <w:tcW w:w="1984" w:type="dxa"/>
             <w:tcBorders>
               <w:top w:val="nil"/>
               <w:left w:val="nil"/>
@@ -10396,7 +10441,7 @@
         </w:tc>
         <w:tc>
           <w:tcPr>
-            <w:tcW w:w="920" w:type="dxa"/>
+            <w:tcW w:w="1700" w:type="dxa"/>
             <w:tcBorders>
               <w:top w:val="nil"/>
               <w:left w:val="nil"/>
@@ -10452,10 +10497,10 @@
         </w:rPr>
         <w:lastRenderedPageBreak/>
         <w:drawing>
-          <wp:inline distT="0" distB="0" distL="0" distR="0" wp14:anchorId="744E81F1" wp14:editId="62C530F7">
-            <wp:extent cx="4572000" cy="2506027"/>
-            <wp:effectExtent l="0" t="0" r="0" b="8890"/>
-            <wp:docPr id="100035633" name="Chart 1">
+          <wp:inline distT="0" distB="0" distL="0" distR="0" wp14:anchorId="24D4D8CD" wp14:editId="148DE7EC">
+            <wp:extent cx="4572000" cy="2605087"/>
+            <wp:effectExtent l="0" t="0" r="0" b="5080"/>
+            <wp:docPr id="1411481736" name="Chart 1">
               <a:extLst xmlns:a="http://schemas.openxmlformats.org/drawingml/2006/main">
                 <a:ext uri="{FF2B5EF4-FFF2-40B4-BE49-F238E27FC236}">
                   <a16:creationId xmlns:a16="http://schemas.microsoft.com/office/drawing/2014/main" id="{BB882F85-A674-F707-3722-99B1F7F8EDE6}"/>
@@ -10673,13 +10718,13 @@
     </w:p>
     <w:tbl>
       <w:tblPr>
-        <w:tblW w:w="5080" w:type="dxa"/>
+        <w:tblW w:w="5770" w:type="dxa"/>
         <w:tblLook w:val="04A0" w:firstRow="1" w:lastRow="0" w:firstColumn="1" w:lastColumn="0" w:noHBand="0" w:noVBand="1"/>
       </w:tblPr>
       <w:tblGrid>
-        <w:gridCol w:w="1880"/>
-        <w:gridCol w:w="1760"/>
-        <w:gridCol w:w="1440"/>
+        <w:gridCol w:w="2124"/>
+        <w:gridCol w:w="1970"/>
+        <w:gridCol w:w="1676"/>
       </w:tblGrid>
       <w:tr>
         <w:trPr>
@@ -10687,7 +10732,7 @@
         </w:trPr>
         <w:tc>
           <w:tcPr>
-            <w:tcW w:w="1880" w:type="dxa"/>
+            <w:tcW w:w="2124" w:type="dxa"/>
             <w:tcBorders>
               <w:top w:val="single" w:sz="4" w:space="0" w:color="auto"/>
               <w:left w:val="single" w:sz="4" w:space="0" w:color="auto"/>
@@ -10728,7 +10773,7 @@
         </w:tc>
         <w:tc>
           <w:tcPr>
-            <w:tcW w:w="1760" w:type="dxa"/>
+            <w:tcW w:w="1970" w:type="dxa"/>
             <w:tcBorders>
               <w:top w:val="single" w:sz="4" w:space="0" w:color="auto"/>
               <w:left w:val="nil"/>
@@ -10768,7 +10813,7 @@
         </w:tc>
         <w:tc>
           <w:tcPr>
-            <w:tcW w:w="1440" w:type="dxa"/>
+            <w:tcW w:w="1676" w:type="dxa"/>
             <w:tcBorders>
               <w:top w:val="single" w:sz="4" w:space="0" w:color="auto"/>
               <w:left w:val="nil"/>
@@ -10813,7 +10858,7 @@
         </w:trPr>
         <w:tc>
           <w:tcPr>
-            <w:tcW w:w="1880" w:type="dxa"/>
+            <w:tcW w:w="2124" w:type="dxa"/>
             <w:tcBorders>
               <w:top w:val="nil"/>
               <w:left w:val="single" w:sz="4" w:space="0" w:color="auto"/>
@@ -10855,7 +10900,7 @@
         </w:tc>
         <w:tc>
           <w:tcPr>
-            <w:tcW w:w="1760" w:type="dxa"/>
+            <w:tcW w:w="1970" w:type="dxa"/>
             <w:tcBorders>
               <w:top w:val="nil"/>
               <w:left w:val="nil"/>
@@ -10896,7 +10941,7 @@
         </w:tc>
         <w:tc>
           <w:tcPr>
-            <w:tcW w:w="1440" w:type="dxa"/>
+            <w:tcW w:w="1676" w:type="dxa"/>
             <w:tcBorders>
               <w:top w:val="nil"/>
               <w:left w:val="nil"/>
@@ -10942,7 +10987,7 @@
         </w:trPr>
         <w:tc>
           <w:tcPr>
-            <w:tcW w:w="1880" w:type="dxa"/>
+            <w:tcW w:w="2124" w:type="dxa"/>
             <w:tcBorders>
               <w:top w:val="nil"/>
               <w:left w:val="single" w:sz="4" w:space="0" w:color="auto"/>
@@ -10982,7 +11027,7 @@
         </w:tc>
         <w:tc>
           <w:tcPr>
-            <w:tcW w:w="1760" w:type="dxa"/>
+            <w:tcW w:w="1970" w:type="dxa"/>
             <w:tcBorders>
               <w:top w:val="nil"/>
               <w:left w:val="nil"/>
@@ -11023,7 +11068,7 @@
         </w:tc>
         <w:tc>
           <w:tcPr>
-            <w:tcW w:w="1440" w:type="dxa"/>
+            <w:tcW w:w="1676" w:type="dxa"/>
             <w:tcBorders>
               <w:top w:val="nil"/>
               <w:left w:val="nil"/>
@@ -11069,7 +11114,7 @@
         </w:trPr>
         <w:tc>
           <w:tcPr>
-            <w:tcW w:w="1880" w:type="dxa"/>
+            <w:tcW w:w="2124" w:type="dxa"/>
             <w:tcBorders>
               <w:top w:val="nil"/>
               <w:left w:val="single" w:sz="4" w:space="0" w:color="auto"/>
@@ -11109,7 +11154,7 @@
         </w:tc>
         <w:tc>
           <w:tcPr>
-            <w:tcW w:w="1760" w:type="dxa"/>
+            <w:tcW w:w="1970" w:type="dxa"/>
             <w:tcBorders>
               <w:top w:val="nil"/>
               <w:left w:val="nil"/>
@@ -11150,7 +11195,7 @@
         </w:tc>
         <w:tc>
           <w:tcPr>
-            <w:tcW w:w="1440" w:type="dxa"/>
+            <w:tcW w:w="1676" w:type="dxa"/>
             <w:tcBorders>
               <w:top w:val="nil"/>
               <w:left w:val="nil"/>
@@ -11196,7 +11241,7 @@
         </w:trPr>
         <w:tc>
           <w:tcPr>
-            <w:tcW w:w="1880" w:type="dxa"/>
+            <w:tcW w:w="2124" w:type="dxa"/>
             <w:tcBorders>
               <w:top w:val="nil"/>
               <w:left w:val="single" w:sz="4" w:space="0" w:color="auto"/>
@@ -11236,7 +11281,7 @@
         </w:tc>
         <w:tc>
           <w:tcPr>
-            <w:tcW w:w="1760" w:type="dxa"/>
+            <w:tcW w:w="1970" w:type="dxa"/>
             <w:tcBorders>
               <w:top w:val="nil"/>
               <w:left w:val="nil"/>
@@ -11277,7 +11322,7 @@
         </w:tc>
         <w:tc>
           <w:tcPr>
-            <w:tcW w:w="1440" w:type="dxa"/>
+            <w:tcW w:w="1676" w:type="dxa"/>
             <w:tcBorders>
               <w:top w:val="nil"/>
               <w:left w:val="nil"/>
@@ -11323,7 +11368,7 @@
         </w:trPr>
         <w:tc>
           <w:tcPr>
-            <w:tcW w:w="1880" w:type="dxa"/>
+            <w:tcW w:w="2124" w:type="dxa"/>
             <w:tcBorders>
               <w:top w:val="nil"/>
               <w:left w:val="single" w:sz="4" w:space="0" w:color="auto"/>
@@ -11363,7 +11408,7 @@
         </w:tc>
         <w:tc>
           <w:tcPr>
-            <w:tcW w:w="1760" w:type="dxa"/>
+            <w:tcW w:w="1970" w:type="dxa"/>
             <w:tcBorders>
               <w:top w:val="nil"/>
               <w:left w:val="nil"/>
@@ -11404,7 +11449,7 @@
         </w:tc>
         <w:tc>
           <w:tcPr>
-            <w:tcW w:w="1440" w:type="dxa"/>
+            <w:tcW w:w="1676" w:type="dxa"/>
             <w:tcBorders>
               <w:top w:val="nil"/>
               <w:left w:val="nil"/>
@@ -11450,7 +11495,7 @@
         </w:trPr>
         <w:tc>
           <w:tcPr>
-            <w:tcW w:w="1880" w:type="dxa"/>
+            <w:tcW w:w="2124" w:type="dxa"/>
             <w:tcBorders>
               <w:top w:val="nil"/>
               <w:left w:val="single" w:sz="4" w:space="0" w:color="auto"/>
@@ -11491,7 +11536,7 @@
         </w:tc>
         <w:tc>
           <w:tcPr>
-            <w:tcW w:w="1760" w:type="dxa"/>
+            <w:tcW w:w="1970" w:type="dxa"/>
             <w:tcBorders>
               <w:top w:val="nil"/>
               <w:left w:val="nil"/>
@@ -11532,7 +11577,7 @@
         </w:tc>
         <w:tc>
           <w:tcPr>
-            <w:tcW w:w="1440" w:type="dxa"/>
+            <w:tcW w:w="1676" w:type="dxa"/>
             <w:tcBorders>
               <w:top w:val="nil"/>
               <w:left w:val="nil"/>
@@ -11804,11 +11849,11 @@
     </w:p>
     <w:tbl>
       <w:tblPr>
-        <w:tblW w:w="5200" w:type="dxa"/>
+        <w:tblW w:w="5348" w:type="dxa"/>
         <w:tblLook w:val="04A0" w:firstRow="1" w:lastRow="0" w:firstColumn="1" w:lastColumn="0" w:noHBand="0" w:noVBand="1"/>
       </w:tblPr>
       <w:tblGrid>
-        <w:gridCol w:w="1720"/>
+        <w:gridCol w:w="1868"/>
         <w:gridCol w:w="1900"/>
         <w:gridCol w:w="1580"/>
       </w:tblGrid>
@@ -11818,7 +11863,7 @@
         </w:trPr>
         <w:tc>
           <w:tcPr>
-            <w:tcW w:w="1720" w:type="dxa"/>
+            <w:tcW w:w="1868" w:type="dxa"/>
             <w:tcBorders>
               <w:top w:val="single" w:sz="4" w:space="0" w:color="auto"/>
               <w:left w:val="single" w:sz="4" w:space="0" w:color="auto"/>
@@ -11943,7 +11988,7 @@
         </w:trPr>
         <w:tc>
           <w:tcPr>
-            <w:tcW w:w="1720" w:type="dxa"/>
+            <w:tcW w:w="1868" w:type="dxa"/>
             <w:tcBorders>
               <w:top w:val="nil"/>
               <w:left w:val="single" w:sz="4" w:space="0" w:color="auto"/>
@@ -12070,7 +12115,7 @@
         </w:trPr>
         <w:tc>
           <w:tcPr>
-            <w:tcW w:w="1720" w:type="dxa"/>
+            <w:tcW w:w="1868" w:type="dxa"/>
             <w:tcBorders>
               <w:top w:val="nil"/>
               <w:left w:val="single" w:sz="4" w:space="0" w:color="auto"/>
@@ -12197,7 +12242,7 @@
         </w:trPr>
         <w:tc>
           <w:tcPr>
-            <w:tcW w:w="1720" w:type="dxa"/>
+            <w:tcW w:w="1868" w:type="dxa"/>
             <w:tcBorders>
               <w:top w:val="nil"/>
               <w:left w:val="single" w:sz="4" w:space="0" w:color="auto"/>
@@ -12324,7 +12369,7 @@
         </w:trPr>
         <w:tc>
           <w:tcPr>
-            <w:tcW w:w="1720" w:type="dxa"/>
+            <w:tcW w:w="1868" w:type="dxa"/>
             <w:tcBorders>
               <w:top w:val="nil"/>
               <w:left w:val="single" w:sz="4" w:space="0" w:color="auto"/>
@@ -12473,10 +12518,10 @@
         </w:rPr>
         <w:lastRenderedPageBreak/>
         <w:drawing>
-          <wp:inline distT="0" distB="0" distL="0" distR="0" wp14:anchorId="53C75E73" wp14:editId="227F39AC">
-            <wp:extent cx="4572000" cy="2636520"/>
+          <wp:inline distT="0" distB="0" distL="0" distR="0" wp14:anchorId="7F028166" wp14:editId="30FC6985">
+            <wp:extent cx="4572000" cy="2743200"/>
             <wp:effectExtent l="0" t="0" r="0" b="0"/>
-            <wp:docPr id="1040439166" name="Chart 1">
+            <wp:docPr id="1912184368" name="Chart 1">
               <a:extLst xmlns:a="http://schemas.openxmlformats.org/drawingml/2006/main">
                 <a:ext uri="{FF2B5EF4-FFF2-40B4-BE49-F238E27FC236}">
                   <a16:creationId xmlns:a16="http://schemas.microsoft.com/office/drawing/2014/main" id="{BBE0CE10-00BA-C677-EBE8-7A4E78C2C427}"/>
@@ -12495,9 +12540,7 @@
     </w:p>
     <w:p>
       <w:pPr>
-        <w:pStyle w:val="ListParagraph"/>
         <w:spacing w:line="360" w:lineRule="auto"/>
-        <w:ind w:left="1800"/>
         <w:rPr>
           <w:rFonts w:ascii="Times New Roman" w:hAnsi="Times New Roman" w:cs="Times New Roman"/>
           <w:b/>
@@ -12515,9 +12558,7 @@
     </w:p>
     <w:p>
       <w:pPr>
-        <w:pStyle w:val="ListParagraph"/>
         <w:spacing w:line="360" w:lineRule="auto"/>
-        <w:ind w:left="1800"/>
         <w:rPr>
           <w:rFonts w:ascii="Times New Roman" w:hAnsi="Times New Roman" w:cs="Times New Roman"/>
         </w:rPr>
@@ -12526,54 +12567,8 @@
         <w:rPr>
           <w:rFonts w:ascii="Times New Roman" w:hAnsi="Times New Roman" w:cs="Times New Roman"/>
         </w:rPr>
-        <w:t>A</w:t>
-      </w:r>
-      <w:r>
-        <w:rPr>
-          <w:rFonts w:ascii="Times New Roman" w:hAnsi="Times New Roman" w:cs="Times New Roman"/>
-        </w:rPr>
-        <w:t>ge and sex composition is the main demographic parameter. The study of age and sex composition is also important for various studies such as the measurement of potential manpower and other demographic characteristics. Migration streams, trend and pattern are also influenced by age and sex structure of population. Age and sex distribution of the population in study area is shown in the following table.</w:t>
-      </w:r>
-    </w:p>
-    <w:p>
-      <w:pPr>
-        <w:pStyle w:val="ListParagraph"/>
-        <w:spacing w:line="360" w:lineRule="auto"/>
-        <w:ind w:left="1800"/>
-        <w:rPr>
-          <w:rFonts w:ascii="Times New Roman" w:hAnsi="Times New Roman" w:cs="Times New Roman"/>
-        </w:rPr>
-      </w:pPr>
-    </w:p>
-    <w:p>
-      <w:pPr>
-        <w:pStyle w:val="ListParagraph"/>
-        <w:spacing w:line="360" w:lineRule="auto"/>
-        <w:ind w:left="1800"/>
-        <w:rPr>
-          <w:rFonts w:ascii="Times New Roman" w:hAnsi="Times New Roman" w:cs="Times New Roman"/>
-        </w:rPr>
-      </w:pPr>
-    </w:p>
-    <w:p>
-      <w:pPr>
-        <w:pStyle w:val="ListParagraph"/>
-        <w:spacing w:line="360" w:lineRule="auto"/>
-        <w:ind w:left="1800"/>
-        <w:rPr>
-          <w:rFonts w:ascii="Times New Roman" w:hAnsi="Times New Roman" w:cs="Times New Roman"/>
-        </w:rPr>
-      </w:pPr>
-    </w:p>
-    <w:p>
-      <w:pPr>
-        <w:pStyle w:val="ListParagraph"/>
-        <w:spacing w:line="360" w:lineRule="auto"/>
-        <w:ind w:left="1800"/>
-        <w:rPr>
-          <w:rFonts w:ascii="Times New Roman" w:hAnsi="Times New Roman" w:cs="Times New Roman"/>
-        </w:rPr>
-      </w:pPr>
+        <w:t>Age and sex composition is the main demographic parameter. The study of age and sex composition is also important for various studies such as the measurement of potential manpower and other demographic characteristics. Migration streams, trend and pattern are also influenced by age and sex structure of population. Age and sex distribution of the population in study area is shown in the following table.</w:t>
+      </w:r>
     </w:p>
     <w:tbl>
       <w:tblPr>
@@ -15378,7 +15373,6 @@
                 <w:lang w:val="en-GB" w:eastAsia="en-GB" w:bidi="ne-NP"/>
                 <w14:ligatures w14:val="none"/>
               </w:rPr>
-              <w:lastRenderedPageBreak/>
               <w:t>40-44</w:t>
             </w:r>
           </w:p>
@@ -17379,9 +17373,7 @@
     </w:tbl>
     <w:p>
       <w:pPr>
-        <w:pStyle w:val="ListParagraph"/>
         <w:spacing w:line="360" w:lineRule="auto"/>
-        <w:ind w:left="1800"/>
         <w:rPr>
           <w:rFonts w:ascii="Times New Roman" w:hAnsi="Times New Roman" w:cs="Times New Roman"/>
           <w:lang w:val="en-GB"/>
@@ -17392,6 +17384,7 @@
           <w:rFonts w:ascii="Times New Roman" w:hAnsi="Times New Roman" w:cs="Times New Roman"/>
           <w:lang w:val="en-GB"/>
         </w:rPr>
+        <w:lastRenderedPageBreak/>
         <w:t xml:space="preserve">The table presents the age and sex distribution of migrants in the selected ward of Kathmandu. A total of </w:t>
       </w:r>
       <w:r>
@@ -17493,9 +17486,7 @@
     </w:p>
     <w:p>
       <w:pPr>
-        <w:pStyle w:val="ListParagraph"/>
         <w:spacing w:line="360" w:lineRule="auto"/>
-        <w:ind w:left="1800"/>
         <w:rPr>
           <w:rFonts w:ascii="Times New Roman" w:hAnsi="Times New Roman" w:cs="Times New Roman"/>
           <w:lang w:val="en-GB"/>
@@ -17675,9 +17666,7 @@
     </w:p>
     <w:p>
       <w:pPr>
-        <w:pStyle w:val="ListParagraph"/>
         <w:spacing w:line="360" w:lineRule="auto"/>
-        <w:ind w:left="1800"/>
         <w:rPr>
           <w:rFonts w:ascii="Times New Roman" w:hAnsi="Times New Roman" w:cs="Times New Roman"/>
           <w:b/>
@@ -17695,9 +17684,7 @@
     </w:p>
     <w:p>
       <w:pPr>
-        <w:pStyle w:val="ListParagraph"/>
         <w:spacing w:line="360" w:lineRule="auto"/>
-        <w:ind w:left="1800"/>
         <w:rPr>
           <w:rFonts w:ascii="Times New Roman" w:hAnsi="Times New Roman" w:cs="Times New Roman"/>
         </w:rPr>
@@ -17708,40 +17695,20 @@
         </w:rPr>
         <w:t>Marital status is also one of the most important variables in migration. Most of the female migration can be seen due to marries. But most of the male migrants can be seen due to increase income and other facilities. Generally, unmarried migration trend is seen more than other marital status of household population which is given below:</w:t>
       </w:r>
-    </w:p>
-    <w:p>
-      <w:pPr>
-        <w:pStyle w:val="ListParagraph"/>
-        <w:spacing w:line="360" w:lineRule="auto"/>
-        <w:ind w:left="1800"/>
-        <w:rPr>
-          <w:rFonts w:ascii="Times New Roman" w:hAnsi="Times New Roman" w:cs="Times New Roman"/>
-        </w:rPr>
-      </w:pPr>
-    </w:p>
-    <w:p>
-      <w:pPr>
-        <w:pStyle w:val="ListParagraph"/>
-        <w:spacing w:line="360" w:lineRule="auto"/>
-        <w:ind w:left="1800"/>
-        <w:rPr>
-          <w:rFonts w:ascii="Times New Roman" w:hAnsi="Times New Roman" w:cs="Times New Roman"/>
-        </w:rPr>
-      </w:pPr>
     </w:p>
     <w:tbl>
       <w:tblPr>
-        <w:tblW w:w="6920" w:type="dxa"/>
+        <w:tblW w:w="8021" w:type="dxa"/>
         <w:tblLook w:val="04A0" w:firstRow="1" w:lastRow="0" w:firstColumn="1" w:lastColumn="0" w:noHBand="0" w:noVBand="1"/>
       </w:tblPr>
       <w:tblGrid>
         <w:gridCol w:w="1340"/>
         <w:gridCol w:w="551"/>
-        <w:gridCol w:w="1471"/>
+        <w:gridCol w:w="1676"/>
         <w:gridCol w:w="551"/>
-        <w:gridCol w:w="1471"/>
+        <w:gridCol w:w="1676"/>
         <w:gridCol w:w="551"/>
-        <w:gridCol w:w="1471"/>
+        <w:gridCol w:w="1676"/>
       </w:tblGrid>
       <w:tr>
         <w:trPr>
@@ -17784,14 +17751,13 @@
                 <w:lang w:val="en-GB" w:eastAsia="en-GB" w:bidi="ne-NP"/>
                 <w14:ligatures w14:val="none"/>
               </w:rPr>
-              <w:lastRenderedPageBreak/>
               <w:t>Marital Status</w:t>
             </w:r>
           </w:p>
         </w:tc>
         <w:tc>
           <w:tcPr>
-            <w:tcW w:w="3720" w:type="dxa"/>
+            <w:tcW w:w="4454" w:type="dxa"/>
             <w:gridSpan w:val="4"/>
             <w:tcBorders>
               <w:top w:val="single" w:sz="4" w:space="0" w:color="auto"/>
@@ -17833,9 +17799,8 @@
         </w:tc>
         <w:tc>
           <w:tcPr>
-            <w:tcW w:w="1860" w:type="dxa"/>
+            <w:tcW w:w="2227" w:type="dxa"/>
             <w:gridSpan w:val="2"/>
-            <w:vMerge w:val="restart"/>
             <w:tcBorders>
               <w:top w:val="single" w:sz="4" w:space="0" w:color="auto"/>
               <w:left w:val="single" w:sz="4" w:space="0" w:color="auto"/>
@@ -17909,7 +17874,7 @@
         </w:tc>
         <w:tc>
           <w:tcPr>
-            <w:tcW w:w="1860" w:type="dxa"/>
+            <w:tcW w:w="2227" w:type="dxa"/>
             <w:gridSpan w:val="2"/>
             <w:tcBorders>
               <w:top w:val="single" w:sz="4" w:space="0" w:color="auto"/>
@@ -17951,7 +17916,7 @@
         </w:tc>
         <w:tc>
           <w:tcPr>
-            <w:tcW w:w="1860" w:type="dxa"/>
+            <w:tcW w:w="2227" w:type="dxa"/>
             <w:gridSpan w:val="2"/>
             <w:tcBorders>
               <w:top w:val="single" w:sz="4" w:space="0" w:color="auto"/>
@@ -17993,9 +17958,8 @@
         </w:tc>
         <w:tc>
           <w:tcPr>
-            <w:tcW w:w="1860" w:type="dxa"/>
+            <w:tcW w:w="2227" w:type="dxa"/>
             <w:gridSpan w:val="2"/>
-            <w:vMerge/>
             <w:tcBorders>
               <w:top w:val="single" w:sz="4" w:space="0" w:color="auto"/>
               <w:left w:val="single" w:sz="4" w:space="0" w:color="auto"/>
@@ -18055,7 +18019,7 @@
         </w:tc>
         <w:tc>
           <w:tcPr>
-            <w:tcW w:w="389" w:type="dxa"/>
+            <w:tcW w:w="551" w:type="dxa"/>
             <w:tcBorders>
               <w:top w:val="nil"/>
               <w:left w:val="nil"/>
@@ -18095,7 +18059,7 @@
         </w:tc>
         <w:tc>
           <w:tcPr>
-            <w:tcW w:w="1471" w:type="dxa"/>
+            <w:tcW w:w="1676" w:type="dxa"/>
             <w:tcBorders>
               <w:top w:val="nil"/>
               <w:left w:val="nil"/>
@@ -18135,7 +18099,7 @@
         </w:tc>
         <w:tc>
           <w:tcPr>
-            <w:tcW w:w="389" w:type="dxa"/>
+            <w:tcW w:w="551" w:type="dxa"/>
             <w:tcBorders>
               <w:top w:val="nil"/>
               <w:left w:val="nil"/>
@@ -18175,7 +18139,7 @@
         </w:tc>
         <w:tc>
           <w:tcPr>
-            <w:tcW w:w="1471" w:type="dxa"/>
+            <w:tcW w:w="1676" w:type="dxa"/>
             <w:tcBorders>
               <w:top w:val="nil"/>
               <w:left w:val="nil"/>
@@ -18215,7 +18179,7 @@
         </w:tc>
         <w:tc>
           <w:tcPr>
-            <w:tcW w:w="389" w:type="dxa"/>
+            <w:tcW w:w="551" w:type="dxa"/>
             <w:tcBorders>
               <w:top w:val="nil"/>
               <w:left w:val="nil"/>
@@ -18255,7 +18219,7 @@
         </w:tc>
         <w:tc>
           <w:tcPr>
-            <w:tcW w:w="1471" w:type="dxa"/>
+            <w:tcW w:w="1676" w:type="dxa"/>
             <w:tcBorders>
               <w:top w:val="nil"/>
               <w:left w:val="nil"/>
@@ -18340,7 +18304,7 @@
         </w:tc>
         <w:tc>
           <w:tcPr>
-            <w:tcW w:w="389" w:type="dxa"/>
+            <w:tcW w:w="551" w:type="dxa"/>
             <w:tcBorders>
               <w:top w:val="nil"/>
               <w:left w:val="nil"/>
@@ -18381,7 +18345,7 @@
         </w:tc>
         <w:tc>
           <w:tcPr>
-            <w:tcW w:w="1471" w:type="dxa"/>
+            <w:tcW w:w="1676" w:type="dxa"/>
             <w:tcBorders>
               <w:top w:val="nil"/>
               <w:left w:val="nil"/>
@@ -18422,7 +18386,7 @@
         </w:tc>
         <w:tc>
           <w:tcPr>
-            <w:tcW w:w="389" w:type="dxa"/>
+            <w:tcW w:w="551" w:type="dxa"/>
             <w:tcBorders>
               <w:top w:val="nil"/>
               <w:left w:val="nil"/>
@@ -18463,7 +18427,7 @@
         </w:tc>
         <w:tc>
           <w:tcPr>
-            <w:tcW w:w="1471" w:type="dxa"/>
+            <w:tcW w:w="1676" w:type="dxa"/>
             <w:tcBorders>
               <w:top w:val="nil"/>
               <w:left w:val="nil"/>
@@ -18504,7 +18468,7 @@
         </w:tc>
         <w:tc>
           <w:tcPr>
-            <w:tcW w:w="389" w:type="dxa"/>
+            <w:tcW w:w="551" w:type="dxa"/>
             <w:tcBorders>
               <w:top w:val="nil"/>
               <w:left w:val="nil"/>
@@ -18545,7 +18509,7 @@
         </w:tc>
         <w:tc>
           <w:tcPr>
-            <w:tcW w:w="1471" w:type="dxa"/>
+            <w:tcW w:w="1676" w:type="dxa"/>
             <w:tcBorders>
               <w:top w:val="nil"/>
               <w:left w:val="nil"/>
@@ -18631,7 +18595,7 @@
         </w:tc>
         <w:tc>
           <w:tcPr>
-            <w:tcW w:w="389" w:type="dxa"/>
+            <w:tcW w:w="551" w:type="dxa"/>
             <w:tcBorders>
               <w:top w:val="nil"/>
               <w:left w:val="nil"/>
@@ -18672,7 +18636,7 @@
         </w:tc>
         <w:tc>
           <w:tcPr>
-            <w:tcW w:w="1471" w:type="dxa"/>
+            <w:tcW w:w="1676" w:type="dxa"/>
             <w:tcBorders>
               <w:top w:val="nil"/>
               <w:left w:val="nil"/>
@@ -18713,7 +18677,7 @@
         </w:tc>
         <w:tc>
           <w:tcPr>
-            <w:tcW w:w="389" w:type="dxa"/>
+            <w:tcW w:w="551" w:type="dxa"/>
             <w:tcBorders>
               <w:top w:val="nil"/>
               <w:left w:val="nil"/>
@@ -18754,7 +18718,7 @@
         </w:tc>
         <w:tc>
           <w:tcPr>
-            <w:tcW w:w="1471" w:type="dxa"/>
+            <w:tcW w:w="1676" w:type="dxa"/>
             <w:tcBorders>
               <w:top w:val="nil"/>
               <w:left w:val="nil"/>
@@ -18795,7 +18759,7 @@
         </w:tc>
         <w:tc>
           <w:tcPr>
-            <w:tcW w:w="389" w:type="dxa"/>
+            <w:tcW w:w="551" w:type="dxa"/>
             <w:tcBorders>
               <w:top w:val="nil"/>
               <w:left w:val="nil"/>
@@ -18836,7 +18800,7 @@
         </w:tc>
         <w:tc>
           <w:tcPr>
-            <w:tcW w:w="1471" w:type="dxa"/>
+            <w:tcW w:w="1676" w:type="dxa"/>
             <w:tcBorders>
               <w:top w:val="nil"/>
               <w:left w:val="nil"/>
@@ -18922,7 +18886,7 @@
         </w:tc>
         <w:tc>
           <w:tcPr>
-            <w:tcW w:w="389" w:type="dxa"/>
+            <w:tcW w:w="551" w:type="dxa"/>
             <w:tcBorders>
               <w:top w:val="nil"/>
               <w:left w:val="nil"/>
@@ -18963,7 +18927,7 @@
         </w:tc>
         <w:tc>
           <w:tcPr>
-            <w:tcW w:w="1471" w:type="dxa"/>
+            <w:tcW w:w="1676" w:type="dxa"/>
             <w:tcBorders>
               <w:top w:val="nil"/>
               <w:left w:val="nil"/>
@@ -19004,7 +18968,7 @@
         </w:tc>
         <w:tc>
           <w:tcPr>
-            <w:tcW w:w="389" w:type="dxa"/>
+            <w:tcW w:w="551" w:type="dxa"/>
             <w:tcBorders>
               <w:top w:val="nil"/>
               <w:left w:val="nil"/>
@@ -19045,7 +19009,7 @@
         </w:tc>
         <w:tc>
           <w:tcPr>
-            <w:tcW w:w="1471" w:type="dxa"/>
+            <w:tcW w:w="1676" w:type="dxa"/>
             <w:tcBorders>
               <w:top w:val="nil"/>
               <w:left w:val="nil"/>
@@ -19086,7 +19050,7 @@
         </w:tc>
         <w:tc>
           <w:tcPr>
-            <w:tcW w:w="389" w:type="dxa"/>
+            <w:tcW w:w="551" w:type="dxa"/>
             <w:tcBorders>
               <w:top w:val="nil"/>
               <w:left w:val="nil"/>
@@ -19127,7 +19091,7 @@
         </w:tc>
         <w:tc>
           <w:tcPr>
-            <w:tcW w:w="1471" w:type="dxa"/>
+            <w:tcW w:w="1676" w:type="dxa"/>
             <w:tcBorders>
               <w:top w:val="nil"/>
               <w:left w:val="nil"/>
@@ -19182,6 +19146,46 @@
     </w:p>
     <w:p>
       <w:pPr>
+        <w:spacing w:line="360" w:lineRule="auto"/>
+        <w:rPr>
+          <w:rFonts w:ascii="Times New Roman" w:hAnsi="Times New Roman" w:cs="Times New Roman"/>
+          <w:lang w:val="en-GB"/>
+        </w:rPr>
+      </w:pPr>
+      <w:r>
+        <w:rPr>
+          <w:rFonts w:ascii="Times New Roman" w:hAnsi="Times New Roman" w:cs="Times New Roman"/>
+          <w:lang w:val="en-GB"/>
+        </w:rPr>
+        <w:t xml:space="preserve">The table presents the marital status of migrants according to sex in the selected ward of Kathmandu. A total of 324 migrants were recorded, comprising 168 males and 156 </w:t>
+      </w:r>
+      <w:r>
+        <w:rPr>
+          <w:rFonts w:ascii="Times New Roman" w:hAnsi="Times New Roman" w:cs="Times New Roman"/>
+          <w:lang w:val="en-GB"/>
+        </w:rPr>
+        <w:lastRenderedPageBreak/>
+        <w:t>females. Overall, 201 migrants, or 62.04%, are married, while 123 migrants, representing 37.96%, are unmarried.</w:t>
+      </w:r>
+    </w:p>
+    <w:p>
+      <w:pPr>
+        <w:spacing w:line="360" w:lineRule="auto"/>
+        <w:rPr>
+          <w:rFonts w:ascii="Times New Roman" w:hAnsi="Times New Roman" w:cs="Times New Roman"/>
+          <w:lang w:val="en-GB"/>
+        </w:rPr>
+      </w:pPr>
+      <w:r>
+        <w:rPr>
+          <w:rFonts w:ascii="Times New Roman" w:hAnsi="Times New Roman" w:cs="Times New Roman"/>
+          <w:lang w:val="en-GB"/>
+        </w:rPr>
+        <w:t>Among males, 99 individuals are married, accounting for 58.93%, whereas 69 males, or 41.07%, are unmarried. In the case of females, the proportion of married migrants is slightly higher, with 102 individuals or 65.38%, while 54 females, equivalent to 34.62%, are unmarried. Overall, the data indicate that married migrants constitute the larger share of the migrant population, with the proportion being somewhat higher among females than males.</w:t>
+      </w:r>
+    </w:p>
+    <w:p>
+      <w:pPr>
         <w:pStyle w:val="ListParagraph"/>
         <w:spacing w:line="360" w:lineRule="auto"/>
         <w:ind w:left="1800"/>
@@ -19189,57 +19193,13 @@
           <w:rFonts w:ascii="Times New Roman" w:hAnsi="Times New Roman" w:cs="Times New Roman"/>
           <w:b/>
           <w:bCs/>
-          <w:lang w:val="en-GB"/>
-        </w:rPr>
-      </w:pPr>
-      <w:r>
-        <w:rPr>
-          <w:rFonts w:ascii="Times New Roman" w:hAnsi="Times New Roman" w:cs="Times New Roman"/>
-          <w:b/>
-          <w:bCs/>
-          <w:lang w:val="en-GB"/>
-        </w:rPr>
-        <w:t>The table presents the marital status of migrants according to sex in the selected ward of Kathmandu. A total of 324 migrants were recorded, comprising 168 males and 156 females. Overall, 201 migrants, or 62.04%, are married, while 123 migrants, representing 37.96%, are unmarried.</w:t>
-      </w:r>
+        </w:rPr>
+      </w:pPr>
     </w:p>
     <w:p>
       <w:pPr>
-        <w:pStyle w:val="ListParagraph"/>
-        <w:spacing w:line="360" w:lineRule="auto"/>
-        <w:ind w:left="1800"/>
         <w:rPr>
           <w:rFonts w:ascii="Times New Roman" w:hAnsi="Times New Roman" w:cs="Times New Roman"/>
-          <w:b/>
-          <w:bCs/>
-          <w:lang w:val="en-GB"/>
-        </w:rPr>
-      </w:pPr>
-      <w:r>
-        <w:rPr>
-          <w:rFonts w:ascii="Times New Roman" w:hAnsi="Times New Roman" w:cs="Times New Roman"/>
-          <w:b/>
-          <w:bCs/>
-          <w:lang w:val="en-GB"/>
-        </w:rPr>
-        <w:t>Among males, 99 individuals are married, accounting for 58.93%, whereas 69 males, or 41.07%, are unmarried. In the case of females, the proportion of married migrants is slightly higher, with 102 individuals or 65.38%, while 54 females, equivalent to 34.62%, are unmarried. Overall, the data indicate that married migrants constitute the larger share of the migrant population, with the proportion being somewhat higher among females than males.</w:t>
-      </w:r>
-    </w:p>
-    <w:p>
-      <w:pPr>
-        <w:pStyle w:val="ListParagraph"/>
-        <w:spacing w:line="360" w:lineRule="auto"/>
-        <w:ind w:left="1800"/>
-        <w:rPr>
-          <w:rFonts w:ascii="Times New Roman" w:hAnsi="Times New Roman" w:cs="Times New Roman"/>
-          <w:b/>
-          <w:bCs/>
-        </w:rPr>
-      </w:pPr>
-    </w:p>
-    <w:p>
-      <w:pPr>
-        <w:rPr>
-          <w:rFonts w:ascii="Times New Roman" w:hAnsi="Times New Roman" w:cs="Times New Roman"/>
         </w:rPr>
       </w:pPr>
       <w:r>
@@ -19247,10 +19207,10 @@
           <w:noProof/>
         </w:rPr>
         <w:drawing>
-          <wp:inline distT="0" distB="0" distL="0" distR="0" wp14:anchorId="76347154" wp14:editId="54EC9029">
-            <wp:extent cx="4572000" cy="2743200"/>
-            <wp:effectExtent l="0" t="0" r="0" b="0"/>
-            <wp:docPr id="1002717606" name="Chart 1">
+          <wp:inline distT="0" distB="0" distL="0" distR="0" wp14:anchorId="22FDB016" wp14:editId="11371C3D">
+            <wp:extent cx="4552950" cy="3800475"/>
+            <wp:effectExtent l="0" t="0" r="0" b="9525"/>
+            <wp:docPr id="574415477" name="Chart 1">
               <a:extLst xmlns:a="http://schemas.openxmlformats.org/drawingml/2006/main">
                 <a:ext uri="{FF2B5EF4-FFF2-40B4-BE49-F238E27FC236}">
                   <a16:creationId xmlns:a16="http://schemas.microsoft.com/office/drawing/2014/main" id="{B31F185C-80D7-891C-AA5A-BF9647CCBE32}"/>
@@ -19286,10 +19246,10 @@
         </w:rPr>
         <w:lastRenderedPageBreak/>
         <w:drawing>
-          <wp:inline distT="0" distB="0" distL="0" distR="0" wp14:anchorId="7DF7E119" wp14:editId="298387D3">
-            <wp:extent cx="4495800" cy="2743200"/>
-            <wp:effectExtent l="0" t="0" r="0" b="0"/>
-            <wp:docPr id="768889563" name="Chart 1">
+          <wp:inline distT="0" distB="0" distL="0" distR="0" wp14:anchorId="530BEEC9" wp14:editId="1BBA1BAA">
+            <wp:extent cx="4366260" cy="2857500"/>
+            <wp:effectExtent l="0" t="0" r="15240" b="0"/>
+            <wp:docPr id="861452179" name="Chart 1">
               <a:extLst xmlns:a="http://schemas.openxmlformats.org/drawingml/2006/main">
                 <a:ext uri="{FF2B5EF4-FFF2-40B4-BE49-F238E27FC236}">
                   <a16:creationId xmlns:a16="http://schemas.microsoft.com/office/drawing/2014/main" id="{62308CAB-FB1E-17D9-D0B7-50D32391C089}"/>
@@ -19341,13 +19301,13 @@
     </w:p>
     <w:tbl>
       <w:tblPr>
-        <w:tblW w:w="3608" w:type="dxa"/>
+        <w:tblW w:w="4851" w:type="dxa"/>
         <w:tblLook w:val="04A0" w:firstRow="1" w:lastRow="0" w:firstColumn="1" w:lastColumn="0" w:noHBand="0" w:noVBand="1"/>
       </w:tblPr>
       <w:tblGrid>
-        <w:gridCol w:w="1040"/>
-        <w:gridCol w:w="1660"/>
-        <w:gridCol w:w="908"/>
+        <w:gridCol w:w="1291"/>
+        <w:gridCol w:w="1884"/>
+        <w:gridCol w:w="1676"/>
       </w:tblGrid>
       <w:tr>
         <w:trPr>
@@ -19355,7 +19315,7 @@
         </w:trPr>
         <w:tc>
           <w:tcPr>
-            <w:tcW w:w="1040" w:type="dxa"/>
+            <w:tcW w:w="1291" w:type="dxa"/>
             <w:tcBorders>
               <w:top w:val="single" w:sz="4" w:space="0" w:color="auto"/>
               <w:left w:val="single" w:sz="4" w:space="0" w:color="auto"/>
@@ -19395,7 +19355,7 @@
         </w:tc>
         <w:tc>
           <w:tcPr>
-            <w:tcW w:w="1660" w:type="dxa"/>
+            <w:tcW w:w="1884" w:type="dxa"/>
             <w:tcBorders>
               <w:top w:val="single" w:sz="4" w:space="0" w:color="auto"/>
               <w:left w:val="nil"/>
@@ -19435,7 +19395,7 @@
         </w:tc>
         <w:tc>
           <w:tcPr>
-            <w:tcW w:w="908" w:type="dxa"/>
+            <w:tcW w:w="1676" w:type="dxa"/>
             <w:tcBorders>
               <w:top w:val="single" w:sz="4" w:space="0" w:color="auto"/>
               <w:left w:val="nil"/>
@@ -19471,6 +19431,18 @@
               </w:rPr>
               <w:t>Percent</w:t>
             </w:r>
+            <w:r>
+              <w:rPr>
+                <w:rFonts w:ascii="Calibri" w:eastAsia="Times New Roman" w:hAnsi="Calibri" w:cs="Calibri"/>
+                <w:color w:val="000000"/>
+                <w:kern w:val="0"/>
+                <w:sz w:val="22"/>
+                <w:szCs w:val="22"/>
+                <w:lang w:val="en-GB" w:eastAsia="en-GB" w:bidi="ne-NP"/>
+                <w14:ligatures w14:val="none"/>
+              </w:rPr>
+              <w:t>age (%)</w:t>
+            </w:r>
           </w:p>
         </w:tc>
       </w:tr>
@@ -19480,7 +19452,7 @@
         </w:trPr>
         <w:tc>
           <w:tcPr>
-            <w:tcW w:w="1040" w:type="dxa"/>
+            <w:tcW w:w="1291" w:type="dxa"/>
             <w:tcBorders>
               <w:top w:val="nil"/>
               <w:left w:val="single" w:sz="4" w:space="0" w:color="auto"/>
@@ -19520,7 +19492,7 @@
         </w:tc>
         <w:tc>
           <w:tcPr>
-            <w:tcW w:w="1660" w:type="dxa"/>
+            <w:tcW w:w="1884" w:type="dxa"/>
             <w:tcBorders>
               <w:top w:val="nil"/>
               <w:left w:val="nil"/>
@@ -19561,7 +19533,7 @@
         </w:tc>
         <w:tc>
           <w:tcPr>
-            <w:tcW w:w="908" w:type="dxa"/>
+            <w:tcW w:w="1676" w:type="dxa"/>
             <w:tcBorders>
               <w:top w:val="nil"/>
               <w:left w:val="nil"/>
@@ -19607,7 +19579,7 @@
         </w:trPr>
         <w:tc>
           <w:tcPr>
-            <w:tcW w:w="1040" w:type="dxa"/>
+            <w:tcW w:w="1291" w:type="dxa"/>
             <w:tcBorders>
               <w:top w:val="nil"/>
               <w:left w:val="single" w:sz="4" w:space="0" w:color="auto"/>
@@ -19647,7 +19619,7 @@
         </w:tc>
         <w:tc>
           <w:tcPr>
-            <w:tcW w:w="1660" w:type="dxa"/>
+            <w:tcW w:w="1884" w:type="dxa"/>
             <w:tcBorders>
               <w:top w:val="nil"/>
               <w:left w:val="nil"/>
@@ -19688,7 +19660,7 @@
         </w:tc>
         <w:tc>
           <w:tcPr>
-            <w:tcW w:w="908" w:type="dxa"/>
+            <w:tcW w:w="1676" w:type="dxa"/>
             <w:tcBorders>
               <w:top w:val="nil"/>
               <w:left w:val="nil"/>
@@ -19734,7 +19706,7 @@
         </w:trPr>
         <w:tc>
           <w:tcPr>
-            <w:tcW w:w="1040" w:type="dxa"/>
+            <w:tcW w:w="1291" w:type="dxa"/>
             <w:tcBorders>
               <w:top w:val="nil"/>
               <w:left w:val="single" w:sz="4" w:space="0" w:color="auto"/>
@@ -19774,7 +19746,7 @@
         </w:tc>
         <w:tc>
           <w:tcPr>
-            <w:tcW w:w="1660" w:type="dxa"/>
+            <w:tcW w:w="1884" w:type="dxa"/>
             <w:tcBorders>
               <w:top w:val="nil"/>
               <w:left w:val="nil"/>
@@ -19815,7 +19787,7 @@
         </w:tc>
         <w:tc>
           <w:tcPr>
-            <w:tcW w:w="908" w:type="dxa"/>
+            <w:tcW w:w="1676" w:type="dxa"/>
             <w:tcBorders>
               <w:top w:val="nil"/>
               <w:left w:val="nil"/>
@@ -19861,7 +19833,7 @@
         </w:trPr>
         <w:tc>
           <w:tcPr>
-            <w:tcW w:w="1040" w:type="dxa"/>
+            <w:tcW w:w="1291" w:type="dxa"/>
             <w:tcBorders>
               <w:top w:val="nil"/>
               <w:left w:val="single" w:sz="4" w:space="0" w:color="auto"/>
@@ -19901,7 +19873,7 @@
         </w:tc>
         <w:tc>
           <w:tcPr>
-            <w:tcW w:w="1660" w:type="dxa"/>
+            <w:tcW w:w="1884" w:type="dxa"/>
             <w:tcBorders>
               <w:top w:val="nil"/>
               <w:left w:val="nil"/>
@@ -19942,7 +19914,7 @@
         </w:tc>
         <w:tc>
           <w:tcPr>
-            <w:tcW w:w="908" w:type="dxa"/>
+            <w:tcW w:w="1676" w:type="dxa"/>
             <w:tcBorders>
               <w:top w:val="nil"/>
               <w:left w:val="nil"/>
@@ -20129,10 +20101,10 @@
         </w:rPr>
         <w:lastRenderedPageBreak/>
         <w:drawing>
-          <wp:inline distT="0" distB="0" distL="0" distR="0" wp14:anchorId="7D43684E" wp14:editId="1E057AF0">
-            <wp:extent cx="4572000" cy="2743200"/>
+          <wp:inline distT="0" distB="0" distL="0" distR="0" wp14:anchorId="6DAE99A1" wp14:editId="1FD2912C">
+            <wp:extent cx="4572000" cy="2857500"/>
             <wp:effectExtent l="0" t="0" r="0" b="0"/>
-            <wp:docPr id="86077921" name="Chart 1">
+            <wp:docPr id="197129221" name="Chart 1">
               <a:extLst xmlns:a="http://schemas.openxmlformats.org/drawingml/2006/main">
                 <a:ext uri="{FF2B5EF4-FFF2-40B4-BE49-F238E27FC236}">
                   <a16:creationId xmlns:a16="http://schemas.microsoft.com/office/drawing/2014/main" id="{25205994-7723-367E-B9DF-4CBA7363F61A}"/>
@@ -20239,11 +20211,11 @@
     </w:p>
     <w:tbl>
       <w:tblPr>
-        <w:tblW w:w="5320" w:type="dxa"/>
+        <w:tblW w:w="5569" w:type="dxa"/>
         <w:tblLook w:val="04A0" w:firstRow="1" w:lastRow="0" w:firstColumn="1" w:lastColumn="0" w:noHBand="0" w:noVBand="1"/>
       </w:tblPr>
       <w:tblGrid>
-        <w:gridCol w:w="2440"/>
+        <w:gridCol w:w="2689"/>
         <w:gridCol w:w="960"/>
         <w:gridCol w:w="960"/>
         <w:gridCol w:w="960"/>
@@ -20254,7 +20226,7 @@
         </w:trPr>
         <w:tc>
           <w:tcPr>
-            <w:tcW w:w="2440" w:type="dxa"/>
+            <w:tcW w:w="2689" w:type="dxa"/>
             <w:tcBorders>
               <w:top w:val="single" w:sz="4" w:space="0" w:color="auto"/>
               <w:left w:val="single" w:sz="4" w:space="0" w:color="auto"/>
@@ -20419,7 +20391,7 @@
         </w:trPr>
         <w:tc>
           <w:tcPr>
-            <w:tcW w:w="2440" w:type="dxa"/>
+            <w:tcW w:w="2689" w:type="dxa"/>
             <w:tcBorders>
               <w:top w:val="nil"/>
               <w:left w:val="single" w:sz="4" w:space="0" w:color="auto"/>
@@ -20587,7 +20559,7 @@
         </w:trPr>
         <w:tc>
           <w:tcPr>
-            <w:tcW w:w="2440" w:type="dxa"/>
+            <w:tcW w:w="2689" w:type="dxa"/>
             <w:tcBorders>
               <w:top w:val="nil"/>
               <w:left w:val="single" w:sz="4" w:space="0" w:color="auto"/>
@@ -20755,7 +20727,7 @@
         </w:trPr>
         <w:tc>
           <w:tcPr>
-            <w:tcW w:w="2440" w:type="dxa"/>
+            <w:tcW w:w="2689" w:type="dxa"/>
             <w:tcBorders>
               <w:top w:val="nil"/>
               <w:left w:val="single" w:sz="4" w:space="0" w:color="auto"/>
@@ -24707,7 +24679,6 @@
           </w:tcPr>
           <w:p>
             <w:r>
-              <w:lastRenderedPageBreak/>
               <w:t>3</w:t>
             </w:r>
           </w:p>
@@ -25155,7 +25126,6 @@
           </w:tcPr>
           <w:p>
             <w:r>
-              <w:lastRenderedPageBreak/>
               <w:t>12</w:t>
             </w:r>
           </w:p>
@@ -26528,13 +26498,7 @@
           <w:rPr>
             <w:noProof/>
           </w:rPr>
-          <w:t>2</w:t>
-        </w:r>
-        <w:r>
-          <w:rPr>
-            <w:noProof/>
-          </w:rPr>
-          <w:t>8</w:t>
+          <w:t>28</w:t>
         </w:r>
         <w:r>
           <w:rPr>
@@ -28908,6 +28872,7 @@
   <w:style w:type="character" w:default="1" w:styleId="DefaultParagraphFont">
     <w:name w:val="Default Paragraph Font"/>
     <w:uiPriority w:val="1"/>
+    <w:semiHidden/>
     <w:unhideWhenUsed/>
   </w:style>
   <w:style w:type="table" w:default="1" w:styleId="TableNormal">
@@ -29602,18 +29567,13 @@
               <a:effectLst/>
             </c:spPr>
             <c:txPr>
-              <a:bodyPr rot="0" spcFirstLastPara="1" vertOverflow="ellipsis" vert="horz" wrap="square" lIns="38100" tIns="19050" rIns="38100" bIns="19050" anchor="ctr" anchorCtr="1">
-                <a:spAutoFit/>
-              </a:bodyPr>
+              <a:bodyPr rot="0" spcFirstLastPara="1" vertOverflow="ellipsis" vert="horz" wrap="square" anchor="ctr" anchorCtr="1"/>
               <a:lstStyle/>
               <a:p>
                 <a:pPr>
                   <a:defRPr sz="900" b="0" i="0" u="none" strike="noStrike" kern="1200" baseline="0">
                     <a:solidFill>
-                      <a:schemeClr val="tx1">
-                        <a:lumMod val="75000"/>
-                        <a:lumOff val="25000"/>
-                      </a:schemeClr>
+                      <a:schemeClr val="tx1"/>
                     </a:solidFill>
                     <a:latin typeface="+mn-lt"/>
                     <a:ea typeface="+mn-ea"/>
@@ -29680,7 +29640,7 @@
           </c:val>
           <c:extLst>
             <c:ext xmlns:c16="http://schemas.microsoft.com/office/drawing/2014/chart" uri="{C3380CC4-5D6E-409C-BE32-E72D297353CC}">
-              <c16:uniqueId val="{00000000-7FE3-4E75-8929-B821ED171A40}"/>
+              <c16:uniqueId val="{00000000-4A65-462D-9830-05F44D009855}"/>
             </c:ext>
           </c:extLst>
         </c:ser>
@@ -29716,18 +29676,13 @@
               <a:effectLst/>
             </c:spPr>
             <c:txPr>
-              <a:bodyPr rot="0" spcFirstLastPara="1" vertOverflow="ellipsis" vert="horz" wrap="square" lIns="38100" tIns="19050" rIns="38100" bIns="19050" anchor="ctr" anchorCtr="1">
-                <a:spAutoFit/>
-              </a:bodyPr>
+              <a:bodyPr rot="0" spcFirstLastPara="1" vertOverflow="ellipsis" vert="horz" wrap="square" anchor="ctr" anchorCtr="1"/>
               <a:lstStyle/>
               <a:p>
                 <a:pPr>
                   <a:defRPr sz="900" b="0" i="0" u="none" strike="noStrike" kern="1200" baseline="0">
                     <a:solidFill>
-                      <a:schemeClr val="tx1">
-                        <a:lumMod val="75000"/>
-                        <a:lumOff val="25000"/>
-                      </a:schemeClr>
+                      <a:schemeClr val="tx1"/>
                     </a:solidFill>
                     <a:latin typeface="+mn-lt"/>
                     <a:ea typeface="+mn-ea"/>
@@ -29795,7 +29750,7 @@
           </c:val>
           <c:extLst>
             <c:ext xmlns:c16="http://schemas.microsoft.com/office/drawing/2014/chart" uri="{C3380CC4-5D6E-409C-BE32-E72D297353CC}">
-              <c16:uniqueId val="{00000001-7FE3-4E75-8929-B821ED171A40}"/>
+              <c16:uniqueId val="{00000001-4A65-462D-9830-05F44D009855}"/>
             </c:ext>
           </c:extLst>
         </c:ser>
@@ -29825,12 +29780,9 @@
               <a:lstStyle/>
               <a:p>
                 <a:pPr>
-                  <a:defRPr sz="900" b="0" i="0" u="none" strike="noStrike" kern="1200" cap="all" baseline="0">
+                  <a:defRPr sz="900" b="1" i="0" u="none" strike="noStrike" kern="1200" cap="none" baseline="0">
                     <a:solidFill>
-                      <a:schemeClr val="tx1">
-                        <a:lumMod val="65000"/>
-                        <a:lumOff val="35000"/>
-                      </a:schemeClr>
+                      <a:schemeClr val="tx1"/>
                     </a:solidFill>
                     <a:latin typeface="+mn-lt"/>
                     <a:ea typeface="+mn-ea"/>
@@ -29838,11 +29790,7 @@
                   </a:defRPr>
                 </a:pPr>
                 <a:r>
-                  <a:rPr lang="en-US" b="1" cap="none" baseline="0">
-                    <a:solidFill>
-                      <a:schemeClr val="tx1"/>
-                    </a:solidFill>
-                  </a:rPr>
+                  <a:rPr lang="en-US" b="1" cap="none" baseline="0"/>
                   <a:t>Literacy Status</a:t>
                 </a:r>
               </a:p>
@@ -29861,12 +29809,9 @@
             <a:lstStyle/>
             <a:p>
               <a:pPr>
-                <a:defRPr sz="900" b="0" i="0" u="none" strike="noStrike" kern="1200" cap="all" baseline="0">
+                <a:defRPr sz="900" b="1" i="0" u="none" strike="noStrike" kern="1200" cap="none" baseline="0">
                   <a:solidFill>
-                    <a:schemeClr val="tx1">
-                      <a:lumMod val="65000"/>
-                      <a:lumOff val="35000"/>
-                    </a:schemeClr>
+                    <a:schemeClr val="tx1"/>
                   </a:solidFill>
                   <a:latin typeface="+mn-lt"/>
                   <a:ea typeface="+mn-ea"/>
@@ -29901,10 +29846,7 @@
             <a:pPr>
               <a:defRPr sz="900" b="0" i="0" u="none" strike="noStrike" kern="1200" cap="none" spc="0" normalizeH="0" baseline="0">
                 <a:solidFill>
-                  <a:schemeClr val="tx1">
-                    <a:lumMod val="65000"/>
-                    <a:lumOff val="35000"/>
-                  </a:schemeClr>
+                  <a:schemeClr val="tx1"/>
                 </a:solidFill>
                 <a:latin typeface="+mn-lt"/>
                 <a:ea typeface="+mn-ea"/>
@@ -29942,20 +29884,6 @@
             <a:effectLst/>
           </c:spPr>
         </c:majorGridlines>
-        <c:minorGridlines>
-          <c:spPr>
-            <a:ln w="9525" cap="flat" cmpd="sng" algn="ctr">
-              <a:solidFill>
-                <a:schemeClr val="tx1">
-                  <a:lumMod val="5000"/>
-                  <a:lumOff val="95000"/>
-                </a:schemeClr>
-              </a:solidFill>
-              <a:round/>
-            </a:ln>
-            <a:effectLst/>
-          </c:spPr>
-        </c:minorGridlines>
         <c:title>
           <c:tx>
             <c:rich>
@@ -29963,7 +29891,7 @@
               <a:lstStyle/>
               <a:p>
                 <a:pPr>
-                  <a:defRPr sz="900" b="0" i="0" u="none" strike="noStrike" kern="1200" cap="all" baseline="0">
+                  <a:defRPr sz="900" b="1" i="0" u="none" strike="noStrike" kern="1200" cap="none" baseline="0">
                     <a:solidFill>
                       <a:schemeClr val="tx1"/>
                     </a:solidFill>
@@ -29973,12 +29901,8 @@
                   </a:defRPr>
                 </a:pPr>
                 <a:r>
-                  <a:rPr lang="en-US" b="1" cap="none" normalizeH="0" baseline="0">
-                    <a:solidFill>
-                      <a:schemeClr val="tx1"/>
-                    </a:solidFill>
-                  </a:rPr>
-                  <a:t>Percent</a:t>
+                  <a:rPr lang="en-US" b="1" cap="none" baseline="0"/>
+                  <a:t>Percentage (%)</a:t>
                 </a:r>
               </a:p>
             </c:rich>
@@ -29996,7 +29920,7 @@
             <a:lstStyle/>
             <a:p>
               <a:pPr>
-                <a:defRPr sz="900" b="0" i="0" u="none" strike="noStrike" kern="1200" cap="all" baseline="0">
+                <a:defRPr sz="900" b="1" i="0" u="none" strike="noStrike" kern="1200" cap="none" baseline="0">
                   <a:solidFill>
                     <a:schemeClr val="tx1"/>
                   </a:solidFill>
@@ -30027,10 +29951,7 @@
             <a:pPr>
               <a:defRPr sz="900" b="0" i="0" u="none" strike="noStrike" kern="1200" baseline="0">
                 <a:solidFill>
-                  <a:schemeClr val="tx1">
-                    <a:lumMod val="65000"/>
-                    <a:lumOff val="35000"/>
-                  </a:schemeClr>
+                  <a:schemeClr val="tx1"/>
                 </a:solidFill>
                 <a:latin typeface="+mn-lt"/>
                 <a:ea typeface="+mn-ea"/>
@@ -30046,14 +29967,14 @@
       </c:valAx>
       <c:spPr>
         <a:noFill/>
-        <a:ln>
+        <a:ln w="25400">
           <a:noFill/>
         </a:ln>
         <a:effectLst/>
       </c:spPr>
     </c:plotArea>
     <c:legend>
-      <c:legendPos val="r"/>
+      <c:legendPos val="b"/>
       <c:overlay val="0"/>
       <c:spPr>
         <a:noFill/>
@@ -30069,10 +29990,7 @@
           <a:pPr>
             <a:defRPr sz="900" b="0" i="0" u="none" strike="noStrike" kern="1200" baseline="0">
               <a:solidFill>
-                <a:schemeClr val="tx1">
-                  <a:lumMod val="65000"/>
-                  <a:lumOff val="35000"/>
-                </a:schemeClr>
+                <a:schemeClr val="tx1"/>
               </a:solidFill>
               <a:latin typeface="+mn-lt"/>
               <a:ea typeface="+mn-ea"/>
@@ -30091,12 +30009,9 @@
     <a:solidFill>
       <a:schemeClr val="bg1"/>
     </a:solidFill>
-    <a:ln w="9525" cap="flat" cmpd="sng" algn="ctr">
+    <a:ln w="12700" cap="flat" cmpd="sng" algn="ctr">
       <a:solidFill>
-        <a:schemeClr val="tx1">
-          <a:lumMod val="15000"/>
-          <a:lumOff val="85000"/>
-        </a:schemeClr>
+        <a:schemeClr val="tx1"/>
       </a:solidFill>
       <a:round/>
     </a:ln>
@@ -30107,7 +30022,11 @@
     <a:lstStyle/>
     <a:p>
       <a:pPr>
-        <a:defRPr/>
+        <a:defRPr>
+          <a:solidFill>
+            <a:schemeClr val="tx1"/>
+          </a:solidFill>
+        </a:defRPr>
       </a:pPr>
       <a:endParaRPr lang="en-US"/>
     </a:p>
@@ -30180,7 +30099,7 @@
           <c:idx val="0"/>
           <c:order val="0"/>
           <c:spPr>
-            <a:ln>
+            <a:ln w="12700">
               <a:solidFill>
                 <a:sysClr val="windowText" lastClr="000000"/>
               </a:solidFill>
@@ -30198,13 +30117,13 @@
                   <a:schemeClr val="bg1"/>
                 </a:bgClr>
               </a:pattFill>
-              <a:ln>
+              <a:ln w="12700">
                 <a:solidFill>
                   <a:sysClr val="windowText" lastClr="000000"/>
                 </a:solidFill>
               </a:ln>
               <a:effectLst/>
-              <a:sp3d>
+              <a:sp3d contourW="12700">
                 <a:contourClr>
                   <a:sysClr val="windowText" lastClr="000000"/>
                 </a:contourClr>
@@ -30212,7 +30131,7 @@
             </c:spPr>
             <c:extLst>
               <c:ext xmlns:c16="http://schemas.microsoft.com/office/drawing/2014/chart" uri="{C3380CC4-5D6E-409C-BE32-E72D297353CC}">
-                <c16:uniqueId val="{00000001-8294-4A4A-A740-42FFA133FA57}"/>
+                <c16:uniqueId val="{00000001-2F60-4A01-B384-1BC619254C28}"/>
               </c:ext>
             </c:extLst>
           </c:dPt>
@@ -30220,7 +30139,34 @@
             <c:idx val="1"/>
             <c:bubble3D val="0"/>
             <c:spPr>
-              <a:pattFill prst="weave">
+              <a:solidFill>
+                <a:schemeClr val="bg2">
+                  <a:lumMod val="90000"/>
+                </a:schemeClr>
+              </a:solidFill>
+              <a:ln w="12700">
+                <a:solidFill>
+                  <a:sysClr val="windowText" lastClr="000000"/>
+                </a:solidFill>
+              </a:ln>
+              <a:effectLst/>
+              <a:sp3d contourW="12700">
+                <a:contourClr>
+                  <a:sysClr val="windowText" lastClr="000000"/>
+                </a:contourClr>
+              </a:sp3d>
+            </c:spPr>
+            <c:extLst>
+              <c:ext xmlns:c16="http://schemas.microsoft.com/office/drawing/2014/chart" uri="{C3380CC4-5D6E-409C-BE32-E72D297353CC}">
+                <c16:uniqueId val="{00000003-2F60-4A01-B384-1BC619254C28}"/>
+              </c:ext>
+            </c:extLst>
+          </c:dPt>
+          <c:dPt>
+            <c:idx val="2"/>
+            <c:bubble3D val="0"/>
+            <c:spPr>
+              <a:pattFill prst="ltVert">
                 <a:fgClr>
                   <a:schemeClr val="tx1"/>
                 </a:fgClr>
@@ -30228,13 +30174,13 @@
                   <a:schemeClr val="bg1"/>
                 </a:bgClr>
               </a:pattFill>
-              <a:ln>
+              <a:ln w="12700">
                 <a:solidFill>
                   <a:sysClr val="windowText" lastClr="000000"/>
                 </a:solidFill>
               </a:ln>
               <a:effectLst/>
-              <a:sp3d>
+              <a:sp3d contourW="12700">
                 <a:contourClr>
                   <a:sysClr val="windowText" lastClr="000000"/>
                 </a:contourClr>
@@ -30242,15 +30188,15 @@
             </c:spPr>
             <c:extLst>
               <c:ext xmlns:c16="http://schemas.microsoft.com/office/drawing/2014/chart" uri="{C3380CC4-5D6E-409C-BE32-E72D297353CC}">
-                <c16:uniqueId val="{00000003-8294-4A4A-A740-42FFA133FA57}"/>
+                <c16:uniqueId val="{00000005-2F60-4A01-B384-1BC619254C28}"/>
               </c:ext>
             </c:extLst>
           </c:dPt>
           <c:dPt>
-            <c:idx val="2"/>
+            <c:idx val="3"/>
             <c:bubble3D val="0"/>
             <c:spPr>
-              <a:pattFill prst="dotDmnd">
+              <a:pattFill prst="dashDnDiag">
                 <a:fgClr>
                   <a:schemeClr val="tx1"/>
                 </a:fgClr>
@@ -30258,13 +30204,13 @@
                   <a:schemeClr val="bg1"/>
                 </a:bgClr>
               </a:pattFill>
-              <a:ln>
+              <a:ln w="12700">
                 <a:solidFill>
                   <a:sysClr val="windowText" lastClr="000000"/>
                 </a:solidFill>
               </a:ln>
               <a:effectLst/>
-              <a:sp3d>
+              <a:sp3d contourW="12700">
                 <a:contourClr>
                   <a:sysClr val="windowText" lastClr="000000"/>
                 </a:contourClr>
@@ -30272,37 +30218,7 @@
             </c:spPr>
             <c:extLst>
               <c:ext xmlns:c16="http://schemas.microsoft.com/office/drawing/2014/chart" uri="{C3380CC4-5D6E-409C-BE32-E72D297353CC}">
-                <c16:uniqueId val="{00000005-8294-4A4A-A740-42FFA133FA57}"/>
-              </c:ext>
-            </c:extLst>
-          </c:dPt>
-          <c:dPt>
-            <c:idx val="3"/>
-            <c:bubble3D val="0"/>
-            <c:spPr>
-              <a:pattFill prst="ltUpDiag">
-                <a:fgClr>
-                  <a:schemeClr val="tx1"/>
-                </a:fgClr>
-                <a:bgClr>
-                  <a:schemeClr val="bg1"/>
-                </a:bgClr>
-              </a:pattFill>
-              <a:ln>
-                <a:solidFill>
-                  <a:sysClr val="windowText" lastClr="000000"/>
-                </a:solidFill>
-              </a:ln>
-              <a:effectLst/>
-              <a:sp3d>
-                <a:contourClr>
-                  <a:sysClr val="windowText" lastClr="000000"/>
-                </a:contourClr>
-              </a:sp3d>
-            </c:spPr>
-            <c:extLst>
-              <c:ext xmlns:c16="http://schemas.microsoft.com/office/drawing/2014/chart" uri="{C3380CC4-5D6E-409C-BE32-E72D297353CC}">
-                <c16:uniqueId val="{00000007-8294-4A4A-A740-42FFA133FA57}"/>
+                <c16:uniqueId val="{00000007-2F60-4A01-B384-1BC619254C28}"/>
               </c:ext>
             </c:extLst>
           </c:dPt>
@@ -30343,15 +30259,13 @@
               <a:effectLst/>
             </c:spPr>
             <c:txPr>
-              <a:bodyPr rot="0" spcFirstLastPara="1" vertOverflow="ellipsis" vert="horz" wrap="square" lIns="38100" tIns="19050" rIns="38100" bIns="19050" anchor="ctr" anchorCtr="1">
-                <a:spAutoFit/>
-              </a:bodyPr>
+              <a:bodyPr rot="0" spcFirstLastPara="1" vertOverflow="ellipsis" vert="horz" wrap="square" anchor="ctr" anchorCtr="1"/>
               <a:lstStyle/>
               <a:p>
                 <a:pPr>
                   <a:defRPr sz="900" b="0" i="0" u="none" strike="noStrike" kern="1200" baseline="0">
                     <a:solidFill>
-                      <a:schemeClr val="tx2"/>
+                      <a:schemeClr val="tx1"/>
                     </a:solidFill>
                     <a:latin typeface="+mn-lt"/>
                     <a:ea typeface="+mn-ea"/>
@@ -30428,7 +30342,7 @@
           </c:val>
           <c:extLst>
             <c:ext xmlns:c16="http://schemas.microsoft.com/office/drawing/2014/chart" uri="{C3380CC4-5D6E-409C-BE32-E72D297353CC}">
-              <c16:uniqueId val="{00000008-8294-4A4A-A740-42FFA133FA57}"/>
+              <c16:uniqueId val="{00000008-2F60-4A01-B384-1BC619254C28}"/>
             </c:ext>
           </c:extLst>
         </c:ser>
@@ -30467,7 +30381,7 @@
           <a:pPr>
             <a:defRPr sz="900" b="0" i="0" u="none" strike="noStrike" kern="1200" baseline="0">
               <a:solidFill>
-                <a:schemeClr val="tx2"/>
+                <a:schemeClr val="tx1"/>
               </a:solidFill>
               <a:latin typeface="+mn-lt"/>
               <a:ea typeface="+mn-ea"/>
@@ -30486,12 +30400,9 @@
     <a:solidFill>
       <a:schemeClr val="bg1"/>
     </a:solidFill>
-    <a:ln w="9525" cap="flat" cmpd="sng" algn="ctr">
+    <a:ln w="12700" cap="flat" cmpd="sng" algn="ctr">
       <a:solidFill>
-        <a:schemeClr val="tx2">
-          <a:lumMod val="15000"/>
-          <a:lumOff val="85000"/>
-        </a:schemeClr>
+        <a:schemeClr val="tx1"/>
       </a:solidFill>
       <a:round/>
     </a:ln>
@@ -30502,7 +30413,11 @@
     <a:lstStyle/>
     <a:p>
       <a:pPr>
-        <a:defRPr/>
+        <a:defRPr>
+          <a:solidFill>
+            <a:schemeClr val="tx1"/>
+          </a:solidFill>
+        </a:defRPr>
       </a:pPr>
       <a:endParaRPr lang="en-US"/>
     </a:p>
@@ -30571,7 +30486,7 @@
             </c:spPr>
             <c:extLst>
               <c:ext xmlns:c16="http://schemas.microsoft.com/office/drawing/2014/chart" uri="{C3380CC4-5D6E-409C-BE32-E72D297353CC}">
-                <c16:uniqueId val="{00000001-F0C8-4483-B93C-CAEA382DF65E}"/>
+                <c16:uniqueId val="{00000001-770C-4AF6-B510-4AB5EAAEB855}"/>
               </c:ext>
             </c:extLst>
           </c:dPt>
@@ -30597,7 +30512,7 @@
             </c:spPr>
             <c:extLst>
               <c:ext xmlns:c16="http://schemas.microsoft.com/office/drawing/2014/chart" uri="{C3380CC4-5D6E-409C-BE32-E72D297353CC}">
-                <c16:uniqueId val="{00000003-F0C8-4483-B93C-CAEA382DF65E}"/>
+                <c16:uniqueId val="{00000003-770C-4AF6-B510-4AB5EAAEB855}"/>
               </c:ext>
             </c:extLst>
           </c:dPt>
@@ -30623,7 +30538,7 @@
             </c:spPr>
             <c:extLst>
               <c:ext xmlns:c16="http://schemas.microsoft.com/office/drawing/2014/chart" uri="{C3380CC4-5D6E-409C-BE32-E72D297353CC}">
-                <c16:uniqueId val="{00000005-F0C8-4483-B93C-CAEA382DF65E}"/>
+                <c16:uniqueId val="{00000005-770C-4AF6-B510-4AB5EAAEB855}"/>
               </c:ext>
             </c:extLst>
           </c:dPt>
@@ -30649,10 +30564,65 @@
             </c:spPr>
             <c:extLst>
               <c:ext xmlns:c16="http://schemas.microsoft.com/office/drawing/2014/chart" uri="{C3380CC4-5D6E-409C-BE32-E72D297353CC}">
-                <c16:uniqueId val="{00000007-F0C8-4483-B93C-CAEA382DF65E}"/>
+                <c16:uniqueId val="{00000007-770C-4AF6-B510-4AB5EAAEB855}"/>
               </c:ext>
             </c:extLst>
           </c:dPt>
+          <c:dLbls>
+            <c:spPr>
+              <a:noFill/>
+              <a:ln>
+                <a:noFill/>
+              </a:ln>
+              <a:effectLst/>
+            </c:spPr>
+            <c:txPr>
+              <a:bodyPr rot="0" spcFirstLastPara="1" vertOverflow="ellipsis" vert="horz" wrap="square" lIns="38100" tIns="19050" rIns="38100" bIns="19050" anchor="ctr" anchorCtr="1">
+                <a:spAutoFit/>
+              </a:bodyPr>
+              <a:lstStyle/>
+              <a:p>
+                <a:pPr>
+                  <a:defRPr sz="900" b="0" i="0" u="none" strike="noStrike" kern="1200" baseline="0">
+                    <a:solidFill>
+                      <a:schemeClr val="tx1"/>
+                    </a:solidFill>
+                    <a:latin typeface="+mn-lt"/>
+                    <a:ea typeface="+mn-ea"/>
+                    <a:cs typeface="+mn-cs"/>
+                  </a:defRPr>
+                </a:pPr>
+                <a:endParaRPr lang="en-US"/>
+              </a:p>
+            </c:txPr>
+            <c:dLblPos val="outEnd"/>
+            <c:showLegendKey val="0"/>
+            <c:showVal val="1"/>
+            <c:showCatName val="0"/>
+            <c:showSerName val="0"/>
+            <c:showPercent val="0"/>
+            <c:showBubbleSize val="0"/>
+            <c:showLeaderLines val="0"/>
+            <c:extLst>
+              <c:ext xmlns:c15="http://schemas.microsoft.com/office/drawing/2012/chart" uri="{CE6537A1-D6FC-4f65-9D91-7224C49458BB}">
+                <c15:showLeaderLines val="1"/>
+                <c15:leaderLines>
+                  <c:spPr>
+                    <a:ln w="9525" cap="flat" cmpd="sng" algn="ctr">
+                      <a:solidFill>
+                        <a:schemeClr val="tx1">
+                          <a:lumMod val="35000"/>
+                          <a:lumOff val="65000"/>
+                        </a:schemeClr>
+                      </a:solidFill>
+                      <a:round/>
+                    </a:ln>
+                    <a:effectLst/>
+                  </c:spPr>
+                </c15:leaderLines>
+              </c:ext>
+            </c:extLst>
+          </c:dLbls>
           <c:cat>
             <c:strRef>
               <c:f>Religion!$F$2:$F$5</c:f>
@@ -30696,13 +30666,14 @@
           </c:val>
           <c:extLst>
             <c:ext xmlns:c16="http://schemas.microsoft.com/office/drawing/2014/chart" uri="{C3380CC4-5D6E-409C-BE32-E72D297353CC}">
-              <c16:uniqueId val="{00000008-F0C8-4483-B93C-CAEA382DF65E}"/>
+              <c16:uniqueId val="{00000008-770C-4AF6-B510-4AB5EAAEB855}"/>
             </c:ext>
           </c:extLst>
         </c:ser>
         <c:dLbls>
+          <c:dLblPos val="outEnd"/>
           <c:showLegendKey val="0"/>
-          <c:showVal val="0"/>
+          <c:showVal val="1"/>
           <c:showCatName val="0"/>
           <c:showSerName val="0"/>
           <c:showPercent val="0"/>
@@ -30719,6 +30690,55 @@
         </c:scaling>
         <c:delete val="0"/>
         <c:axPos val="b"/>
+        <c:title>
+          <c:tx>
+            <c:rich>
+              <a:bodyPr rot="0" spcFirstLastPara="1" vertOverflow="ellipsis" vert="horz" wrap="square" anchor="ctr" anchorCtr="1"/>
+              <a:lstStyle/>
+              <a:p>
+                <a:pPr>
+                  <a:defRPr sz="1000" b="1" i="0" u="none" strike="noStrike" kern="1200" baseline="0">
+                    <a:solidFill>
+                      <a:schemeClr val="tx1"/>
+                    </a:solidFill>
+                    <a:latin typeface="+mn-lt"/>
+                    <a:ea typeface="+mn-ea"/>
+                    <a:cs typeface="+mn-cs"/>
+                  </a:defRPr>
+                </a:pPr>
+                <a:r>
+                  <a:rPr lang="en-US" b="1"/>
+                  <a:t>Religion</a:t>
+                </a:r>
+              </a:p>
+            </c:rich>
+          </c:tx>
+          <c:overlay val="0"/>
+          <c:spPr>
+            <a:noFill/>
+            <a:ln>
+              <a:noFill/>
+            </a:ln>
+            <a:effectLst/>
+          </c:spPr>
+          <c:txPr>
+            <a:bodyPr rot="0" spcFirstLastPara="1" vertOverflow="ellipsis" vert="horz" wrap="square" anchor="ctr" anchorCtr="1"/>
+            <a:lstStyle/>
+            <a:p>
+              <a:pPr>
+                <a:defRPr sz="1000" b="1" i="0" u="none" strike="noStrike" kern="1200" baseline="0">
+                  <a:solidFill>
+                    <a:schemeClr val="tx1"/>
+                  </a:solidFill>
+                  <a:latin typeface="+mn-lt"/>
+                  <a:ea typeface="+mn-ea"/>
+                  <a:cs typeface="+mn-cs"/>
+                </a:defRPr>
+              </a:pPr>
+              <a:endParaRPr lang="en-US"/>
+            </a:p>
+          </c:txPr>
+        </c:title>
         <c:numFmt formatCode="General" sourceLinked="1"/>
         <c:majorTickMark val="none"/>
         <c:minorTickMark val="none"/>
@@ -30743,10 +30763,7 @@
             <a:pPr>
               <a:defRPr sz="900" b="0" i="0" u="none" strike="noStrike" kern="1200" baseline="0">
                 <a:solidFill>
-                  <a:schemeClr val="tx1">
-                    <a:lumMod val="65000"/>
-                    <a:lumOff val="35000"/>
-                  </a:schemeClr>
+                  <a:schemeClr val="tx1"/>
                 </a:solidFill>
                 <a:latin typeface="+mn-lt"/>
                 <a:ea typeface="+mn-ea"/>
@@ -30784,6 +30801,55 @@
             <a:effectLst/>
           </c:spPr>
         </c:majorGridlines>
+        <c:title>
+          <c:tx>
+            <c:rich>
+              <a:bodyPr rot="-5400000" spcFirstLastPara="1" vertOverflow="ellipsis" vert="horz" wrap="square" anchor="ctr" anchorCtr="1"/>
+              <a:lstStyle/>
+              <a:p>
+                <a:pPr>
+                  <a:defRPr sz="1000" b="1" i="0" u="none" strike="noStrike" kern="1200" baseline="0">
+                    <a:solidFill>
+                      <a:schemeClr val="tx1"/>
+                    </a:solidFill>
+                    <a:latin typeface="+mn-lt"/>
+                    <a:ea typeface="+mn-ea"/>
+                    <a:cs typeface="+mn-cs"/>
+                  </a:defRPr>
+                </a:pPr>
+                <a:r>
+                  <a:rPr lang="en-US" b="1"/>
+                  <a:t>Percentage (%)</a:t>
+                </a:r>
+              </a:p>
+            </c:rich>
+          </c:tx>
+          <c:overlay val="0"/>
+          <c:spPr>
+            <a:noFill/>
+            <a:ln>
+              <a:noFill/>
+            </a:ln>
+            <a:effectLst/>
+          </c:spPr>
+          <c:txPr>
+            <a:bodyPr rot="-5400000" spcFirstLastPara="1" vertOverflow="ellipsis" vert="horz" wrap="square" anchor="ctr" anchorCtr="1"/>
+            <a:lstStyle/>
+            <a:p>
+              <a:pPr>
+                <a:defRPr sz="1000" b="1" i="0" u="none" strike="noStrike" kern="1200" baseline="0">
+                  <a:solidFill>
+                    <a:schemeClr val="tx1"/>
+                  </a:solidFill>
+                  <a:latin typeface="+mn-lt"/>
+                  <a:ea typeface="+mn-ea"/>
+                  <a:cs typeface="+mn-cs"/>
+                </a:defRPr>
+              </a:pPr>
+              <a:endParaRPr lang="en-US"/>
+            </a:p>
+          </c:txPr>
+        </c:title>
         <c:numFmt formatCode="0.00" sourceLinked="1"/>
         <c:majorTickMark val="none"/>
         <c:minorTickMark val="none"/>
@@ -30802,10 +30868,7 @@
             <a:pPr>
               <a:defRPr sz="900" b="0" i="0" u="none" strike="noStrike" kern="1200" baseline="0">
                 <a:solidFill>
-                  <a:schemeClr val="tx1">
-                    <a:lumMod val="65000"/>
-                    <a:lumOff val="35000"/>
-                  </a:schemeClr>
+                  <a:schemeClr val="tx1"/>
                 </a:solidFill>
                 <a:latin typeface="+mn-lt"/>
                 <a:ea typeface="+mn-ea"/>
@@ -30835,12 +30898,9 @@
     <a:solidFill>
       <a:schemeClr val="bg1"/>
     </a:solidFill>
-    <a:ln w="9525" cap="flat" cmpd="sng" algn="ctr">
+    <a:ln w="12700" cap="flat" cmpd="sng" algn="ctr">
       <a:solidFill>
-        <a:schemeClr val="tx1">
-          <a:lumMod val="15000"/>
-          <a:lumOff val="85000"/>
-        </a:schemeClr>
+        <a:schemeClr val="tx1"/>
       </a:solidFill>
       <a:round/>
     </a:ln>
@@ -30851,7 +30911,11 @@
     <a:lstStyle/>
     <a:p>
       <a:pPr>
-        <a:defRPr/>
+        <a:defRPr>
+          <a:solidFill>
+            <a:schemeClr val="tx1"/>
+          </a:solidFill>
+        </a:defRPr>
       </a:pPr>
       <a:endParaRPr lang="en-US"/>
     </a:p>
@@ -30932,7 +30996,7 @@
                 <a:schemeClr val="bg1"/>
               </a:bgClr>
             </a:pattFill>
-            <a:ln>
+            <a:ln w="12700">
               <a:solidFill>
                 <a:sysClr val="windowText" lastClr="000000"/>
               </a:solidFill>
@@ -30942,15 +31006,12 @@
             <c:idx val="0"/>
             <c:bubble3D val="0"/>
             <c:spPr>
-              <a:pattFill prst="dashHorz">
-                <a:fgClr>
-                  <a:schemeClr val="tx1"/>
-                </a:fgClr>
-                <a:bgClr>
-                  <a:schemeClr val="bg1"/>
-                </a:bgClr>
-              </a:pattFill>
-              <a:ln w="25400">
+              <a:solidFill>
+                <a:schemeClr val="bg1">
+                  <a:lumMod val="85000"/>
+                </a:schemeClr>
+              </a:solidFill>
+              <a:ln w="12700">
                 <a:solidFill>
                   <a:sysClr val="windowText" lastClr="000000"/>
                 </a:solidFill>
@@ -30963,7 +31024,7 @@
                   </a:schemeClr>
                 </a:outerShdw>
               </a:effectLst>
-              <a:sp3d contourW="25400">
+              <a:sp3d contourW="12700">
                 <a:contourClr>
                   <a:sysClr val="windowText" lastClr="000000"/>
                 </a:contourClr>
@@ -30971,7 +31032,7 @@
             </c:spPr>
             <c:extLst>
               <c:ext xmlns:c16="http://schemas.microsoft.com/office/drawing/2014/chart" uri="{C3380CC4-5D6E-409C-BE32-E72D297353CC}">
-                <c16:uniqueId val="{00000001-33B9-4655-8B4B-E146DC1F6F59}"/>
+                <c16:uniqueId val="{00000001-608C-4101-9999-0840B1500422}"/>
               </c:ext>
             </c:extLst>
           </c:dPt>
@@ -30979,7 +31040,7 @@
             <c:idx val="1"/>
             <c:bubble3D val="0"/>
             <c:spPr>
-              <a:pattFill prst="ltDnDiag">
+              <a:pattFill prst="dashDnDiag">
                 <a:fgClr>
                   <a:schemeClr val="tx1"/>
                 </a:fgClr>
@@ -30987,13 +31048,13 @@
                   <a:schemeClr val="bg1"/>
                 </a:bgClr>
               </a:pattFill>
-              <a:ln w="25400">
+              <a:ln w="12700">
                 <a:solidFill>
                   <a:sysClr val="windowText" lastClr="000000"/>
                 </a:solidFill>
               </a:ln>
               <a:effectLst/>
-              <a:sp3d contourW="25400">
+              <a:sp3d contourW="12700">
                 <a:contourClr>
                   <a:sysClr val="windowText" lastClr="000000"/>
                 </a:contourClr>
@@ -31001,7 +31062,7 @@
             </c:spPr>
             <c:extLst>
               <c:ext xmlns:c16="http://schemas.microsoft.com/office/drawing/2014/chart" uri="{C3380CC4-5D6E-409C-BE32-E72D297353CC}">
-                <c16:uniqueId val="{00000003-33B9-4655-8B4B-E146DC1F6F59}"/>
+                <c16:uniqueId val="{00000003-608C-4101-9999-0840B1500422}"/>
               </c:ext>
             </c:extLst>
           </c:dPt>
@@ -31017,13 +31078,13 @@
                   <a:schemeClr val="bg1"/>
                 </a:bgClr>
               </a:pattFill>
-              <a:ln w="25400">
+              <a:ln w="12700">
                 <a:solidFill>
                   <a:sysClr val="windowText" lastClr="000000"/>
                 </a:solidFill>
               </a:ln>
               <a:effectLst/>
-              <a:sp3d contourW="25400">
+              <a:sp3d contourW="12700">
                 <a:contourClr>
                   <a:sysClr val="windowText" lastClr="000000"/>
                 </a:contourClr>
@@ -31031,7 +31092,7 @@
             </c:spPr>
             <c:extLst>
               <c:ext xmlns:c16="http://schemas.microsoft.com/office/drawing/2014/chart" uri="{C3380CC4-5D6E-409C-BE32-E72D297353CC}">
-                <c16:uniqueId val="{00000005-33B9-4655-8B4B-E146DC1F6F59}"/>
+                <c16:uniqueId val="{00000005-608C-4101-9999-0840B1500422}"/>
               </c:ext>
             </c:extLst>
           </c:dPt>
@@ -31156,7 +31217,7 @@
           </c:val>
           <c:extLst>
             <c:ext xmlns:c16="http://schemas.microsoft.com/office/drawing/2014/chart" uri="{C3380CC4-5D6E-409C-BE32-E72D297353CC}">
-              <c16:uniqueId val="{00000006-33B9-4655-8B4B-E146DC1F6F59}"/>
+              <c16:uniqueId val="{00000006-608C-4101-9999-0840B1500422}"/>
             </c:ext>
           </c:extLst>
         </c:ser>
@@ -31187,7 +31248,9 @@
       <a:schemeClr val="bg1"/>
     </a:solidFill>
     <a:ln w="9525" cap="flat" cmpd="sng" algn="ctr">
-      <a:noFill/>
+      <a:solidFill>
+        <a:schemeClr val="tx1"/>
+      </a:solidFill>
       <a:round/>
     </a:ln>
     <a:effectLst/>
@@ -31247,7 +31310,7 @@
             <a:noFill/>
             <a:ln>
               <a:solidFill>
-                <a:sysClr val="windowText" lastClr="000000"/>
+                <a:schemeClr val="tx1"/>
               </a:solidFill>
             </a:ln>
             <a:effectLst/>
@@ -31270,10 +31333,7 @@
                 <a:pPr>
                   <a:defRPr sz="900" b="0" i="0" u="none" strike="noStrike" kern="1200" baseline="0">
                     <a:solidFill>
-                      <a:schemeClr val="tx1">
-                        <a:lumMod val="75000"/>
-                        <a:lumOff val="25000"/>
-                      </a:schemeClr>
+                      <a:schemeClr val="tx1"/>
                     </a:solidFill>
                     <a:latin typeface="+mn-lt"/>
                     <a:ea typeface="+mn-ea"/>
@@ -31296,14 +31356,13 @@
                 <c15:showLeaderLines val="1"/>
                 <c15:leaderLines>
                   <c:spPr>
-                    <a:ln w="9525" cap="flat" cmpd="sng" algn="ctr">
+                    <a:ln w="9525">
                       <a:solidFill>
                         <a:schemeClr val="tx1">
                           <a:lumMod val="35000"/>
                           <a:lumOff val="65000"/>
                         </a:schemeClr>
                       </a:solidFill>
-                      <a:round/>
                     </a:ln>
                     <a:effectLst/>
                   </c:spPr>
@@ -31342,7 +31401,7 @@
           </c:val>
           <c:extLst>
             <c:ext xmlns:c16="http://schemas.microsoft.com/office/drawing/2014/chart" uri="{C3380CC4-5D6E-409C-BE32-E72D297353CC}">
-              <c16:uniqueId val="{00000000-7598-4F04-8C2C-4EF756C8B8DE}"/>
+              <c16:uniqueId val="{00000000-1626-4DD3-9F57-D4B42F520C5B}"/>
             </c:ext>
           </c:extLst>
         </c:ser>
@@ -31361,14 +31420,18 @@
             </c:strRef>
           </c:tx>
           <c:spPr>
-            <a:solidFill>
-              <a:schemeClr val="tx1">
-                <a:lumMod val="65000"/>
-                <a:lumOff val="35000"/>
-              </a:schemeClr>
-            </a:solidFill>
+            <a:pattFill prst="pct5">
+              <a:fgClr>
+                <a:schemeClr val="dk1"/>
+              </a:fgClr>
+              <a:bgClr>
+                <a:schemeClr val="bg1"/>
+              </a:bgClr>
+            </a:pattFill>
             <a:ln>
-              <a:noFill/>
+              <a:solidFill>
+                <a:schemeClr val="tx1"/>
+              </a:solidFill>
             </a:ln>
             <a:effectLst/>
           </c:spPr>
@@ -31390,10 +31453,7 @@
                 <a:pPr>
                   <a:defRPr sz="900" b="0" i="0" u="none" strike="noStrike" kern="1200" baseline="0">
                     <a:solidFill>
-                      <a:schemeClr val="tx1">
-                        <a:lumMod val="75000"/>
-                        <a:lumOff val="25000"/>
-                      </a:schemeClr>
+                      <a:schemeClr val="tx1"/>
                     </a:solidFill>
                     <a:latin typeface="+mn-lt"/>
                     <a:ea typeface="+mn-ea"/>
@@ -31416,14 +31476,13 @@
                 <c15:showLeaderLines val="1"/>
                 <c15:leaderLines>
                   <c:spPr>
-                    <a:ln w="9525" cap="flat" cmpd="sng" algn="ctr">
+                    <a:ln w="9525">
                       <a:solidFill>
                         <a:schemeClr val="tx1">
                           <a:lumMod val="35000"/>
                           <a:lumOff val="65000"/>
                         </a:schemeClr>
                       </a:solidFill>
-                      <a:round/>
                     </a:ln>
                     <a:effectLst/>
                   </c:spPr>
@@ -31462,20 +31521,20 @@
           </c:val>
           <c:extLst>
             <c:ext xmlns:c16="http://schemas.microsoft.com/office/drawing/2014/chart" uri="{C3380CC4-5D6E-409C-BE32-E72D297353CC}">
-              <c16:uniqueId val="{00000001-7598-4F04-8C2C-4EF756C8B8DE}"/>
+              <c16:uniqueId val="{00000001-1626-4DD3-9F57-D4B42F520C5B}"/>
             </c:ext>
           </c:extLst>
         </c:ser>
         <c:dLbls>
+          <c:dLblPos val="outEnd"/>
           <c:showLegendKey val="0"/>
-          <c:showVal val="0"/>
+          <c:showVal val="1"/>
           <c:showCatName val="0"/>
           <c:showSerName val="0"/>
           <c:showPercent val="0"/>
           <c:showBubbleSize val="0"/>
         </c:dLbls>
-        <c:gapWidth val="219"/>
-        <c:overlap val="-27"/>
+        <c:gapWidth val="150"/>
         <c:axId val="135354991"/>
         <c:axId val="1949608672"/>
       </c:barChart>
@@ -31493,9 +31552,9 @@
               <a:lstStyle/>
               <a:p>
                 <a:pPr>
-                  <a:defRPr sz="1000" b="0" i="0" u="none" strike="noStrike" kern="1200" baseline="0">
+                  <a:defRPr sz="900" b="1" i="0" u="none" strike="noStrike" kern="1200" cap="none" baseline="0">
                     <a:solidFill>
-                      <a:schemeClr val="dk1"/>
+                      <a:schemeClr val="tx1"/>
                     </a:solidFill>
                     <a:latin typeface="+mn-lt"/>
                     <a:ea typeface="+mn-ea"/>
@@ -31503,29 +31562,17 @@
                   </a:defRPr>
                 </a:pPr>
                 <a:r>
-                  <a:rPr lang="en-GB">
-                    <a:solidFill>
-                      <a:schemeClr val="dk1"/>
-                    </a:solidFill>
-                    <a:latin typeface="+mn-lt"/>
-                    <a:ea typeface="+mn-ea"/>
-                    <a:cs typeface="+mn-cs"/>
-                  </a:rPr>
+                  <a:rPr lang="en-GB" b="1" cap="none" baseline="0"/>
                   <a:t>Marital Status</a:t>
                 </a:r>
-                <a:endParaRPr lang="en-GB"/>
               </a:p>
             </c:rich>
           </c:tx>
           <c:overlay val="0"/>
           <c:spPr>
-            <a:solidFill>
-              <a:schemeClr val="lt1"/>
-            </a:solidFill>
-            <a:ln w="12700" cap="flat" cmpd="sng" algn="ctr">
+            <a:noFill/>
+            <a:ln>
               <a:noFill/>
-              <a:prstDash val="solid"/>
-              <a:miter lim="800000"/>
             </a:ln>
             <a:effectLst/>
           </c:spPr>
@@ -31534,9 +31581,9 @@
             <a:lstStyle/>
             <a:p>
               <a:pPr>
-                <a:defRPr sz="1000" b="0" i="0" u="none" strike="noStrike" kern="1200" baseline="0">
+                <a:defRPr sz="900" b="1" i="0" u="none" strike="noStrike" kern="1200" cap="none" baseline="0">
                   <a:solidFill>
-                    <a:schemeClr val="dk1"/>
+                    <a:schemeClr val="tx1"/>
                   </a:solidFill>
                   <a:latin typeface="+mn-lt"/>
                   <a:ea typeface="+mn-ea"/>
@@ -31569,12 +31616,9 @@
           <a:lstStyle/>
           <a:p>
             <a:pPr>
-              <a:defRPr sz="900" b="0" i="0" u="none" strike="noStrike" kern="1200" baseline="0">
+              <a:defRPr sz="900" b="0" i="0" u="none" strike="noStrike" kern="1200" cap="none" spc="0" normalizeH="0" baseline="0">
                 <a:solidFill>
-                  <a:schemeClr val="tx1">
-                    <a:lumMod val="65000"/>
-                    <a:lumOff val="35000"/>
-                  </a:schemeClr>
+                  <a:schemeClr val="tx1"/>
                 </a:solidFill>
                 <a:latin typeface="+mn-lt"/>
                 <a:ea typeface="+mn-ea"/>
@@ -31619,9 +31663,9 @@
               <a:lstStyle/>
               <a:p>
                 <a:pPr>
-                  <a:defRPr sz="1000" b="0" i="0" u="none" strike="noStrike" kern="1200" baseline="0">
+                  <a:defRPr sz="900" b="1" i="0" u="none" strike="noStrike" kern="1200" cap="none" baseline="0">
                     <a:solidFill>
-                      <a:schemeClr val="dk1"/>
+                      <a:schemeClr val="tx1"/>
                     </a:solidFill>
                     <a:latin typeface="+mn-lt"/>
                     <a:ea typeface="+mn-ea"/>
@@ -31629,29 +31673,17 @@
                   </a:defRPr>
                 </a:pPr>
                 <a:r>
-                  <a:rPr lang="en-GB">
-                    <a:solidFill>
-                      <a:schemeClr val="dk1"/>
-                    </a:solidFill>
-                    <a:latin typeface="+mn-lt"/>
-                    <a:ea typeface="+mn-ea"/>
-                    <a:cs typeface="+mn-cs"/>
-                  </a:rPr>
-                  <a:t>Percent</a:t>
+                  <a:rPr lang="en-GB" b="1" cap="none" baseline="0"/>
+                  <a:t>Percentage (%)</a:t>
                 </a:r>
-                <a:endParaRPr lang="en-GB"/>
               </a:p>
             </c:rich>
           </c:tx>
           <c:overlay val="0"/>
           <c:spPr>
-            <a:solidFill>
-              <a:schemeClr val="lt1"/>
-            </a:solidFill>
-            <a:ln w="12700" cap="flat" cmpd="sng" algn="ctr">
+            <a:noFill/>
+            <a:ln>
               <a:noFill/>
-              <a:prstDash val="solid"/>
-              <a:miter lim="800000"/>
             </a:ln>
             <a:effectLst/>
           </c:spPr>
@@ -31660,9 +31692,9 @@
             <a:lstStyle/>
             <a:p>
               <a:pPr>
-                <a:defRPr sz="1000" b="0" i="0" u="none" strike="noStrike" kern="1200" baseline="0">
+                <a:defRPr sz="900" b="1" i="0" u="none" strike="noStrike" kern="1200" cap="none" baseline="0">
                   <a:solidFill>
-                    <a:schemeClr val="dk1"/>
+                    <a:schemeClr val="tx1"/>
                   </a:solidFill>
                   <a:latin typeface="+mn-lt"/>
                   <a:ea typeface="+mn-ea"/>
@@ -31674,7 +31706,7 @@
           </c:txPr>
         </c:title>
         <c:numFmt formatCode="0.00" sourceLinked="1"/>
-        <c:majorTickMark val="none"/>
+        <c:majorTickMark val="out"/>
         <c:minorTickMark val="none"/>
         <c:tickLblPos val="nextTo"/>
         <c:spPr>
@@ -31691,10 +31723,7 @@
             <a:pPr>
               <a:defRPr sz="900" b="0" i="0" u="none" strike="noStrike" kern="1200" baseline="0">
                 <a:solidFill>
-                  <a:schemeClr val="tx1">
-                    <a:lumMod val="65000"/>
-                    <a:lumOff val="35000"/>
-                  </a:schemeClr>
+                  <a:schemeClr val="tx1"/>
                 </a:solidFill>
                 <a:latin typeface="+mn-lt"/>
                 <a:ea typeface="+mn-ea"/>
@@ -31733,10 +31762,7 @@
           <a:pPr>
             <a:defRPr sz="900" b="0" i="0" u="none" strike="noStrike" kern="1200" baseline="0">
               <a:solidFill>
-                <a:schemeClr val="tx1">
-                  <a:lumMod val="65000"/>
-                  <a:lumOff val="35000"/>
-                </a:schemeClr>
+                <a:schemeClr val="tx1"/>
               </a:solidFill>
               <a:latin typeface="+mn-lt"/>
               <a:ea typeface="+mn-ea"/>
@@ -31755,9 +31781,9 @@
     <a:solidFill>
       <a:schemeClr val="bg1"/>
     </a:solidFill>
-    <a:ln w="9525" cap="flat" cmpd="sng" algn="ctr">
+    <a:ln w="12700" cap="flat" cmpd="sng" algn="ctr">
       <a:solidFill>
-        <a:sysClr val="windowText" lastClr="000000"/>
+        <a:schemeClr val="tx1"/>
       </a:solidFill>
       <a:round/>
     </a:ln>
@@ -31768,7 +31794,11 @@
     <a:lstStyle/>
     <a:p>
       <a:pPr>
-        <a:defRPr/>
+        <a:defRPr>
+          <a:solidFill>
+            <a:schemeClr val="tx1"/>
+          </a:solidFill>
+        </a:defRPr>
       </a:pPr>
       <a:endParaRPr lang="en-US"/>
     </a:p>
@@ -31794,18 +31824,64 @@
   </mc:AlternateContent>
   <c:chart>
     <c:autoTitleDeleted val="1"/>
+    <c:view3D>
+      <c:rotX val="30"/>
+      <c:rotY val="0"/>
+      <c:depthPercent val="100"/>
+      <c:rAngAx val="0"/>
+    </c:view3D>
+    <c:floor>
+      <c:thickness val="0"/>
+      <c:spPr>
+        <a:noFill/>
+        <a:ln>
+          <a:noFill/>
+        </a:ln>
+        <a:effectLst/>
+        <a:sp3d/>
+      </c:spPr>
+    </c:floor>
+    <c:sideWall>
+      <c:thickness val="0"/>
+      <c:spPr>
+        <a:noFill/>
+        <a:ln>
+          <a:noFill/>
+        </a:ln>
+        <a:effectLst/>
+        <a:sp3d/>
+      </c:spPr>
+    </c:sideWall>
+    <c:backWall>
+      <c:thickness val="0"/>
+      <c:spPr>
+        <a:noFill/>
+        <a:ln>
+          <a:noFill/>
+        </a:ln>
+        <a:effectLst/>
+        <a:sp3d/>
+      </c:spPr>
+    </c:backWall>
     <c:plotArea>
       <c:layout/>
-      <c:pieChart>
+      <c:pie3DChart>
         <c:varyColors val="1"/>
         <c:ser>
           <c:idx val="0"/>
           <c:order val="0"/>
+          <c:spPr>
+            <a:ln w="12700">
+              <a:solidFill>
+                <a:sysClr val="windowText" lastClr="000000"/>
+              </a:solidFill>
+            </a:ln>
+          </c:spPr>
           <c:dPt>
             <c:idx val="0"/>
             <c:bubble3D val="0"/>
             <c:spPr>
-              <a:pattFill prst="smCheck">
+              <a:pattFill prst="pct5">
                 <a:fgClr>
                   <a:schemeClr val="tx1"/>
                 </a:fgClr>
@@ -31813,16 +31889,21 @@
                   <a:schemeClr val="bg1"/>
                 </a:bgClr>
               </a:pattFill>
-              <a:ln w="0">
+              <a:ln w="12700">
                 <a:solidFill>
                   <a:sysClr val="windowText" lastClr="000000"/>
                 </a:solidFill>
               </a:ln>
               <a:effectLst/>
+              <a:sp3d contourW="12700">
+                <a:contourClr>
+                  <a:sysClr val="windowText" lastClr="000000"/>
+                </a:contourClr>
+              </a:sp3d>
             </c:spPr>
             <c:extLst>
               <c:ext xmlns:c16="http://schemas.microsoft.com/office/drawing/2014/chart" uri="{C3380CC4-5D6E-409C-BE32-E72D297353CC}">
-                <c16:uniqueId val="{00000001-E8E4-4BDE-8110-EC855606DE1D}"/>
+                <c16:uniqueId val="{00000001-2392-4B9D-A6A8-DFC080A36C92}"/>
               </c:ext>
             </c:extLst>
           </c:dPt>
@@ -31830,82 +31911,178 @@
             <c:idx val="1"/>
             <c:bubble3D val="0"/>
             <c:spPr>
-              <a:pattFill prst="wave">
-                <a:fgClr>
-                  <a:schemeClr val="tx1"/>
-                </a:fgClr>
-                <a:bgClr>
-                  <a:schemeClr val="bg1"/>
-                </a:bgClr>
-              </a:pattFill>
-              <a:ln w="0">
+              <a:solidFill>
+                <a:schemeClr val="bg1">
+                  <a:lumMod val="85000"/>
+                </a:schemeClr>
+              </a:solidFill>
+              <a:ln w="12700">
                 <a:solidFill>
                   <a:sysClr val="windowText" lastClr="000000"/>
                 </a:solidFill>
               </a:ln>
               <a:effectLst/>
+              <a:sp3d contourW="12700">
+                <a:contourClr>
+                  <a:sysClr val="windowText" lastClr="000000"/>
+                </a:contourClr>
+              </a:sp3d>
             </c:spPr>
             <c:extLst>
               <c:ext xmlns:c16="http://schemas.microsoft.com/office/drawing/2014/chart" uri="{C3380CC4-5D6E-409C-BE32-E72D297353CC}">
-                <c16:uniqueId val="{00000003-E8E4-4BDE-8110-EC855606DE1D}"/>
+                <c16:uniqueId val="{00000003-2392-4B9D-A6A8-DFC080A36C92}"/>
               </c:ext>
             </c:extLst>
           </c:dPt>
           <c:dLbls>
+            <c:dLbl>
+              <c:idx val="0"/>
+              <c:spPr>
+                <a:gradFill>
+                  <a:gsLst>
+                    <a:gs pos="0">
+                      <a:schemeClr val="accent3">
+                        <a:lumMod val="5000"/>
+                        <a:lumOff val="95000"/>
+                      </a:schemeClr>
+                    </a:gs>
+                    <a:gs pos="74000">
+                      <a:schemeClr val="accent3">
+                        <a:lumMod val="45000"/>
+                        <a:lumOff val="55000"/>
+                      </a:schemeClr>
+                    </a:gs>
+                    <a:gs pos="83000">
+                      <a:schemeClr val="accent3">
+                        <a:lumMod val="45000"/>
+                        <a:lumOff val="55000"/>
+                      </a:schemeClr>
+                    </a:gs>
+                    <a:gs pos="100000">
+                      <a:schemeClr val="accent3">
+                        <a:lumMod val="30000"/>
+                        <a:lumOff val="70000"/>
+                      </a:schemeClr>
+                    </a:gs>
+                  </a:gsLst>
+                  <a:lin ang="5400000" scaled="1"/>
+                </a:gradFill>
+                <a:ln>
+                  <a:noFill/>
+                </a:ln>
+                <a:effectLst/>
+              </c:spPr>
+              <c:txPr>
+                <a:bodyPr rot="0" spcFirstLastPara="1" vertOverflow="ellipsis" vert="horz" wrap="square" anchor="ctr" anchorCtr="1"/>
+                <a:lstStyle/>
+                <a:p>
+                  <a:pPr>
+                    <a:defRPr sz="900" b="0" i="0" u="none" strike="noStrike" kern="1200" baseline="0">
+                      <a:solidFill>
+                        <a:schemeClr val="tx1"/>
+                      </a:solidFill>
+                      <a:latin typeface="+mn-lt"/>
+                      <a:ea typeface="+mn-ea"/>
+                      <a:cs typeface="+mn-cs"/>
+                    </a:defRPr>
+                  </a:pPr>
+                  <a:endParaRPr lang="en-US"/>
+                </a:p>
+              </c:txPr>
+              <c:showLegendKey val="0"/>
+              <c:showVal val="0"/>
+              <c:showCatName val="0"/>
+              <c:showSerName val="0"/>
+              <c:showPercent val="1"/>
+              <c:showBubbleSize val="0"/>
+              <c:extLst>
+                <c:ext xmlns:c16="http://schemas.microsoft.com/office/drawing/2014/chart" uri="{C3380CC4-5D6E-409C-BE32-E72D297353CC}">
+                  <c16:uniqueId val="{00000001-2392-4B9D-A6A8-DFC080A36C92}"/>
+                </c:ext>
+              </c:extLst>
+            </c:dLbl>
+            <c:dLbl>
+              <c:idx val="1"/>
+              <c:spPr>
+                <a:gradFill>
+                  <a:gsLst>
+                    <a:gs pos="0">
+                      <a:schemeClr val="accent3">
+                        <a:lumMod val="5000"/>
+                        <a:lumOff val="95000"/>
+                      </a:schemeClr>
+                    </a:gs>
+                    <a:gs pos="74000">
+                      <a:schemeClr val="accent3">
+                        <a:lumMod val="45000"/>
+                        <a:lumOff val="55000"/>
+                      </a:schemeClr>
+                    </a:gs>
+                    <a:gs pos="83000">
+                      <a:schemeClr val="accent3">
+                        <a:lumMod val="45000"/>
+                        <a:lumOff val="55000"/>
+                      </a:schemeClr>
+                    </a:gs>
+                    <a:gs pos="100000">
+                      <a:schemeClr val="accent3">
+                        <a:lumMod val="30000"/>
+                        <a:lumOff val="70000"/>
+                      </a:schemeClr>
+                    </a:gs>
+                  </a:gsLst>
+                  <a:lin ang="5400000" scaled="1"/>
+                </a:gradFill>
+                <a:ln>
+                  <a:noFill/>
+                </a:ln>
+                <a:effectLst/>
+              </c:spPr>
+              <c:txPr>
+                <a:bodyPr rot="0" spcFirstLastPara="1" vertOverflow="ellipsis" vert="horz" wrap="square" anchor="ctr" anchorCtr="1"/>
+                <a:lstStyle/>
+                <a:p>
+                  <a:pPr>
+                    <a:defRPr sz="900" b="0" i="0" u="none" strike="noStrike" kern="1200" baseline="0">
+                      <a:solidFill>
+                        <a:schemeClr val="tx1"/>
+                      </a:solidFill>
+                      <a:latin typeface="+mn-lt"/>
+                      <a:ea typeface="+mn-ea"/>
+                      <a:cs typeface="+mn-cs"/>
+                    </a:defRPr>
+                  </a:pPr>
+                  <a:endParaRPr lang="en-US"/>
+                </a:p>
+              </c:txPr>
+              <c:showLegendKey val="0"/>
+              <c:showVal val="0"/>
+              <c:showCatName val="0"/>
+              <c:showSerName val="0"/>
+              <c:showPercent val="1"/>
+              <c:showBubbleSize val="0"/>
+              <c:extLst>
+                <c:ext xmlns:c16="http://schemas.microsoft.com/office/drawing/2014/chart" uri="{C3380CC4-5D6E-409C-BE32-E72D297353CC}">
+                  <c16:uniqueId val="{00000003-2392-4B9D-A6A8-DFC080A36C92}"/>
+                </c:ext>
+              </c:extLst>
+            </c:dLbl>
             <c:spPr>
-              <a:solidFill>
-                <a:schemeClr val="bg2"/>
-              </a:solidFill>
+              <a:noFill/>
               <a:ln>
                 <a:noFill/>
               </a:ln>
               <a:effectLst/>
             </c:spPr>
             <c:txPr>
-              <a:bodyPr rot="0" spcFirstLastPara="1" vertOverflow="ellipsis" vert="horz" wrap="square" lIns="38100" tIns="19050" rIns="38100" bIns="19050" anchor="ctr" anchorCtr="1">
-                <a:spAutoFit/>
-              </a:bodyPr>
+              <a:bodyPr rot="0" spcFirstLastPara="1" vertOverflow="ellipsis" vert="horz" wrap="square" anchor="ctr" anchorCtr="1"/>
               <a:lstStyle/>
               <a:p>
                 <a:pPr>
                   <a:defRPr sz="900" b="0" i="0" u="none" strike="noStrike" kern="1200" baseline="0">
-                    <a:ln>
-                      <a:solidFill>
-                        <a:sysClr val="windowText" lastClr="000000"/>
-                      </a:solidFill>
-                    </a:ln>
-                    <a:gradFill flip="none" rotWithShape="1">
-                      <a:gsLst>
-                        <a:gs pos="0">
-                          <a:schemeClr val="bg2"/>
-                        </a:gs>
-                        <a:gs pos="74000">
-                          <a:schemeClr val="accent1">
-                            <a:lumMod val="45000"/>
-                            <a:lumOff val="55000"/>
-                          </a:schemeClr>
-                        </a:gs>
-                        <a:gs pos="83000">
-                          <a:schemeClr val="accent1">
-                            <a:lumMod val="45000"/>
-                            <a:lumOff val="55000"/>
-                          </a:schemeClr>
-                        </a:gs>
-                        <a:gs pos="100000">
-                          <a:schemeClr val="accent1">
-                            <a:lumMod val="30000"/>
-                            <a:lumOff val="70000"/>
-                          </a:schemeClr>
-                        </a:gs>
-                      </a:gsLst>
-                      <a:lin ang="5400000" scaled="1"/>
-                      <a:tileRect/>
-                    </a:gradFill>
-                    <a:effectLst>
-                      <a:outerShdw blurRad="50800" dist="50800" dir="5400000" algn="ctr" rotWithShape="0">
-                        <a:schemeClr val="bg2"/>
-                      </a:outerShdw>
-                    </a:effectLst>
+                    <a:solidFill>
+                      <a:schemeClr val="tx1"/>
+                    </a:solidFill>
                     <a:latin typeface="+mn-lt"/>
                     <a:ea typeface="+mn-ea"/>
                     <a:cs typeface="+mn-cs"/>
@@ -31970,7 +32147,7 @@
           </c:val>
           <c:extLst>
             <c:ext xmlns:c16="http://schemas.microsoft.com/office/drawing/2014/chart" uri="{C3380CC4-5D6E-409C-BE32-E72D297353CC}">
-              <c16:uniqueId val="{00000004-E8E4-4BDE-8110-EC855606DE1D}"/>
+              <c16:uniqueId val="{00000004-2392-4B9D-A6A8-DFC080A36C92}"/>
             </c:ext>
           </c:extLst>
         </c:ser>
@@ -31983,8 +32160,7 @@
           <c:showBubbleSize val="0"/>
           <c:showLeaderLines val="1"/>
         </c:dLbls>
-        <c:firstSliceAng val="0"/>
-      </c:pieChart>
+      </c:pie3DChart>
       <c:spPr>
         <a:noFill/>
         <a:ln>
@@ -31994,14 +32170,12 @@
       </c:spPr>
     </c:plotArea>
     <c:legend>
-      <c:legendPos val="r"/>
+      <c:legendPos val="b"/>
       <c:overlay val="0"/>
       <c:spPr>
         <a:noFill/>
-        <a:ln w="0">
-          <a:solidFill>
-            <a:sysClr val="windowText" lastClr="000000"/>
-          </a:solidFill>
+        <a:ln>
+          <a:noFill/>
         </a:ln>
         <a:effectLst/>
       </c:spPr>
@@ -32009,13 +32183,10 @@
         <a:bodyPr rot="0" spcFirstLastPara="1" vertOverflow="ellipsis" vert="horz" wrap="square" anchor="ctr" anchorCtr="1"/>
         <a:lstStyle/>
         <a:p>
-          <a:pPr rtl="0">
+          <a:pPr>
             <a:defRPr sz="900" b="0" i="0" u="none" strike="noStrike" kern="1200" baseline="0">
               <a:solidFill>
-                <a:schemeClr val="tx1">
-                  <a:lumMod val="65000"/>
-                  <a:lumOff val="35000"/>
-                </a:schemeClr>
+                <a:schemeClr val="tx1"/>
               </a:solidFill>
               <a:latin typeface="+mn-lt"/>
               <a:ea typeface="+mn-ea"/>
@@ -32034,12 +32205,9 @@
     <a:solidFill>
       <a:schemeClr val="bg1"/>
     </a:solidFill>
-    <a:ln w="9525" cap="flat" cmpd="sng" algn="ctr">
+    <a:ln w="12700" cap="flat" cmpd="sng" algn="ctr">
       <a:solidFill>
-        <a:schemeClr val="tx1">
-          <a:lumMod val="15000"/>
-          <a:lumOff val="85000"/>
-        </a:schemeClr>
+        <a:schemeClr val="tx1"/>
       </a:solidFill>
       <a:round/>
     </a:ln>
@@ -32050,7 +32218,11 @@
     <a:lstStyle/>
     <a:p>
       <a:pPr>
-        <a:defRPr/>
+        <a:defRPr>
+          <a:solidFill>
+            <a:schemeClr val="tx1"/>
+          </a:solidFill>
+        </a:defRPr>
       </a:pPr>
       <a:endParaRPr lang="en-US"/>
     </a:p>
@@ -32131,7 +32303,7 @@
                 <a:schemeClr val="bg1"/>
               </a:bgClr>
             </a:pattFill>
-            <a:ln>
+            <a:ln w="12700">
               <a:solidFill>
                 <a:sysClr val="windowText" lastClr="000000"/>
               </a:solidFill>
@@ -32141,7 +32313,34 @@
             <c:idx val="0"/>
             <c:bubble3D val="0"/>
             <c:spPr>
-              <a:pattFill prst="pct10">
+              <a:solidFill>
+                <a:schemeClr val="bg1">
+                  <a:lumMod val="75000"/>
+                </a:schemeClr>
+              </a:solidFill>
+              <a:ln w="12700">
+                <a:solidFill>
+                  <a:sysClr val="windowText" lastClr="000000"/>
+                </a:solidFill>
+              </a:ln>
+              <a:effectLst/>
+              <a:sp3d contourW="12700">
+                <a:contourClr>
+                  <a:sysClr val="windowText" lastClr="000000"/>
+                </a:contourClr>
+              </a:sp3d>
+            </c:spPr>
+            <c:extLst>
+              <c:ext xmlns:c16="http://schemas.microsoft.com/office/drawing/2014/chart" uri="{C3380CC4-5D6E-409C-BE32-E72D297353CC}">
+                <c16:uniqueId val="{00000001-6080-4303-B2D3-FCE27C3E4C14}"/>
+              </c:ext>
+            </c:extLst>
+          </c:dPt>
+          <c:dPt>
+            <c:idx val="1"/>
+            <c:bubble3D val="0"/>
+            <c:spPr>
+              <a:pattFill prst="pct20">
                 <a:fgClr>
                   <a:schemeClr val="tx1"/>
                 </a:fgClr>
@@ -32149,13 +32348,13 @@
                   <a:schemeClr val="bg1"/>
                 </a:bgClr>
               </a:pattFill>
-              <a:ln w="25400">
+              <a:ln w="12700">
                 <a:solidFill>
                   <a:sysClr val="windowText" lastClr="000000"/>
                 </a:solidFill>
               </a:ln>
               <a:effectLst/>
-              <a:sp3d contourW="25400">
+              <a:sp3d contourW="12700">
                 <a:contourClr>
                   <a:sysClr val="windowText" lastClr="000000"/>
                 </a:contourClr>
@@ -32163,37 +32362,7 @@
             </c:spPr>
             <c:extLst>
               <c:ext xmlns:c16="http://schemas.microsoft.com/office/drawing/2014/chart" uri="{C3380CC4-5D6E-409C-BE32-E72D297353CC}">
-                <c16:uniqueId val="{00000001-67BF-49CF-B1C8-75C75166A48B}"/>
-              </c:ext>
-            </c:extLst>
-          </c:dPt>
-          <c:dPt>
-            <c:idx val="1"/>
-            <c:bubble3D val="0"/>
-            <c:spPr>
-              <a:pattFill prst="pct30">
-                <a:fgClr>
-                  <a:schemeClr val="tx1"/>
-                </a:fgClr>
-                <a:bgClr>
-                  <a:schemeClr val="bg1"/>
-                </a:bgClr>
-              </a:pattFill>
-              <a:ln w="25400">
-                <a:solidFill>
-                  <a:sysClr val="windowText" lastClr="000000"/>
-                </a:solidFill>
-              </a:ln>
-              <a:effectLst/>
-              <a:sp3d contourW="25400">
-                <a:contourClr>
-                  <a:sysClr val="windowText" lastClr="000000"/>
-                </a:contourClr>
-              </a:sp3d>
-            </c:spPr>
-            <c:extLst>
-              <c:ext xmlns:c16="http://schemas.microsoft.com/office/drawing/2014/chart" uri="{C3380CC4-5D6E-409C-BE32-E72D297353CC}">
-                <c16:uniqueId val="{00000003-67BF-49CF-B1C8-75C75166A48B}"/>
+                <c16:uniqueId val="{00000003-6080-4303-B2D3-FCE27C3E4C14}"/>
               </c:ext>
             </c:extLst>
           </c:dPt>
@@ -32209,13 +32378,13 @@
                   <a:schemeClr val="bg1"/>
                 </a:bgClr>
               </a:pattFill>
-              <a:ln w="25400">
+              <a:ln w="12700">
                 <a:solidFill>
                   <a:sysClr val="windowText" lastClr="000000"/>
                 </a:solidFill>
               </a:ln>
               <a:effectLst/>
-              <a:sp3d contourW="25400">
+              <a:sp3d contourW="12700">
                 <a:contourClr>
                   <a:sysClr val="windowText" lastClr="000000"/>
                 </a:contourClr>
@@ -32223,7 +32392,7 @@
             </c:spPr>
             <c:extLst>
               <c:ext xmlns:c16="http://schemas.microsoft.com/office/drawing/2014/chart" uri="{C3380CC4-5D6E-409C-BE32-E72D297353CC}">
-                <c16:uniqueId val="{00000005-67BF-49CF-B1C8-75C75166A48B}"/>
+                <c16:uniqueId val="{00000005-6080-4303-B2D3-FCE27C3E4C14}"/>
               </c:ext>
             </c:extLst>
           </c:dPt>
@@ -32322,7 +32491,7 @@
           </c:val>
           <c:extLst>
             <c:ext xmlns:c16="http://schemas.microsoft.com/office/drawing/2014/chart" uri="{C3380CC4-5D6E-409C-BE32-E72D297353CC}">
-              <c16:uniqueId val="{00000006-67BF-49CF-B1C8-75C75166A48B}"/>
+              <c16:uniqueId val="{00000006-6080-4303-B2D3-FCE27C3E4C14}"/>
             </c:ext>
           </c:extLst>
         </c:ser>
@@ -32384,12 +32553,9 @@
     <a:solidFill>
       <a:schemeClr val="bg1"/>
     </a:solidFill>
-    <a:ln w="9525" cap="flat" cmpd="sng" algn="ctr">
+    <a:ln w="12700" cap="flat" cmpd="sng" algn="ctr">
       <a:solidFill>
-        <a:schemeClr val="tx1">
-          <a:lumMod val="15000"/>
-          <a:lumOff val="85000"/>
-        </a:schemeClr>
+        <a:schemeClr val="tx1"/>
       </a:solidFill>
       <a:round/>
     </a:ln>
@@ -35080,7 +35246,7 @@
 </file>
 
 <file path=word/charts/style5.xml><?xml version="1.0" encoding="utf-8"?>
-<cs:chartStyle xmlns:cs="http://schemas.microsoft.com/office/drawing/2012/chartStyle" xmlns:a="http://schemas.openxmlformats.org/drawingml/2006/main" id="201">
+<cs:chartStyle xmlns:cs="http://schemas.microsoft.com/office/drawing/2012/chartStyle" xmlns:a="http://schemas.openxmlformats.org/drawingml/2006/main" id="212">
   <cs:axisTitle>
     <cs:lnRef idx="0"/>
     <cs:fillRef idx="0"/>
@@ -35091,7 +35257,7 @@
         <a:lumOff val="35000"/>
       </a:schemeClr>
     </cs:fontRef>
-    <cs:defRPr sz="1000" kern="1200"/>
+    <cs:defRPr sz="900" kern="1200" cap="all"/>
   </cs:axisTitle>
   <cs:categoryAxis>
     <cs:lnRef idx="0"/>
@@ -35114,14 +35280,14 @@
         <a:round/>
       </a:ln>
     </cs:spPr>
-    <cs:defRPr sz="900" kern="1200"/>
+    <cs:defRPr sz="900" b="0" kern="1200" cap="none" spc="0" normalizeH="0" baseline="0"/>
   </cs:categoryAxis>
   <cs:chartArea mods="allowNoFillOverride allowNoLineOverride">
     <cs:lnRef idx="0"/>
     <cs:fillRef idx="0"/>
     <cs:effectRef idx="0"/>
     <cs:fontRef idx="minor">
-      <a:schemeClr val="tx1"/>
+      <a:schemeClr val="dk1"/>
     </cs:fontRef>
     <cs:spPr>
       <a:solidFill>
@@ -35137,7 +35303,7 @@
         <a:round/>
       </a:ln>
     </cs:spPr>
-    <cs:defRPr sz="1000" kern="1200"/>
+    <cs:defRPr sz="900" kern="1200"/>
   </cs:chartArea>
   <cs:dataLabel>
     <cs:lnRef idx="0"/>
@@ -35157,22 +35323,17 @@
     <cs:effectRef idx="0"/>
     <cs:fontRef idx="minor">
       <a:schemeClr val="dk1">
-        <a:lumMod val="65000"/>
-        <a:lumOff val="35000"/>
+        <a:lumMod val="75000"/>
+        <a:lumOff val="25000"/>
       </a:schemeClr>
     </cs:fontRef>
     <cs:spPr>
       <a:solidFill>
-        <a:schemeClr val="lt1"/>
+        <a:schemeClr val="dk1">
+          <a:lumMod val="15000"/>
+          <a:lumOff val="85000"/>
+        </a:schemeClr>
       </a:solidFill>
-      <a:ln>
-        <a:solidFill>
-          <a:schemeClr val="dk1">
-            <a:lumMod val="25000"/>
-            <a:lumOff val="75000"/>
-          </a:schemeClr>
-        </a:solidFill>
-      </a:ln>
     </cs:spPr>
     <cs:defRPr sz="900" kern="1200"/>
     <cs:bodyPr rot="0" spcFirstLastPara="1" vertOverflow="clip" horzOverflow="clip" vert="horz" wrap="square" lIns="36576" tIns="18288" rIns="36576" bIns="18288" anchor="ctr" anchorCtr="1">
@@ -35181,35 +35342,45 @@
   </cs:dataLabelCallout>
   <cs:dataPoint>
     <cs:lnRef idx="0"/>
-    <cs:fillRef idx="1">
+    <cs:fillRef idx="0">
       <cs:styleClr val="auto"/>
     </cs:fillRef>
     <cs:effectRef idx="0"/>
     <cs:fontRef idx="minor">
-      <a:schemeClr val="tx1"/>
+      <a:schemeClr val="dk1"/>
     </cs:fontRef>
+    <cs:spPr>
+      <a:solidFill>
+        <a:schemeClr val="phClr"/>
+      </a:solidFill>
+    </cs:spPr>
   </cs:dataPoint>
   <cs:dataPoint3D>
     <cs:lnRef idx="0"/>
-    <cs:fillRef idx="1">
+    <cs:fillRef idx="0">
       <cs:styleClr val="auto"/>
     </cs:fillRef>
     <cs:effectRef idx="0"/>
     <cs:fontRef idx="minor">
-      <a:schemeClr val="tx1"/>
+      <a:schemeClr val="dk1"/>
     </cs:fontRef>
+    <cs:spPr>
+      <a:solidFill>
+        <a:schemeClr val="phClr"/>
+      </a:solidFill>
+    </cs:spPr>
   </cs:dataPoint3D>
   <cs:dataPointLine>
     <cs:lnRef idx="0">
       <cs:styleClr val="auto"/>
     </cs:lnRef>
-    <cs:fillRef idx="1"/>
+    <cs:fillRef idx="0"/>
     <cs:effectRef idx="0"/>
     <cs:fontRef idx="minor">
-      <a:schemeClr val="tx1"/>
+      <a:schemeClr val="dk1"/>
     </cs:fontRef>
     <cs:spPr>
-      <a:ln w="28575" cap="rnd">
+      <a:ln w="38100" cap="rnd">
         <a:solidFill>
           <a:schemeClr val="phClr"/>
         </a:solidFill>
@@ -35218,33 +35389,29 @@
     </cs:spPr>
   </cs:dataPointLine>
   <cs:dataPointMarker>
-    <cs:lnRef idx="0">
-      <cs:styleClr val="auto"/>
-    </cs:lnRef>
-    <cs:fillRef idx="1">
+    <cs:lnRef idx="0"/>
+    <cs:fillRef idx="0">
       <cs:styleClr val="auto"/>
     </cs:fillRef>
     <cs:effectRef idx="0"/>
     <cs:fontRef idx="minor">
-      <a:schemeClr val="tx1"/>
+      <a:schemeClr val="dk1"/>
     </cs:fontRef>
     <cs:spPr>
-      <a:ln w="9525">
-        <a:solidFill>
-          <a:schemeClr val="phClr"/>
-        </a:solidFill>
-      </a:ln>
+      <a:solidFill>
+        <a:schemeClr val="phClr"/>
+      </a:solidFill>
     </cs:spPr>
   </cs:dataPointMarker>
-  <cs:dataPointMarkerLayout symbol="circle" size="5"/>
+  <cs:dataPointMarkerLayout symbol="circle" size="8"/>
   <cs:dataPointWireframe>
     <cs:lnRef idx="0">
       <cs:styleClr val="auto"/>
     </cs:lnRef>
-    <cs:fillRef idx="1"/>
+    <cs:fillRef idx="0"/>
     <cs:effectRef idx="0"/>
     <cs:fontRef idx="minor">
-      <a:schemeClr val="tx1"/>
+      <a:schemeClr val="dk1"/>
     </cs:fontRef>
     <cs:spPr>
       <a:ln w="9525" cap="rnd">
@@ -35266,15 +35433,13 @@
       </a:schemeClr>
     </cs:fontRef>
     <cs:spPr>
-      <a:noFill/>
-      <a:ln w="9525" cap="flat" cmpd="sng" algn="ctr">
+      <a:ln w="9525">
         <a:solidFill>
           <a:schemeClr val="tx1">
             <a:lumMod val="15000"/>
             <a:lumOff val="85000"/>
           </a:schemeClr>
         </a:solidFill>
-        <a:round/>
       </a:ln>
     </cs:spPr>
     <cs:defRPr sz="900" kern="1200"/>
@@ -35289,15 +35454,15 @@
     <cs:spPr>
       <a:solidFill>
         <a:schemeClr val="dk1">
-          <a:lumMod val="65000"/>
-          <a:lumOff val="35000"/>
+          <a:lumMod val="75000"/>
+          <a:lumOff val="25000"/>
         </a:schemeClr>
       </a:solidFill>
       <a:ln w="9525">
         <a:solidFill>
           <a:schemeClr val="tx1">
-            <a:lumMod val="65000"/>
-            <a:lumOff val="35000"/>
+            <a:lumMod val="50000"/>
+            <a:lumOff val="50000"/>
           </a:schemeClr>
         </a:solidFill>
       </a:ln>
@@ -35308,17 +35473,17 @@
     <cs:fillRef idx="0"/>
     <cs:effectRef idx="0"/>
     <cs:fontRef idx="minor">
-      <a:schemeClr val="tx1"/>
+      <a:schemeClr val="dk1"/>
     </cs:fontRef>
     <cs:spPr>
-      <a:ln w="9525" cap="flat" cmpd="sng" algn="ctr">
+      <a:ln w="9525">
         <a:solidFill>
           <a:schemeClr val="tx1">
-            <a:lumMod val="35000"/>
-            <a:lumOff val="65000"/>
+            <a:lumMod val="50000"/>
+            <a:lumOff val="50000"/>
           </a:schemeClr>
         </a:solidFill>
-        <a:round/>
+        <a:prstDash val="dash"/>
       </a:ln>
     </cs:spPr>
   </cs:dropLine>
@@ -35327,14 +35492,14 @@
     <cs:fillRef idx="0"/>
     <cs:effectRef idx="0"/>
     <cs:fontRef idx="minor">
-      <a:schemeClr val="tx1"/>
+      <a:schemeClr val="dk1"/>
     </cs:fontRef>
     <cs:spPr>
-      <a:ln w="9525" cap="flat" cmpd="sng" algn="ctr">
+      <a:ln w="9525">
         <a:solidFill>
           <a:schemeClr val="tx1">
-            <a:lumMod val="65000"/>
-            <a:lumOff val="35000"/>
+            <a:lumMod val="50000"/>
+            <a:lumOff val="50000"/>
           </a:schemeClr>
         </a:solidFill>
         <a:round/>
@@ -35346,21 +35511,15 @@
     <cs:fillRef idx="0"/>
     <cs:effectRef idx="0"/>
     <cs:fontRef idx="minor">
-      <a:schemeClr val="tx1"/>
+      <a:schemeClr val="dk1"/>
     </cs:fontRef>
-    <cs:spPr>
-      <a:noFill/>
-      <a:ln>
-        <a:noFill/>
-      </a:ln>
-    </cs:spPr>
   </cs:floor>
   <cs:gridlineMajor>
     <cs:lnRef idx="0"/>
     <cs:fillRef idx="0"/>
     <cs:effectRef idx="0"/>
     <cs:fontRef idx="minor">
-      <a:schemeClr val="tx1"/>
+      <a:schemeClr val="dk1"/>
     </cs:fontRef>
     <cs:spPr>
       <a:ln w="9525" cap="flat" cmpd="sng" algn="ctr">
@@ -35379,7 +35538,7 @@
     <cs:fillRef idx="0"/>
     <cs:effectRef idx="0"/>
     <cs:fontRef idx="minor">
-      <a:schemeClr val="tx1"/>
+      <a:schemeClr val="dk1"/>
     </cs:fontRef>
     <cs:spPr>
       <a:ln w="9525" cap="flat" cmpd="sng" algn="ctr">
@@ -35398,17 +35557,17 @@
     <cs:fillRef idx="0"/>
     <cs:effectRef idx="0"/>
     <cs:fontRef idx="minor">
-      <a:schemeClr val="tx1"/>
+      <a:schemeClr val="dk1"/>
     </cs:fontRef>
     <cs:spPr>
-      <a:ln w="9525" cap="flat" cmpd="sng" algn="ctr">
+      <a:ln w="9525">
         <a:solidFill>
           <a:schemeClr val="tx1">
-            <a:lumMod val="75000"/>
-            <a:lumOff val="25000"/>
+            <a:lumMod val="50000"/>
+            <a:lumOff val="50000"/>
           </a:schemeClr>
         </a:solidFill>
-        <a:round/>
+        <a:prstDash val="dash"/>
       </a:ln>
     </cs:spPr>
   </cs:hiLoLine>
@@ -35417,17 +35576,16 @@
     <cs:fillRef idx="0"/>
     <cs:effectRef idx="0"/>
     <cs:fontRef idx="minor">
-      <a:schemeClr val="tx1"/>
+      <a:schemeClr val="dk1"/>
     </cs:fontRef>
     <cs:spPr>
-      <a:ln w="9525" cap="flat" cmpd="sng" algn="ctr">
+      <a:ln w="9525">
         <a:solidFill>
           <a:schemeClr val="tx1">
             <a:lumMod val="35000"/>
             <a:lumOff val="65000"/>
           </a:schemeClr>
         </a:solidFill>
-        <a:round/>
       </a:ln>
     </cs:spPr>
   </cs:leaderLine>
@@ -35448,7 +35606,7 @@
     <cs:fillRef idx="0"/>
     <cs:effectRef idx="0"/>
     <cs:fontRef idx="minor">
-      <a:schemeClr val="tx1"/>
+      <a:schemeClr val="dk1"/>
     </cs:fontRef>
   </cs:plotArea>
   <cs:plotArea3D mods="allowNoFillOverride allowNoLineOverride">
@@ -35456,7 +35614,7 @@
     <cs:fillRef idx="0"/>
     <cs:effectRef idx="0"/>
     <cs:fontRef idx="minor">
-      <a:schemeClr val="tx1"/>
+      <a:schemeClr val="dk1"/>
     </cs:fontRef>
   </cs:plotArea3D>
   <cs:seriesAxis>
@@ -35469,6 +35627,17 @@
         <a:lumOff val="35000"/>
       </a:schemeClr>
     </cs:fontRef>
+    <cs:spPr>
+      <a:ln w="9525" cap="flat" cmpd="sng" algn="ctr">
+        <a:solidFill>
+          <a:schemeClr val="tx1">
+            <a:lumMod val="15000"/>
+            <a:lumOff val="85000"/>
+          </a:schemeClr>
+        </a:solidFill>
+        <a:round/>
+      </a:ln>
+    </cs:spPr>
     <cs:defRPr sz="900" kern="1200"/>
   </cs:seriesAxis>
   <cs:seriesLine>
@@ -35476,10 +35645,10 @@
     <cs:fillRef idx="0"/>
     <cs:effectRef idx="0"/>
     <cs:fontRef idx="minor">
-      <a:schemeClr val="tx1"/>
+      <a:schemeClr val="dk1"/>
     </cs:fontRef>
     <cs:spPr>
-      <a:ln w="9525" cap="flat" cmpd="sng" algn="ctr">
+      <a:ln w="9525">
         <a:solidFill>
           <a:schemeClr val="tx1">
             <a:lumMod val="35000"/>
@@ -35494,13 +35663,13 @@
     <cs:lnRef idx="0"/>
     <cs:fillRef idx="0"/>
     <cs:effectRef idx="0"/>
-    <cs:fontRef idx="minor">
+    <cs:fontRef idx="major">
       <a:schemeClr val="tx1">
         <a:lumMod val="65000"/>
         <a:lumOff val="35000"/>
       </a:schemeClr>
     </cs:fontRef>
-    <cs:defRPr sz="1400" b="0" kern="1200" spc="0" baseline="0"/>
+    <cs:defRPr sz="2000" b="0" kern="1200" cap="none" spc="0" normalizeH="0" baseline="0"/>
   </cs:title>
   <cs:trendline>
     <cs:lnRef idx="0">
@@ -35509,14 +35678,14 @@
     <cs:fillRef idx="0"/>
     <cs:effectRef idx="0"/>
     <cs:fontRef idx="minor">
-      <a:schemeClr val="tx1"/>
+      <a:schemeClr val="dk1"/>
     </cs:fontRef>
     <cs:spPr>
       <a:ln w="19050" cap="rnd">
         <a:solidFill>
           <a:schemeClr val="phClr"/>
         </a:solidFill>
-        <a:prstDash val="sysDot"/>
+        <a:round/>
       </a:ln>
     </cs:spPr>
   </cs:trendline>
@@ -35546,8 +35715,8 @@
       <a:ln w="9525">
         <a:solidFill>
           <a:schemeClr val="tx1">
-            <a:lumMod val="15000"/>
-            <a:lumOff val="85000"/>
+            <a:lumMod val="50000"/>
+            <a:lumOff val="50000"/>
           </a:schemeClr>
         </a:solidFill>
       </a:ln>
@@ -35570,20 +35739,14 @@
     <cs:fillRef idx="0"/>
     <cs:effectRef idx="0"/>
     <cs:fontRef idx="minor">
-      <a:schemeClr val="tx1"/>
+      <a:schemeClr val="dk1"/>
     </cs:fontRef>
-    <cs:spPr>
-      <a:noFill/>
-      <a:ln>
-        <a:noFill/>
-      </a:ln>
-    </cs:spPr>
   </cs:wall>
 </cs:chartStyle>
 </file>
 
 <file path=word/charts/style6.xml><?xml version="1.0" encoding="utf-8"?>
-<cs:chartStyle xmlns:cs="http://schemas.microsoft.com/office/drawing/2012/chartStyle" xmlns:a="http://schemas.openxmlformats.org/drawingml/2006/main" id="251">
+<cs:chartStyle xmlns:cs="http://schemas.microsoft.com/office/drawing/2012/chartStyle" xmlns:a="http://schemas.openxmlformats.org/drawingml/2006/main" id="262">
   <cs:axisTitle>
     <cs:lnRef idx="0"/>
     <cs:fillRef idx="0"/>

</xml_diff>

<commit_message>
rabina doc added for thesis
</commit_message>
<xml_diff>
--- a/migration/Thesis Migration - Latest.docx
+++ b/migration/Thesis Migration - Latest.docx
@@ -3243,15 +3243,7 @@
         <w:pStyle w:val="BodyText"/>
       </w:pPr>
       <w:r>
-        <w:t xml:space="preserve">Process of migration is as old as human society. In early days there was primitive migration in which the natural forces were vital but as the time passed on gradually different types of migration appears in </w:t>
-      </w:r>
-      <w:proofErr w:type="spellStart"/>
-      <w:r>
-        <w:t>a</w:t>
-      </w:r>
-      <w:proofErr w:type="spellEnd"/>
-      <w:r>
-        <w:t xml:space="preserve"> early period. Natural force, primitive people shift them from one place to another but present there are not only forced immigration but also voluntary migration can be seen. In forced migration natural force, political force, political factors play an important role to shift the residence. Nepal has a long</w:t>
+        <w:t>Process of migration is as old as human society. In early days there was primitive migration in which the natural forces were vital but as the time passed on gradually different types of migration appears in a early period. Natural force, primitive people shift them from one place to another but present there are not only forced immigration but also voluntary migration can be seen. In forced migration natural force, political force, political factors play an important role to shift the residence. Nepal has a long</w:t>
       </w:r>
       <w:r>
         <w:t xml:space="preserve"> </w:t>
@@ -5191,25 +5183,30 @@
         <w:t>.1</w:t>
       </w:r>
       <w:r>
-        <w:t xml:space="preserve"> Research Design</w:t>
+        <w:t xml:space="preserve"> </w:t>
       </w:r>
       <w:bookmarkEnd w:id="19"/>
+      <w:r>
+        <w:t>Introduction to Study Area</w:t>
+      </w:r>
     </w:p>
     <w:p>
       <w:pPr>
-        <w:pStyle w:val="BodyText"/>
-        <w:rPr>
-          <w:b/>
+        <w:jc w:val="both"/>
+        <w:rPr>
+          <w:rFonts w:ascii="Times New Roman" w:hAnsi="Times New Roman" w:cs="Times New Roman"/>
+          <w:kern w:val="0"/>
+          <w:lang w:bidi="ne-NP"/>
         </w:rPr>
       </w:pPr>
-      <w:r>
-        <w:t xml:space="preserve">This study will adopt a descriptive and analytical research design to examine the causes and consequences of internal migration in rural areas of Nepal. The descriptive design will help </w:t>
-      </w:r>
-      <w:r>
-        <w:t xml:space="preserve">describe </w:t>
-      </w:r>
-      <w:r>
-        <w:t>major causes and consequences of migration. The analytical aspect will help analyze the relationship between different factors influencing migration and their impacts on rural households.</w:t>
+      <w:bookmarkStart w:id="20" w:name="_Toc230102588"/>
+      <w:r>
+        <w:rPr>
+          <w:rFonts w:ascii="Times New Roman" w:hAnsi="Times New Roman" w:cs="Times New Roman"/>
+          <w:kern w:val="0"/>
+          <w:lang w:bidi="ne-NP"/>
+        </w:rPr>
+        <w:t>This section describes the study area selected for the study. The study area was selected to examine the characteristics of migrant households, their places of origin, reasons for migration, conditions before and after migration, and the changes experienced after migration. The study was based on information collected from sampled households within the study area.</w:t>
       </w:r>
     </w:p>
     <w:p>
@@ -5224,1426 +5221,498 @@
           <w:lang w:bidi="ne-NP"/>
         </w:rPr>
       </w:pPr>
-      <w:bookmarkStart w:id="20" w:name="_Toc230102588"/>
       <w:r>
         <w:t>3.2</w:t>
       </w:r>
       <w:r>
         <w:t xml:space="preserve"> </w:t>
       </w:r>
-      <w:r>
-        <w:t>Nature and source of data</w:t>
-      </w:r>
       <w:bookmarkEnd w:id="20"/>
+      <w:r>
+        <w:t>Sample Design</w:t>
+      </w:r>
     </w:p>
     <w:p>
       <w:pPr>
-        <w:pStyle w:val="BodyText"/>
+        <w:jc w:val="both"/>
+        <w:rPr>
+          <w:rFonts w:ascii="Times New Roman" w:hAnsi="Times New Roman" w:cs="Times New Roman"/>
+          <w:kern w:val="0"/>
+          <w:lang w:bidi="ne-NP"/>
+        </w:rPr>
       </w:pPr>
-      <w:r>
-        <w:t>The study will use both primary and secondary sources of data.</w:t>
+      <w:bookmarkStart w:id="21" w:name="_Toc230102589"/>
+      <w:r>
+        <w:rPr>
+          <w:rFonts w:ascii="Times New Roman" w:hAnsi="Times New Roman" w:cs="Times New Roman"/>
+          <w:kern w:val="0"/>
+          <w:lang w:bidi="ne-NP"/>
+        </w:rPr>
+        <w:t>The study used household-level information collected from 89 sampled households. The households were considered for the study according to their migration experience and the information required for the study. The distribution of the sampled households by year of migration is presented below.</w:t>
       </w:r>
     </w:p>
     <w:p>
       <w:pPr>
-        <w:pStyle w:val="BodyText"/>
-        <w:rPr>
+        <w:spacing w:after="0"/>
+      </w:pPr>
+      <w:r>
+        <w:rPr>
+          <w:rFonts w:ascii="Times New Roman" w:hAnsi="Times New Roman"/>
           <w:b/>
-          <w:bCs/>
+        </w:rPr>
+        <w:t>Table 3.1: Distribution of sampled households by year of migration</w:t>
+      </w:r>
+    </w:p>
+    <w:tbl>
+      <w:tblPr>
+        <w:tblStyle w:val="TableGrid"/>
+        <w:tblW w:w="0" w:type="auto"/>
+        <w:jc w:val="center"/>
+        <w:tblLook w:val="04A0" w:firstRow="1" w:lastRow="0" w:firstColumn="1" w:lastColumn="0" w:noHBand="0" w:noVBand="1"/>
+      </w:tblPr>
+      <w:tblGrid>
+        <w:gridCol w:w="4298"/>
+        <w:gridCol w:w="4332"/>
+      </w:tblGrid>
+      <w:tr>
+        <w:trPr>
+          <w:jc w:val="center"/>
+        </w:trPr>
+        <w:tc>
+          <w:tcPr>
+            <w:tcW w:w="4500" w:type="dxa"/>
+          </w:tcPr>
+          <w:p>
+            <w:r>
+              <w:t>Year</w:t>
+            </w:r>
+          </w:p>
+        </w:tc>
+        <w:tc>
+          <w:tcPr>
+            <w:tcW w:w="4500" w:type="dxa"/>
+          </w:tcPr>
+          <w:p>
+            <w:r>
+              <w:t>Number of households</w:t>
+            </w:r>
+          </w:p>
+        </w:tc>
+      </w:tr>
+      <w:tr>
+        <w:trPr>
+          <w:jc w:val="center"/>
+        </w:trPr>
+        <w:tc>
+          <w:tcPr>
+            <w:tcW w:w="4500" w:type="dxa"/>
+          </w:tcPr>
+          <w:p>
+            <w:r>
+              <w:t>2074</w:t>
+            </w:r>
+          </w:p>
+        </w:tc>
+        <w:tc>
+          <w:tcPr>
+            <w:tcW w:w="4500" w:type="dxa"/>
+          </w:tcPr>
+          <w:p>
+            <w:r>
+              <w:t>9</w:t>
+            </w:r>
+          </w:p>
+        </w:tc>
+      </w:tr>
+      <w:tr>
+        <w:trPr>
+          <w:jc w:val="center"/>
+        </w:trPr>
+        <w:tc>
+          <w:tcPr>
+            <w:tcW w:w="4500" w:type="dxa"/>
+          </w:tcPr>
+          <w:p>
+            <w:r>
+              <w:t>2075</w:t>
+            </w:r>
+          </w:p>
+        </w:tc>
+        <w:tc>
+          <w:tcPr>
+            <w:tcW w:w="4500" w:type="dxa"/>
+          </w:tcPr>
+          <w:p>
+            <w:r>
+              <w:t>5</w:t>
+            </w:r>
+          </w:p>
+        </w:tc>
+      </w:tr>
+      <w:tr>
+        <w:trPr>
+          <w:jc w:val="center"/>
+        </w:trPr>
+        <w:tc>
+          <w:tcPr>
+            <w:tcW w:w="4500" w:type="dxa"/>
+          </w:tcPr>
+          <w:p>
+            <w:r>
+              <w:t>2076</w:t>
+            </w:r>
+          </w:p>
+        </w:tc>
+        <w:tc>
+          <w:tcPr>
+            <w:tcW w:w="4500" w:type="dxa"/>
+          </w:tcPr>
+          <w:p>
+            <w:r>
+              <w:t>8</w:t>
+            </w:r>
+          </w:p>
+        </w:tc>
+      </w:tr>
+      <w:tr>
+        <w:trPr>
+          <w:jc w:val="center"/>
+        </w:trPr>
+        <w:tc>
+          <w:tcPr>
+            <w:tcW w:w="4500" w:type="dxa"/>
+          </w:tcPr>
+          <w:p>
+            <w:r>
+              <w:t>2077</w:t>
+            </w:r>
+          </w:p>
+        </w:tc>
+        <w:tc>
+          <w:tcPr>
+            <w:tcW w:w="4500" w:type="dxa"/>
+          </w:tcPr>
+          <w:p>
+            <w:r>
+              <w:t>2</w:t>
+            </w:r>
+          </w:p>
+        </w:tc>
+      </w:tr>
+      <w:tr>
+        <w:trPr>
+          <w:jc w:val="center"/>
+        </w:trPr>
+        <w:tc>
+          <w:tcPr>
+            <w:tcW w:w="4500" w:type="dxa"/>
+          </w:tcPr>
+          <w:p>
+            <w:r>
+              <w:t>2078</w:t>
+            </w:r>
+          </w:p>
+        </w:tc>
+        <w:tc>
+          <w:tcPr>
+            <w:tcW w:w="4500" w:type="dxa"/>
+          </w:tcPr>
+          <w:p>
+            <w:r>
+              <w:t>12</w:t>
+            </w:r>
+          </w:p>
+        </w:tc>
+      </w:tr>
+      <w:tr>
+        <w:trPr>
+          <w:jc w:val="center"/>
+        </w:trPr>
+        <w:tc>
+          <w:tcPr>
+            <w:tcW w:w="4500" w:type="dxa"/>
+          </w:tcPr>
+          <w:p>
+            <w:r>
+              <w:t>2079</w:t>
+            </w:r>
+          </w:p>
+        </w:tc>
+        <w:tc>
+          <w:tcPr>
+            <w:tcW w:w="4500" w:type="dxa"/>
+          </w:tcPr>
+          <w:p>
+            <w:r>
+              <w:t>14</w:t>
+            </w:r>
+          </w:p>
+        </w:tc>
+      </w:tr>
+      <w:tr>
+        <w:trPr>
+          <w:jc w:val="center"/>
+        </w:trPr>
+        <w:tc>
+          <w:tcPr>
+            <w:tcW w:w="4500" w:type="dxa"/>
+          </w:tcPr>
+          <w:p>
+            <w:r>
+              <w:t>2080</w:t>
+            </w:r>
+          </w:p>
+        </w:tc>
+        <w:tc>
+          <w:tcPr>
+            <w:tcW w:w="4500" w:type="dxa"/>
+          </w:tcPr>
+          <w:p>
+            <w:r>
+              <w:t>9</w:t>
+            </w:r>
+          </w:p>
+        </w:tc>
+      </w:tr>
+      <w:tr>
+        <w:trPr>
+          <w:jc w:val="center"/>
+        </w:trPr>
+        <w:tc>
+          <w:tcPr>
+            <w:tcW w:w="4500" w:type="dxa"/>
+          </w:tcPr>
+          <w:p>
+            <w:r>
+              <w:t>2081</w:t>
+            </w:r>
+          </w:p>
+        </w:tc>
+        <w:tc>
+          <w:tcPr>
+            <w:tcW w:w="4500" w:type="dxa"/>
+          </w:tcPr>
+          <w:p>
+            <w:r>
+              <w:t>11</w:t>
+            </w:r>
+          </w:p>
+        </w:tc>
+      </w:tr>
+      <w:tr>
+        <w:trPr>
+          <w:jc w:val="center"/>
+        </w:trPr>
+        <w:tc>
+          <w:tcPr>
+            <w:tcW w:w="4500" w:type="dxa"/>
+          </w:tcPr>
+          <w:p>
+            <w:r>
+              <w:t>2082</w:t>
+            </w:r>
+          </w:p>
+        </w:tc>
+        <w:tc>
+          <w:tcPr>
+            <w:tcW w:w="4500" w:type="dxa"/>
+          </w:tcPr>
+          <w:p>
+            <w:r>
+              <w:t>16</w:t>
+            </w:r>
+          </w:p>
+        </w:tc>
+      </w:tr>
+      <w:tr>
+        <w:trPr>
+          <w:jc w:val="center"/>
+        </w:trPr>
+        <w:tc>
+          <w:tcPr>
+            <w:tcW w:w="4500" w:type="dxa"/>
+          </w:tcPr>
+          <w:p>
+            <w:r>
+              <w:t>2083</w:t>
+            </w:r>
+          </w:p>
+        </w:tc>
+        <w:tc>
+          <w:tcPr>
+            <w:tcW w:w="4500" w:type="dxa"/>
+          </w:tcPr>
+          <w:p>
+            <w:r>
+              <w:t>3</w:t>
+            </w:r>
+          </w:p>
+        </w:tc>
+      </w:tr>
+      <w:tr>
+        <w:trPr>
+          <w:jc w:val="center"/>
+        </w:trPr>
+        <w:tc>
+          <w:tcPr>
+            <w:tcW w:w="4500" w:type="dxa"/>
+          </w:tcPr>
+          <w:p>
+            <w:r>
+              <w:t>Total</w:t>
+            </w:r>
+          </w:p>
+        </w:tc>
+        <w:tc>
+          <w:tcPr>
+            <w:tcW w:w="4500" w:type="dxa"/>
+          </w:tcPr>
+          <w:p>
+            <w:r>
+              <w:t>89</w:t>
+            </w:r>
+          </w:p>
+        </w:tc>
+      </w:tr>
+    </w:tbl>
+    <w:p>
+      <w:pPr>
+        <w:rPr>
+          <w:i/>
+          <w:iCs/>
         </w:rPr>
       </w:pPr>
       <w:r>
         <w:rPr>
-          <w:b/>
-          <w:bCs/>
-        </w:rPr>
-        <w:t>Primary Data</w:t>
+          <w:rFonts w:ascii="Times New Roman" w:hAnsi="Times New Roman"/>
+          <w:i/>
+          <w:iCs/>
+        </w:rPr>
+        <w:t>Source: Field Survey</w:t>
       </w:r>
     </w:p>
     <w:p>
       <w:pPr>
-        <w:pStyle w:val="BodyText"/>
+        <w:jc w:val="both"/>
+        <w:rPr>
+          <w:rFonts w:ascii="Times New Roman" w:hAnsi="Times New Roman" w:cs="Times New Roman"/>
+          <w:kern w:val="0"/>
+          <w:lang w:bidi="ne-NP"/>
+        </w:rPr>
       </w:pPr>
       <w:r>
-        <w:t>Primary data will be collected directly from respondents through questionnaires administered to households and migrants in the selected rural area. The primary data will provide information regarding the causes, patterns, and consequences of internal migration.</w:t>
-      </w:r>
-    </w:p>
-    <w:p>
-      <w:pPr>
-        <w:pStyle w:val="BodyText"/>
-        <w:rPr>
-          <w:b/>
-          <w:bCs/>
-        </w:rPr>
-      </w:pPr>
-      <w:r>
-        <w:rPr>
-          <w:b/>
-          <w:bCs/>
-        </w:rPr>
-        <w:t>Secondary Data</w:t>
-      </w:r>
-    </w:p>
-    <w:p>
-      <w:pPr>
-        <w:pStyle w:val="BodyText"/>
-      </w:pPr>
-      <w:r>
-        <w:t>Secondary data will be collected from ward offices, local government records, census reports, books, journals, published reports, and other relevant documents related to migration.</w:t>
+        <w:rPr>
+          <w:rFonts w:ascii="Times New Roman" w:hAnsi="Times New Roman" w:cs="Times New Roman"/>
+          <w:kern w:val="0"/>
+          <w:lang w:bidi="ne-NP"/>
+        </w:rPr>
+        <w:t>The table shows that the number of sampled migrant households varied across the years. The highest number of households, 16, migrated in 2082, followed by 14 households in 2079 and 12 households in 2078. The lowest number was recorded in 2077, with 2 households. Overall, 89 households were included in the study.</w:t>
       </w:r>
     </w:p>
     <w:p>
       <w:pPr>
         <w:pStyle w:val="Heading2"/>
+        <w:numPr>
+          <w:ilvl w:val="1"/>
+          <w:numId w:val="12"/>
+        </w:numPr>
+        <w:ind w:left="360"/>
       </w:pPr>
-      <w:bookmarkStart w:id="21" w:name="_Toc230102589"/>
       <w:r>
         <w:softHyphen/>
       </w:r>
-      <w:r>
-        <w:t xml:space="preserve"> </w:t>
-      </w:r>
-      <w:r>
-        <w:t>3.3</w:t>
-      </w:r>
-      <w:r>
-        <w:t xml:space="preserve"> </w:t>
-      </w:r>
-      <w:r>
-        <w:t>Population and Sampling</w:t>
-      </w:r>
       <w:bookmarkEnd w:id="21"/>
+      <w:r>
+        <w:t>Questionnaire Design</w:t>
+      </w:r>
     </w:p>
     <w:p>
       <w:pPr>
-        <w:pStyle w:val="BodyText"/>
+        <w:jc w:val="both"/>
+        <w:rPr>
+          <w:rFonts w:ascii="Times New Roman" w:hAnsi="Times New Roman" w:cs="Times New Roman"/>
+          <w:kern w:val="0"/>
+          <w:lang w:bidi="ne-NP"/>
+        </w:rPr>
       </w:pPr>
       <w:r>
-        <w:t xml:space="preserve">The study population consisted of two categories of respondents: migrant households and local resident households of </w:t>
-      </w:r>
-      <w:proofErr w:type="spellStart"/>
-      <w:r>
-        <w:t>Shankharapur</w:t>
-      </w:r>
-      <w:proofErr w:type="spellEnd"/>
-      <w:r>
-        <w:t xml:space="preserve"> Municipality Ward No. 9.</w:t>
-      </w:r>
-    </w:p>
-    <w:p>
-      <w:pPr>
-        <w:pStyle w:val="BodyText"/>
-      </w:pPr>
-      <w:r>
-        <w:t xml:space="preserve">For the study of the causes of migration, migrant households residing in Ward No. 9 were considered as the primary respondents. According to the ward profile (2082 BS), a total of 83 migrant households had migrated into the ward between 2074 BS and 2082 BS. Since </w:t>
-      </w:r>
-      <w:r>
-        <w:lastRenderedPageBreak/>
-        <w:t>the total migrant households were relatively small and fully identifiable through ward records, the study adopted a census method to include all 83 migrant households in the survey.</w:t>
-      </w:r>
-    </w:p>
-    <w:p>
-      <w:pPr>
-        <w:pStyle w:val="BodyText"/>
-      </w:pPr>
-      <w:r>
-        <w:t>For the study of the consequences of migration, local resident households of Ward No. 9 were considered as respondents because the impacts of migration such as pressure on infrastructure, population density, competition, pollution, and social change are experienced by the wider community. Since the number of local households was comparatively large, a sample survey method was adopted.</w:t>
+        <w:rPr>
+          <w:rFonts w:ascii="Times New Roman" w:hAnsi="Times New Roman" w:cs="Times New Roman"/>
+          <w:kern w:val="0"/>
+          <w:lang w:bidi="ne-NP"/>
+        </w:rPr>
+        <w:t xml:space="preserve">Questionnaires were designed in such a way that it produces all required data needed to fulfill the objectives of the study. Questionnaires are in three sections those are household questionnaire and questionnaire related to causes and consequences of in migration but mainly household questionnaire are used for analysis. </w:t>
       </w:r>
     </w:p>
     <w:p>
       <w:pPr>
         <w:pStyle w:val="Heading2"/>
+        <w:numPr>
+          <w:ilvl w:val="1"/>
+          <w:numId w:val="12"/>
+        </w:numPr>
       </w:pPr>
-      <w:bookmarkStart w:id="22" w:name="_Toc230102590"/>
-      <w:r>
-        <w:t xml:space="preserve">3.3.1 </w:t>
-      </w:r>
-      <w:r>
-        <w:rPr>
-          <w:rStyle w:val="Strong"/>
-          <w:b/>
-          <w:bCs w:val="0"/>
-        </w:rPr>
-        <w:t>Sample Size Determination</w:t>
-      </w:r>
-      <w:bookmarkEnd w:id="22"/>
+      <w:r>
+        <w:lastRenderedPageBreak/>
+        <w:t xml:space="preserve">Data Collection and Processing </w:t>
+      </w:r>
     </w:p>
     <w:p>
       <w:pPr>
-        <w:pStyle w:val="BodyText"/>
+        <w:jc w:val="both"/>
+        <w:rPr>
+          <w:rFonts w:ascii="Times New Roman" w:hAnsi="Times New Roman" w:cs="Times New Roman"/>
+          <w:kern w:val="0"/>
+          <w:lang w:bidi="ne-NP"/>
+        </w:rPr>
       </w:pPr>
       <w:r>
-        <w:t>The study was conducted in a small ward where the total number of households that experienced migration over the last ten years was 83. Since the population size was relatively small and fully identifiable through ward-level records, a census approach was considered more appropriate than selecting a sample using statistical formulas.</w:t>
-      </w:r>
-    </w:p>
-    <w:p>
-      <w:pPr>
-        <w:pStyle w:val="BodyText"/>
-      </w:pPr>
-      <w:r>
-        <w:t>This study adopted two different approaches for sample size determination based on the nature of the objectives.</w:t>
-      </w:r>
-    </w:p>
-    <w:p>
-      <w:pPr>
-        <w:pStyle w:val="BodyText"/>
-      </w:pPr>
-      <w:r>
-        <w:t xml:space="preserve">For examining the causes of migration, the study used a census method. According to the ward profile of </w:t>
-      </w:r>
-      <w:proofErr w:type="spellStart"/>
-      <w:r>
-        <w:t>Shankharapur</w:t>
-      </w:r>
-      <w:proofErr w:type="spellEnd"/>
-      <w:r>
-        <w:t xml:space="preserve"> Municipality Ward No. 9, there were only 83 migrant households that had migrated into the ward between 2074 BS and 2082 BS. Since the population size was small, manageable, and completely identifiable, all 83 migrant households were included in the study. The census method ensured complete representation of the migrant population and eliminated sampling error.</w:t>
-      </w:r>
-    </w:p>
-    <w:p>
-      <w:pPr>
-        <w:pStyle w:val="BodyText"/>
-      </w:pPr>
-      <w:r>
-        <w:t xml:space="preserve">However, for examining the consequences of migration on the local community, a sample survey method was adopted among local resident households. Since the number of local households was relatively large, </w:t>
-      </w:r>
-      <w:r>
-        <w:t xml:space="preserve">#TODO </w:t>
-      </w:r>
-      <w:r>
-        <w:t>Yamane’s formula was used to determine an appropriate sample size.</w:t>
-      </w:r>
-    </w:p>
-    <w:p>
-      <w:pPr>
-        <w:pStyle w:val="BodyText"/>
-      </w:pPr>
-      <w:r>
-        <w:t>The Yamane formula is expressed as:</w:t>
-      </w:r>
-    </w:p>
-    <w:p>
-      <w:pPr>
-        <w:pStyle w:val="BodyText"/>
-      </w:pPr>
-      <w:r>
-        <w:t>n = N / (1 + N(e)^2)</w:t>
-      </w:r>
-    </w:p>
-    <w:p>
-      <w:pPr>
-        <w:pStyle w:val="BodyText"/>
-      </w:pPr>
-      <w:r>
-        <w:lastRenderedPageBreak/>
-        <w:t>Where:</w:t>
-      </w:r>
-    </w:p>
-    <w:p>
-      <w:pPr>
-        <w:pStyle w:val="BodyText"/>
-      </w:pPr>
-      <w:r>
-        <w:t>n = required sample size</w:t>
-      </w:r>
-    </w:p>
-    <w:p>
-      <w:pPr>
-        <w:pStyle w:val="BodyText"/>
-      </w:pPr>
-      <w:r>
-        <w:t>N = total population size</w:t>
-      </w:r>
-    </w:p>
-    <w:p>
-      <w:pPr>
-        <w:pStyle w:val="BodyText"/>
-      </w:pPr>
-      <w:r>
-        <w:t>e = margin of error</w:t>
-      </w:r>
-    </w:p>
-    <w:p>
-      <w:pPr>
-        <w:pStyle w:val="BodyText"/>
-      </w:pPr>
-      <w:r>
-        <w:t>The study used a 95 percent confidence level and 5 percent margin of error for determining the sample size.</w:t>
-      </w:r>
-    </w:p>
-    <w:p>
-      <w:pPr>
-        <w:pStyle w:val="BodyText"/>
-      </w:pPr>
-      <w:r>
-        <w:t>Yamane’s formula was selected because it is simple, reliable, and appropriate when the total population size is known. It is widely used in social science research for finite populations where complete enumeration is not feasible.</w:t>
-      </w:r>
-    </w:p>
-    <w:p>
-      <w:pPr>
-        <w:pStyle w:val="BodyText"/>
-      </w:pPr>
-      <w:r>
-        <w:t>Sample size population:</w:t>
-      </w:r>
-    </w:p>
-    <w:tbl>
-      <w:tblPr>
-        <w:tblW w:w="2246" w:type="dxa"/>
-        <w:tblLook w:val="04A0" w:firstRow="1" w:lastRow="0" w:firstColumn="1" w:lastColumn="0" w:noHBand="0" w:noVBand="1"/>
-      </w:tblPr>
-      <w:tblGrid>
-        <w:gridCol w:w="960"/>
-        <w:gridCol w:w="1286"/>
-      </w:tblGrid>
-      <w:tr>
-        <w:trPr>
-          <w:trHeight w:val="288"/>
-        </w:trPr>
-        <w:tc>
-          <w:tcPr>
-            <w:tcW w:w="960" w:type="dxa"/>
-            <w:tcBorders>
-              <w:top w:val="single" w:sz="4" w:space="0" w:color="auto"/>
-              <w:left w:val="single" w:sz="4" w:space="0" w:color="auto"/>
-              <w:bottom w:val="single" w:sz="4" w:space="0" w:color="auto"/>
-              <w:right w:val="single" w:sz="4" w:space="0" w:color="auto"/>
-            </w:tcBorders>
-            <w:noWrap/>
-            <w:vAlign w:val="bottom"/>
-            <w:hideMark/>
-          </w:tcPr>
-          <w:p>
-            <w:pPr>
-              <w:spacing w:after="0" w:line="240" w:lineRule="auto"/>
-              <w:rPr>
-                <w:rFonts w:ascii="Calibri" w:eastAsia="Times New Roman" w:hAnsi="Calibri" w:cs="Calibri"/>
-                <w:b/>
-                <w:bCs/>
-                <w:color w:val="000000"/>
-                <w:kern w:val="0"/>
-                <w:sz w:val="22"/>
-                <w:szCs w:val="22"/>
-                <w:lang w:val="en-GB" w:eastAsia="en-GB" w:bidi="ne-NP"/>
-                <w14:ligatures w14:val="none"/>
-              </w:rPr>
-            </w:pPr>
-            <w:r>
-              <w:rPr>
-                <w:rFonts w:ascii="Calibri" w:eastAsia="Times New Roman" w:hAnsi="Calibri" w:cs="Calibri"/>
-                <w:b/>
-                <w:bCs/>
-                <w:color w:val="000000"/>
-                <w:kern w:val="0"/>
-                <w:sz w:val="22"/>
-                <w:szCs w:val="22"/>
-                <w:lang w:val="en-GB" w:eastAsia="en-GB" w:bidi="ne-NP"/>
-                <w14:ligatures w14:val="none"/>
-              </w:rPr>
-              <w:t>Years</w:t>
-            </w:r>
-          </w:p>
-        </w:tc>
-        <w:tc>
-          <w:tcPr>
-            <w:tcW w:w="1286" w:type="dxa"/>
-            <w:tcBorders>
-              <w:top w:val="single" w:sz="4" w:space="0" w:color="auto"/>
-              <w:left w:val="nil"/>
-              <w:bottom w:val="single" w:sz="4" w:space="0" w:color="auto"/>
-              <w:right w:val="single" w:sz="4" w:space="0" w:color="auto"/>
-            </w:tcBorders>
-            <w:noWrap/>
-            <w:vAlign w:val="bottom"/>
-            <w:hideMark/>
-          </w:tcPr>
-          <w:p>
-            <w:pPr>
-              <w:spacing w:after="0" w:line="240" w:lineRule="auto"/>
-              <w:rPr>
-                <w:rFonts w:ascii="Calibri" w:eastAsia="Times New Roman" w:hAnsi="Calibri" w:cs="Calibri"/>
-                <w:b/>
-                <w:bCs/>
-                <w:color w:val="000000"/>
-                <w:kern w:val="0"/>
-                <w:sz w:val="22"/>
-                <w:szCs w:val="22"/>
-                <w:lang w:val="en-GB" w:eastAsia="en-GB" w:bidi="ne-NP"/>
-                <w14:ligatures w14:val="none"/>
-              </w:rPr>
-            </w:pPr>
-            <w:r>
-              <w:rPr>
-                <w:rFonts w:ascii="Calibri" w:eastAsia="Times New Roman" w:hAnsi="Calibri" w:cs="Calibri"/>
-                <w:b/>
-                <w:bCs/>
-                <w:color w:val="000000"/>
-                <w:kern w:val="0"/>
-                <w:sz w:val="22"/>
-                <w:szCs w:val="22"/>
-                <w:lang w:val="en-GB" w:eastAsia="en-GB" w:bidi="ne-NP"/>
-                <w14:ligatures w14:val="none"/>
-              </w:rPr>
-              <w:t>Households</w:t>
-            </w:r>
-          </w:p>
-        </w:tc>
-      </w:tr>
-      <w:tr>
-        <w:trPr>
-          <w:trHeight w:val="288"/>
-        </w:trPr>
-        <w:tc>
-          <w:tcPr>
-            <w:tcW w:w="960" w:type="dxa"/>
-            <w:tcBorders>
-              <w:top w:val="nil"/>
-              <w:left w:val="single" w:sz="4" w:space="0" w:color="auto"/>
-              <w:bottom w:val="single" w:sz="4" w:space="0" w:color="auto"/>
-              <w:right w:val="single" w:sz="4" w:space="0" w:color="auto"/>
-            </w:tcBorders>
-            <w:noWrap/>
-            <w:vAlign w:val="bottom"/>
-            <w:hideMark/>
-          </w:tcPr>
-          <w:p>
-            <w:pPr>
-              <w:spacing w:after="0" w:line="240" w:lineRule="auto"/>
-              <w:jc w:val="right"/>
-              <w:rPr>
-                <w:rFonts w:ascii="Calibri" w:eastAsia="Times New Roman" w:hAnsi="Calibri" w:cs="Calibri"/>
-                <w:color w:val="000000"/>
-                <w:kern w:val="0"/>
-                <w:sz w:val="22"/>
-                <w:szCs w:val="22"/>
-                <w:lang w:val="en-GB" w:eastAsia="en-GB" w:bidi="ne-NP"/>
-                <w14:ligatures w14:val="none"/>
-              </w:rPr>
-            </w:pPr>
-            <w:r>
-              <w:rPr>
-                <w:rFonts w:ascii="Calibri" w:eastAsia="Times New Roman" w:hAnsi="Calibri" w:cs="Calibri"/>
-                <w:color w:val="000000"/>
-                <w:kern w:val="0"/>
-                <w:sz w:val="22"/>
-                <w:szCs w:val="22"/>
-                <w:lang w:val="en-GB" w:eastAsia="en-GB" w:bidi="ne-NP"/>
-                <w14:ligatures w14:val="none"/>
-              </w:rPr>
-              <w:t>2083</w:t>
-            </w:r>
-          </w:p>
-        </w:tc>
-        <w:tc>
-          <w:tcPr>
-            <w:tcW w:w="1286" w:type="dxa"/>
-            <w:tcBorders>
-              <w:top w:val="nil"/>
-              <w:left w:val="nil"/>
-              <w:bottom w:val="single" w:sz="4" w:space="0" w:color="auto"/>
-              <w:right w:val="single" w:sz="4" w:space="0" w:color="auto"/>
-            </w:tcBorders>
-            <w:noWrap/>
-            <w:vAlign w:val="bottom"/>
-            <w:hideMark/>
-          </w:tcPr>
-          <w:p>
-            <w:pPr>
-              <w:spacing w:after="0" w:line="240" w:lineRule="auto"/>
-              <w:jc w:val="right"/>
-              <w:rPr>
-                <w:rFonts w:ascii="Calibri" w:eastAsia="Times New Roman" w:hAnsi="Calibri" w:cs="Calibri"/>
-                <w:color w:val="000000"/>
-                <w:kern w:val="0"/>
-                <w:sz w:val="22"/>
-                <w:szCs w:val="22"/>
-                <w:lang w:val="en-GB" w:eastAsia="en-GB" w:bidi="ne-NP"/>
-                <w14:ligatures w14:val="none"/>
-              </w:rPr>
-            </w:pPr>
-            <w:r>
-              <w:rPr>
-                <w:rFonts w:ascii="Calibri" w:eastAsia="Times New Roman" w:hAnsi="Calibri" w:cs="Calibri"/>
-                <w:color w:val="000000"/>
-                <w:kern w:val="0"/>
-                <w:sz w:val="22"/>
-                <w:szCs w:val="22"/>
-                <w:lang w:val="en-GB" w:eastAsia="en-GB" w:bidi="ne-NP"/>
-                <w14:ligatures w14:val="none"/>
-              </w:rPr>
-              <w:t>3</w:t>
-            </w:r>
-          </w:p>
-        </w:tc>
-      </w:tr>
-      <w:tr>
-        <w:trPr>
-          <w:trHeight w:val="288"/>
-        </w:trPr>
-        <w:tc>
-          <w:tcPr>
-            <w:tcW w:w="960" w:type="dxa"/>
-            <w:tcBorders>
-              <w:top w:val="nil"/>
-              <w:left w:val="single" w:sz="4" w:space="0" w:color="auto"/>
-              <w:bottom w:val="single" w:sz="4" w:space="0" w:color="auto"/>
-              <w:right w:val="single" w:sz="4" w:space="0" w:color="auto"/>
-            </w:tcBorders>
-            <w:noWrap/>
-            <w:vAlign w:val="bottom"/>
-            <w:hideMark/>
-          </w:tcPr>
-          <w:p>
-            <w:pPr>
-              <w:spacing w:after="0" w:line="240" w:lineRule="auto"/>
-              <w:jc w:val="right"/>
-              <w:rPr>
-                <w:rFonts w:ascii="Calibri" w:eastAsia="Times New Roman" w:hAnsi="Calibri" w:cs="Calibri"/>
-                <w:color w:val="000000"/>
-                <w:kern w:val="0"/>
-                <w:sz w:val="22"/>
-                <w:szCs w:val="22"/>
-                <w:lang w:val="en-GB" w:eastAsia="en-GB" w:bidi="ne-NP"/>
-                <w14:ligatures w14:val="none"/>
-              </w:rPr>
-            </w:pPr>
-            <w:r>
-              <w:rPr>
-                <w:rFonts w:ascii="Calibri" w:eastAsia="Times New Roman" w:hAnsi="Calibri" w:cs="Calibri"/>
-                <w:color w:val="000000"/>
-                <w:kern w:val="0"/>
-                <w:sz w:val="22"/>
-                <w:szCs w:val="22"/>
-                <w:lang w:val="en-GB" w:eastAsia="en-GB" w:bidi="ne-NP"/>
-                <w14:ligatures w14:val="none"/>
-              </w:rPr>
-              <w:t>2082</w:t>
-            </w:r>
-          </w:p>
-        </w:tc>
-        <w:tc>
-          <w:tcPr>
-            <w:tcW w:w="1286" w:type="dxa"/>
-            <w:tcBorders>
-              <w:top w:val="nil"/>
-              <w:left w:val="nil"/>
-              <w:bottom w:val="single" w:sz="4" w:space="0" w:color="auto"/>
-              <w:right w:val="single" w:sz="4" w:space="0" w:color="auto"/>
-            </w:tcBorders>
-            <w:noWrap/>
-            <w:vAlign w:val="bottom"/>
-            <w:hideMark/>
-          </w:tcPr>
-          <w:p>
-            <w:pPr>
-              <w:spacing w:after="0" w:line="240" w:lineRule="auto"/>
-              <w:jc w:val="right"/>
-              <w:rPr>
-                <w:rFonts w:ascii="Calibri" w:eastAsia="Times New Roman" w:hAnsi="Calibri" w:cs="Calibri"/>
-                <w:color w:val="000000"/>
-                <w:kern w:val="0"/>
-                <w:sz w:val="22"/>
-                <w:szCs w:val="22"/>
-                <w:lang w:val="en-GB" w:eastAsia="en-GB" w:bidi="ne-NP"/>
-                <w14:ligatures w14:val="none"/>
-              </w:rPr>
-            </w:pPr>
-            <w:r>
-              <w:rPr>
-                <w:rFonts w:ascii="Calibri" w:eastAsia="Times New Roman" w:hAnsi="Calibri" w:cs="Calibri"/>
-                <w:color w:val="000000"/>
-                <w:kern w:val="0"/>
-                <w:sz w:val="22"/>
-                <w:szCs w:val="22"/>
-                <w:lang w:val="en-GB" w:eastAsia="en-GB" w:bidi="ne-NP"/>
-                <w14:ligatures w14:val="none"/>
-              </w:rPr>
-              <w:t>16</w:t>
-            </w:r>
-          </w:p>
-        </w:tc>
-      </w:tr>
-      <w:tr>
-        <w:trPr>
-          <w:trHeight w:val="288"/>
-        </w:trPr>
-        <w:tc>
-          <w:tcPr>
-            <w:tcW w:w="960" w:type="dxa"/>
-            <w:tcBorders>
-              <w:top w:val="nil"/>
-              <w:left w:val="single" w:sz="4" w:space="0" w:color="auto"/>
-              <w:bottom w:val="single" w:sz="4" w:space="0" w:color="auto"/>
-              <w:right w:val="single" w:sz="4" w:space="0" w:color="auto"/>
-            </w:tcBorders>
-            <w:noWrap/>
-            <w:vAlign w:val="bottom"/>
-            <w:hideMark/>
-          </w:tcPr>
-          <w:p>
-            <w:pPr>
-              <w:spacing w:after="0" w:line="240" w:lineRule="auto"/>
-              <w:jc w:val="right"/>
-              <w:rPr>
-                <w:rFonts w:ascii="Calibri" w:eastAsia="Times New Roman" w:hAnsi="Calibri" w:cs="Calibri"/>
-                <w:color w:val="000000"/>
-                <w:kern w:val="0"/>
-                <w:sz w:val="22"/>
-                <w:szCs w:val="22"/>
-                <w:lang w:val="en-GB" w:eastAsia="en-GB" w:bidi="ne-NP"/>
-                <w14:ligatures w14:val="none"/>
-              </w:rPr>
-            </w:pPr>
-            <w:r>
-              <w:rPr>
-                <w:rFonts w:ascii="Calibri" w:eastAsia="Times New Roman" w:hAnsi="Calibri" w:cs="Calibri"/>
-                <w:color w:val="000000"/>
-                <w:kern w:val="0"/>
-                <w:sz w:val="22"/>
-                <w:szCs w:val="22"/>
-                <w:lang w:val="en-GB" w:eastAsia="en-GB" w:bidi="ne-NP"/>
-                <w14:ligatures w14:val="none"/>
-              </w:rPr>
-              <w:t>2081</w:t>
-            </w:r>
-          </w:p>
-        </w:tc>
-        <w:tc>
-          <w:tcPr>
-            <w:tcW w:w="1286" w:type="dxa"/>
-            <w:tcBorders>
-              <w:top w:val="nil"/>
-              <w:left w:val="nil"/>
-              <w:bottom w:val="single" w:sz="4" w:space="0" w:color="auto"/>
-              <w:right w:val="single" w:sz="4" w:space="0" w:color="auto"/>
-            </w:tcBorders>
-            <w:noWrap/>
-            <w:vAlign w:val="bottom"/>
-            <w:hideMark/>
-          </w:tcPr>
-          <w:p>
-            <w:pPr>
-              <w:spacing w:after="0" w:line="240" w:lineRule="auto"/>
-              <w:jc w:val="right"/>
-              <w:rPr>
-                <w:rFonts w:ascii="Calibri" w:eastAsia="Times New Roman" w:hAnsi="Calibri" w:cs="Calibri"/>
-                <w:color w:val="000000"/>
-                <w:kern w:val="0"/>
-                <w:sz w:val="22"/>
-                <w:szCs w:val="22"/>
-                <w:lang w:val="en-GB" w:eastAsia="en-GB" w:bidi="ne-NP"/>
-                <w14:ligatures w14:val="none"/>
-              </w:rPr>
-            </w:pPr>
-            <w:r>
-              <w:rPr>
-                <w:rFonts w:ascii="Calibri" w:eastAsia="Times New Roman" w:hAnsi="Calibri" w:cs="Calibri"/>
-                <w:color w:val="000000"/>
-                <w:kern w:val="0"/>
-                <w:sz w:val="22"/>
-                <w:szCs w:val="22"/>
-                <w:lang w:val="en-GB" w:eastAsia="en-GB" w:bidi="ne-NP"/>
-                <w14:ligatures w14:val="none"/>
-              </w:rPr>
-              <w:t>11</w:t>
-            </w:r>
-          </w:p>
-        </w:tc>
-      </w:tr>
-      <w:tr>
-        <w:trPr>
-          <w:trHeight w:val="288"/>
-        </w:trPr>
-        <w:tc>
-          <w:tcPr>
-            <w:tcW w:w="960" w:type="dxa"/>
-            <w:tcBorders>
-              <w:top w:val="nil"/>
-              <w:left w:val="single" w:sz="4" w:space="0" w:color="auto"/>
-              <w:bottom w:val="single" w:sz="4" w:space="0" w:color="auto"/>
-              <w:right w:val="single" w:sz="4" w:space="0" w:color="auto"/>
-            </w:tcBorders>
-            <w:noWrap/>
-            <w:vAlign w:val="bottom"/>
-            <w:hideMark/>
-          </w:tcPr>
-          <w:p>
-            <w:pPr>
-              <w:spacing w:after="0" w:line="240" w:lineRule="auto"/>
-              <w:jc w:val="right"/>
-              <w:rPr>
-                <w:rFonts w:ascii="Calibri" w:eastAsia="Times New Roman" w:hAnsi="Calibri" w:cs="Calibri"/>
-                <w:color w:val="000000"/>
-                <w:kern w:val="0"/>
-                <w:sz w:val="22"/>
-                <w:szCs w:val="22"/>
-                <w:lang w:val="en-GB" w:eastAsia="en-GB" w:bidi="ne-NP"/>
-                <w14:ligatures w14:val="none"/>
-              </w:rPr>
-            </w:pPr>
-            <w:r>
-              <w:rPr>
-                <w:rFonts w:ascii="Calibri" w:eastAsia="Times New Roman" w:hAnsi="Calibri" w:cs="Calibri"/>
-                <w:color w:val="000000"/>
-                <w:kern w:val="0"/>
-                <w:sz w:val="22"/>
-                <w:szCs w:val="22"/>
-                <w:lang w:val="en-GB" w:eastAsia="en-GB" w:bidi="ne-NP"/>
-                <w14:ligatures w14:val="none"/>
-              </w:rPr>
-              <w:t>2080</w:t>
-            </w:r>
-          </w:p>
-        </w:tc>
-        <w:tc>
-          <w:tcPr>
-            <w:tcW w:w="1286" w:type="dxa"/>
-            <w:tcBorders>
-              <w:top w:val="nil"/>
-              <w:left w:val="nil"/>
-              <w:bottom w:val="single" w:sz="4" w:space="0" w:color="auto"/>
-              <w:right w:val="single" w:sz="4" w:space="0" w:color="auto"/>
-            </w:tcBorders>
-            <w:noWrap/>
-            <w:vAlign w:val="bottom"/>
-            <w:hideMark/>
-          </w:tcPr>
-          <w:p>
-            <w:pPr>
-              <w:spacing w:after="0" w:line="240" w:lineRule="auto"/>
-              <w:jc w:val="right"/>
-              <w:rPr>
-                <w:rFonts w:ascii="Calibri" w:eastAsia="Times New Roman" w:hAnsi="Calibri" w:cs="Calibri"/>
-                <w:color w:val="000000"/>
-                <w:kern w:val="0"/>
-                <w:sz w:val="22"/>
-                <w:szCs w:val="22"/>
-                <w:lang w:val="en-GB" w:eastAsia="en-GB" w:bidi="ne-NP"/>
-                <w14:ligatures w14:val="none"/>
-              </w:rPr>
-            </w:pPr>
-            <w:r>
-              <w:rPr>
-                <w:rFonts w:ascii="Calibri" w:eastAsia="Times New Roman" w:hAnsi="Calibri" w:cs="Calibri"/>
-                <w:color w:val="000000"/>
-                <w:kern w:val="0"/>
-                <w:sz w:val="22"/>
-                <w:szCs w:val="22"/>
-                <w:lang w:val="en-GB" w:eastAsia="en-GB" w:bidi="ne-NP"/>
-                <w14:ligatures w14:val="none"/>
-              </w:rPr>
-              <w:t>9</w:t>
-            </w:r>
-          </w:p>
-        </w:tc>
-      </w:tr>
-      <w:tr>
-        <w:trPr>
-          <w:trHeight w:val="288"/>
-        </w:trPr>
-        <w:tc>
-          <w:tcPr>
-            <w:tcW w:w="960" w:type="dxa"/>
-            <w:tcBorders>
-              <w:top w:val="nil"/>
-              <w:left w:val="single" w:sz="4" w:space="0" w:color="auto"/>
-              <w:bottom w:val="single" w:sz="4" w:space="0" w:color="auto"/>
-              <w:right w:val="single" w:sz="4" w:space="0" w:color="auto"/>
-            </w:tcBorders>
-            <w:noWrap/>
-            <w:vAlign w:val="bottom"/>
-            <w:hideMark/>
-          </w:tcPr>
-          <w:p>
-            <w:pPr>
-              <w:spacing w:after="0" w:line="240" w:lineRule="auto"/>
-              <w:jc w:val="right"/>
-              <w:rPr>
-                <w:rFonts w:ascii="Calibri" w:eastAsia="Times New Roman" w:hAnsi="Calibri" w:cs="Calibri"/>
-                <w:color w:val="000000"/>
-                <w:kern w:val="0"/>
-                <w:sz w:val="22"/>
-                <w:szCs w:val="22"/>
-                <w:lang w:val="en-GB" w:eastAsia="en-GB" w:bidi="ne-NP"/>
-                <w14:ligatures w14:val="none"/>
-              </w:rPr>
-            </w:pPr>
-            <w:r>
-              <w:rPr>
-                <w:rFonts w:ascii="Calibri" w:eastAsia="Times New Roman" w:hAnsi="Calibri" w:cs="Calibri"/>
-                <w:color w:val="000000"/>
-                <w:kern w:val="0"/>
-                <w:sz w:val="22"/>
-                <w:szCs w:val="22"/>
-                <w:lang w:val="en-GB" w:eastAsia="en-GB" w:bidi="ne-NP"/>
-                <w14:ligatures w14:val="none"/>
-              </w:rPr>
-              <w:t>2079</w:t>
-            </w:r>
-          </w:p>
-        </w:tc>
-        <w:tc>
-          <w:tcPr>
-            <w:tcW w:w="1286" w:type="dxa"/>
-            <w:tcBorders>
-              <w:top w:val="nil"/>
-              <w:left w:val="nil"/>
-              <w:bottom w:val="single" w:sz="4" w:space="0" w:color="auto"/>
-              <w:right w:val="single" w:sz="4" w:space="0" w:color="auto"/>
-            </w:tcBorders>
-            <w:noWrap/>
-            <w:vAlign w:val="bottom"/>
-            <w:hideMark/>
-          </w:tcPr>
-          <w:p>
-            <w:pPr>
-              <w:spacing w:after="0" w:line="240" w:lineRule="auto"/>
-              <w:jc w:val="right"/>
-              <w:rPr>
-                <w:rFonts w:ascii="Calibri" w:eastAsia="Times New Roman" w:hAnsi="Calibri" w:cs="Calibri"/>
-                <w:color w:val="000000"/>
-                <w:kern w:val="0"/>
-                <w:sz w:val="22"/>
-                <w:szCs w:val="22"/>
-                <w:lang w:val="en-GB" w:eastAsia="en-GB" w:bidi="ne-NP"/>
-                <w14:ligatures w14:val="none"/>
-              </w:rPr>
-            </w:pPr>
-            <w:r>
-              <w:rPr>
-                <w:rFonts w:ascii="Calibri" w:eastAsia="Times New Roman" w:hAnsi="Calibri" w:cs="Calibri"/>
-                <w:color w:val="000000"/>
-                <w:kern w:val="0"/>
-                <w:sz w:val="22"/>
-                <w:szCs w:val="22"/>
-                <w:lang w:val="en-GB" w:eastAsia="en-GB" w:bidi="ne-NP"/>
-                <w14:ligatures w14:val="none"/>
-              </w:rPr>
-              <w:t>14</w:t>
-            </w:r>
-          </w:p>
-        </w:tc>
-      </w:tr>
-      <w:tr>
-        <w:trPr>
-          <w:trHeight w:val="288"/>
-        </w:trPr>
-        <w:tc>
-          <w:tcPr>
-            <w:tcW w:w="960" w:type="dxa"/>
-            <w:tcBorders>
-              <w:top w:val="nil"/>
-              <w:left w:val="single" w:sz="4" w:space="0" w:color="auto"/>
-              <w:bottom w:val="single" w:sz="4" w:space="0" w:color="auto"/>
-              <w:right w:val="single" w:sz="4" w:space="0" w:color="auto"/>
-            </w:tcBorders>
-            <w:noWrap/>
-            <w:vAlign w:val="bottom"/>
-            <w:hideMark/>
-          </w:tcPr>
-          <w:p>
-            <w:pPr>
-              <w:spacing w:after="0" w:line="240" w:lineRule="auto"/>
-              <w:jc w:val="right"/>
-              <w:rPr>
-                <w:rFonts w:ascii="Calibri" w:eastAsia="Times New Roman" w:hAnsi="Calibri" w:cs="Calibri"/>
-                <w:color w:val="000000"/>
-                <w:kern w:val="0"/>
-                <w:sz w:val="22"/>
-                <w:szCs w:val="22"/>
-                <w:lang w:val="en-GB" w:eastAsia="en-GB" w:bidi="ne-NP"/>
-                <w14:ligatures w14:val="none"/>
-              </w:rPr>
-            </w:pPr>
-            <w:r>
-              <w:rPr>
-                <w:rFonts w:ascii="Calibri" w:eastAsia="Times New Roman" w:hAnsi="Calibri" w:cs="Calibri"/>
-                <w:color w:val="000000"/>
-                <w:kern w:val="0"/>
-                <w:sz w:val="22"/>
-                <w:szCs w:val="22"/>
-                <w:lang w:val="en-GB" w:eastAsia="en-GB" w:bidi="ne-NP"/>
-                <w14:ligatures w14:val="none"/>
-              </w:rPr>
-              <w:t>2078</w:t>
-            </w:r>
-          </w:p>
-        </w:tc>
-        <w:tc>
-          <w:tcPr>
-            <w:tcW w:w="1286" w:type="dxa"/>
-            <w:tcBorders>
-              <w:top w:val="nil"/>
-              <w:left w:val="nil"/>
-              <w:bottom w:val="single" w:sz="4" w:space="0" w:color="auto"/>
-              <w:right w:val="single" w:sz="4" w:space="0" w:color="auto"/>
-            </w:tcBorders>
-            <w:noWrap/>
-            <w:vAlign w:val="bottom"/>
-            <w:hideMark/>
-          </w:tcPr>
-          <w:p>
-            <w:pPr>
-              <w:spacing w:after="0" w:line="240" w:lineRule="auto"/>
-              <w:jc w:val="right"/>
-              <w:rPr>
-                <w:rFonts w:ascii="Calibri" w:eastAsia="Times New Roman" w:hAnsi="Calibri" w:cs="Calibri"/>
-                <w:color w:val="000000"/>
-                <w:kern w:val="0"/>
-                <w:sz w:val="22"/>
-                <w:szCs w:val="22"/>
-                <w:lang w:val="en-GB" w:eastAsia="en-GB" w:bidi="ne-NP"/>
-                <w14:ligatures w14:val="none"/>
-              </w:rPr>
-            </w:pPr>
-            <w:r>
-              <w:rPr>
-                <w:rFonts w:ascii="Calibri" w:eastAsia="Times New Roman" w:hAnsi="Calibri" w:cs="Calibri"/>
-                <w:color w:val="000000"/>
-                <w:kern w:val="0"/>
-                <w:sz w:val="22"/>
-                <w:szCs w:val="22"/>
-                <w:lang w:val="en-GB" w:eastAsia="en-GB" w:bidi="ne-NP"/>
-                <w14:ligatures w14:val="none"/>
-              </w:rPr>
-              <w:t>12</w:t>
-            </w:r>
-          </w:p>
-        </w:tc>
-      </w:tr>
-      <w:tr>
-        <w:trPr>
-          <w:trHeight w:val="288"/>
-        </w:trPr>
-        <w:tc>
-          <w:tcPr>
-            <w:tcW w:w="960" w:type="dxa"/>
-            <w:tcBorders>
-              <w:top w:val="nil"/>
-              <w:left w:val="single" w:sz="4" w:space="0" w:color="auto"/>
-              <w:bottom w:val="single" w:sz="4" w:space="0" w:color="auto"/>
-              <w:right w:val="single" w:sz="4" w:space="0" w:color="auto"/>
-            </w:tcBorders>
-            <w:noWrap/>
-            <w:vAlign w:val="bottom"/>
-            <w:hideMark/>
-          </w:tcPr>
-          <w:p>
-            <w:pPr>
-              <w:spacing w:after="0" w:line="240" w:lineRule="auto"/>
-              <w:jc w:val="right"/>
-              <w:rPr>
-                <w:rFonts w:ascii="Calibri" w:eastAsia="Times New Roman" w:hAnsi="Calibri" w:cs="Calibri"/>
-                <w:color w:val="000000"/>
-                <w:kern w:val="0"/>
-                <w:sz w:val="22"/>
-                <w:szCs w:val="22"/>
-                <w:lang w:val="en-GB" w:eastAsia="en-GB" w:bidi="ne-NP"/>
-                <w14:ligatures w14:val="none"/>
-              </w:rPr>
-            </w:pPr>
-            <w:r>
-              <w:rPr>
-                <w:rFonts w:ascii="Calibri" w:eastAsia="Times New Roman" w:hAnsi="Calibri" w:cs="Calibri"/>
-                <w:color w:val="000000"/>
-                <w:kern w:val="0"/>
-                <w:sz w:val="22"/>
-                <w:szCs w:val="22"/>
-                <w:lang w:val="en-GB" w:eastAsia="en-GB" w:bidi="ne-NP"/>
-                <w14:ligatures w14:val="none"/>
-              </w:rPr>
-              <w:t>2077</w:t>
-            </w:r>
-          </w:p>
-        </w:tc>
-        <w:tc>
-          <w:tcPr>
-            <w:tcW w:w="1286" w:type="dxa"/>
-            <w:tcBorders>
-              <w:top w:val="nil"/>
-              <w:left w:val="nil"/>
-              <w:bottom w:val="single" w:sz="4" w:space="0" w:color="auto"/>
-              <w:right w:val="single" w:sz="4" w:space="0" w:color="auto"/>
-            </w:tcBorders>
-            <w:noWrap/>
-            <w:vAlign w:val="bottom"/>
-            <w:hideMark/>
-          </w:tcPr>
-          <w:p>
-            <w:pPr>
-              <w:spacing w:after="0" w:line="240" w:lineRule="auto"/>
-              <w:jc w:val="right"/>
-              <w:rPr>
-                <w:rFonts w:ascii="Calibri" w:eastAsia="Times New Roman" w:hAnsi="Calibri" w:cs="Calibri"/>
-                <w:color w:val="000000"/>
-                <w:kern w:val="0"/>
-                <w:sz w:val="22"/>
-                <w:szCs w:val="22"/>
-                <w:lang w:val="en-GB" w:eastAsia="en-GB" w:bidi="ne-NP"/>
-                <w14:ligatures w14:val="none"/>
-              </w:rPr>
-            </w:pPr>
-            <w:r>
-              <w:rPr>
-                <w:rFonts w:ascii="Calibri" w:eastAsia="Times New Roman" w:hAnsi="Calibri" w:cs="Calibri"/>
-                <w:color w:val="000000"/>
-                <w:kern w:val="0"/>
-                <w:sz w:val="22"/>
-                <w:szCs w:val="22"/>
-                <w:lang w:val="en-GB" w:eastAsia="en-GB" w:bidi="ne-NP"/>
-                <w14:ligatures w14:val="none"/>
-              </w:rPr>
-              <w:t>2</w:t>
-            </w:r>
-          </w:p>
-        </w:tc>
-      </w:tr>
-      <w:tr>
-        <w:trPr>
-          <w:trHeight w:val="288"/>
-        </w:trPr>
-        <w:tc>
-          <w:tcPr>
-            <w:tcW w:w="960" w:type="dxa"/>
-            <w:tcBorders>
-              <w:top w:val="nil"/>
-              <w:left w:val="single" w:sz="4" w:space="0" w:color="auto"/>
-              <w:bottom w:val="single" w:sz="4" w:space="0" w:color="auto"/>
-              <w:right w:val="single" w:sz="4" w:space="0" w:color="auto"/>
-            </w:tcBorders>
-            <w:noWrap/>
-            <w:vAlign w:val="bottom"/>
-            <w:hideMark/>
-          </w:tcPr>
-          <w:p>
-            <w:pPr>
-              <w:spacing w:after="0" w:line="240" w:lineRule="auto"/>
-              <w:jc w:val="right"/>
-              <w:rPr>
-                <w:rFonts w:ascii="Calibri" w:eastAsia="Times New Roman" w:hAnsi="Calibri" w:cs="Calibri"/>
-                <w:color w:val="000000"/>
-                <w:kern w:val="0"/>
-                <w:sz w:val="22"/>
-                <w:szCs w:val="22"/>
-                <w:lang w:val="en-GB" w:eastAsia="en-GB" w:bidi="ne-NP"/>
-                <w14:ligatures w14:val="none"/>
-              </w:rPr>
-            </w:pPr>
-            <w:r>
-              <w:rPr>
-                <w:rFonts w:ascii="Calibri" w:eastAsia="Times New Roman" w:hAnsi="Calibri" w:cs="Calibri"/>
-                <w:color w:val="000000"/>
-                <w:kern w:val="0"/>
-                <w:sz w:val="22"/>
-                <w:szCs w:val="22"/>
-                <w:lang w:val="en-GB" w:eastAsia="en-GB" w:bidi="ne-NP"/>
-                <w14:ligatures w14:val="none"/>
-              </w:rPr>
-              <w:t>2076</w:t>
-            </w:r>
-          </w:p>
-        </w:tc>
-        <w:tc>
-          <w:tcPr>
-            <w:tcW w:w="1286" w:type="dxa"/>
-            <w:tcBorders>
-              <w:top w:val="nil"/>
-              <w:left w:val="nil"/>
-              <w:bottom w:val="single" w:sz="4" w:space="0" w:color="auto"/>
-              <w:right w:val="single" w:sz="4" w:space="0" w:color="auto"/>
-            </w:tcBorders>
-            <w:noWrap/>
-            <w:vAlign w:val="bottom"/>
-            <w:hideMark/>
-          </w:tcPr>
-          <w:p>
-            <w:pPr>
-              <w:spacing w:after="0" w:line="240" w:lineRule="auto"/>
-              <w:jc w:val="right"/>
-              <w:rPr>
-                <w:rFonts w:ascii="Calibri" w:eastAsia="Times New Roman" w:hAnsi="Calibri" w:cs="Calibri"/>
-                <w:color w:val="000000"/>
-                <w:kern w:val="0"/>
-                <w:sz w:val="22"/>
-                <w:szCs w:val="22"/>
-                <w:lang w:val="en-GB" w:eastAsia="en-GB" w:bidi="ne-NP"/>
-                <w14:ligatures w14:val="none"/>
-              </w:rPr>
-            </w:pPr>
-            <w:r>
-              <w:rPr>
-                <w:rFonts w:ascii="Calibri" w:eastAsia="Times New Roman" w:hAnsi="Calibri" w:cs="Calibri"/>
-                <w:color w:val="000000"/>
-                <w:kern w:val="0"/>
-                <w:sz w:val="22"/>
-                <w:szCs w:val="22"/>
-                <w:lang w:val="en-GB" w:eastAsia="en-GB" w:bidi="ne-NP"/>
-                <w14:ligatures w14:val="none"/>
-              </w:rPr>
-              <w:t>8</w:t>
-            </w:r>
-          </w:p>
-        </w:tc>
-      </w:tr>
-      <w:tr>
-        <w:trPr>
-          <w:trHeight w:val="288"/>
-        </w:trPr>
-        <w:tc>
-          <w:tcPr>
-            <w:tcW w:w="960" w:type="dxa"/>
-            <w:tcBorders>
-              <w:top w:val="nil"/>
-              <w:left w:val="single" w:sz="4" w:space="0" w:color="auto"/>
-              <w:bottom w:val="single" w:sz="4" w:space="0" w:color="auto"/>
-              <w:right w:val="single" w:sz="4" w:space="0" w:color="auto"/>
-            </w:tcBorders>
-            <w:noWrap/>
-            <w:vAlign w:val="bottom"/>
-            <w:hideMark/>
-          </w:tcPr>
-          <w:p>
-            <w:pPr>
-              <w:spacing w:after="0" w:line="240" w:lineRule="auto"/>
-              <w:jc w:val="right"/>
-              <w:rPr>
-                <w:rFonts w:ascii="Calibri" w:eastAsia="Times New Roman" w:hAnsi="Calibri" w:cs="Calibri"/>
-                <w:color w:val="000000"/>
-                <w:kern w:val="0"/>
-                <w:sz w:val="22"/>
-                <w:szCs w:val="22"/>
-                <w:lang w:val="en-GB" w:eastAsia="en-GB" w:bidi="ne-NP"/>
-                <w14:ligatures w14:val="none"/>
-              </w:rPr>
-            </w:pPr>
-            <w:r>
-              <w:rPr>
-                <w:rFonts w:ascii="Calibri" w:eastAsia="Times New Roman" w:hAnsi="Calibri" w:cs="Calibri"/>
-                <w:color w:val="000000"/>
-                <w:kern w:val="0"/>
-                <w:sz w:val="22"/>
-                <w:szCs w:val="22"/>
-                <w:lang w:val="en-GB" w:eastAsia="en-GB" w:bidi="ne-NP"/>
-                <w14:ligatures w14:val="none"/>
-              </w:rPr>
-              <w:t>2075</w:t>
-            </w:r>
-          </w:p>
-        </w:tc>
-        <w:tc>
-          <w:tcPr>
-            <w:tcW w:w="1286" w:type="dxa"/>
-            <w:tcBorders>
-              <w:top w:val="nil"/>
-              <w:left w:val="nil"/>
-              <w:bottom w:val="single" w:sz="4" w:space="0" w:color="auto"/>
-              <w:right w:val="single" w:sz="4" w:space="0" w:color="auto"/>
-            </w:tcBorders>
-            <w:noWrap/>
-            <w:vAlign w:val="bottom"/>
-            <w:hideMark/>
-          </w:tcPr>
-          <w:p>
-            <w:pPr>
-              <w:spacing w:after="0" w:line="240" w:lineRule="auto"/>
-              <w:jc w:val="right"/>
-              <w:rPr>
-                <w:rFonts w:ascii="Calibri" w:eastAsia="Times New Roman" w:hAnsi="Calibri" w:cs="Calibri"/>
-                <w:color w:val="000000"/>
-                <w:kern w:val="0"/>
-                <w:sz w:val="22"/>
-                <w:szCs w:val="22"/>
-                <w:lang w:val="en-GB" w:eastAsia="en-GB" w:bidi="ne-NP"/>
-                <w14:ligatures w14:val="none"/>
-              </w:rPr>
-            </w:pPr>
-            <w:r>
-              <w:rPr>
-                <w:rFonts w:ascii="Calibri" w:eastAsia="Times New Roman" w:hAnsi="Calibri" w:cs="Calibri"/>
-                <w:color w:val="000000"/>
-                <w:kern w:val="0"/>
-                <w:sz w:val="22"/>
-                <w:szCs w:val="22"/>
-                <w:lang w:val="en-GB" w:eastAsia="en-GB" w:bidi="ne-NP"/>
-                <w14:ligatures w14:val="none"/>
-              </w:rPr>
-              <w:t>5</w:t>
-            </w:r>
-          </w:p>
-        </w:tc>
-      </w:tr>
-      <w:tr>
-        <w:trPr>
-          <w:trHeight w:val="288"/>
-        </w:trPr>
-        <w:tc>
-          <w:tcPr>
-            <w:tcW w:w="960" w:type="dxa"/>
-            <w:tcBorders>
-              <w:top w:val="nil"/>
-              <w:left w:val="single" w:sz="4" w:space="0" w:color="auto"/>
-              <w:bottom w:val="single" w:sz="4" w:space="0" w:color="auto"/>
-              <w:right w:val="single" w:sz="4" w:space="0" w:color="auto"/>
-            </w:tcBorders>
-            <w:noWrap/>
-            <w:vAlign w:val="bottom"/>
-            <w:hideMark/>
-          </w:tcPr>
-          <w:p>
-            <w:pPr>
-              <w:spacing w:after="0" w:line="240" w:lineRule="auto"/>
-              <w:jc w:val="right"/>
-              <w:rPr>
-                <w:rFonts w:ascii="Calibri" w:eastAsia="Times New Roman" w:hAnsi="Calibri" w:cs="Calibri"/>
-                <w:color w:val="000000"/>
-                <w:kern w:val="0"/>
-                <w:sz w:val="22"/>
-                <w:szCs w:val="22"/>
-                <w:lang w:val="en-GB" w:eastAsia="en-GB" w:bidi="ne-NP"/>
-                <w14:ligatures w14:val="none"/>
-              </w:rPr>
-            </w:pPr>
-            <w:r>
-              <w:rPr>
-                <w:rFonts w:ascii="Calibri" w:eastAsia="Times New Roman" w:hAnsi="Calibri" w:cs="Calibri"/>
-                <w:color w:val="000000"/>
-                <w:kern w:val="0"/>
-                <w:sz w:val="22"/>
-                <w:szCs w:val="22"/>
-                <w:lang w:val="en-GB" w:eastAsia="en-GB" w:bidi="ne-NP"/>
-                <w14:ligatures w14:val="none"/>
-              </w:rPr>
-              <w:t>2074</w:t>
-            </w:r>
-          </w:p>
-        </w:tc>
-        <w:tc>
-          <w:tcPr>
-            <w:tcW w:w="1286" w:type="dxa"/>
-            <w:tcBorders>
-              <w:top w:val="nil"/>
-              <w:left w:val="nil"/>
-              <w:bottom w:val="single" w:sz="4" w:space="0" w:color="auto"/>
-              <w:right w:val="single" w:sz="4" w:space="0" w:color="auto"/>
-            </w:tcBorders>
-            <w:noWrap/>
-            <w:vAlign w:val="bottom"/>
-            <w:hideMark/>
-          </w:tcPr>
-          <w:p>
-            <w:pPr>
-              <w:spacing w:after="0" w:line="240" w:lineRule="auto"/>
-              <w:jc w:val="right"/>
-              <w:rPr>
-                <w:rFonts w:ascii="Calibri" w:eastAsia="Times New Roman" w:hAnsi="Calibri" w:cs="Calibri"/>
-                <w:color w:val="000000"/>
-                <w:kern w:val="0"/>
-                <w:sz w:val="22"/>
-                <w:szCs w:val="22"/>
-                <w:lang w:val="en-GB" w:eastAsia="en-GB" w:bidi="ne-NP"/>
-                <w14:ligatures w14:val="none"/>
-              </w:rPr>
-            </w:pPr>
-            <w:r>
-              <w:rPr>
-                <w:rFonts w:ascii="Calibri" w:eastAsia="Times New Roman" w:hAnsi="Calibri" w:cs="Calibri"/>
-                <w:color w:val="000000"/>
-                <w:kern w:val="0"/>
-                <w:sz w:val="22"/>
-                <w:szCs w:val="22"/>
-                <w:lang w:val="en-GB" w:eastAsia="en-GB" w:bidi="ne-NP"/>
-                <w14:ligatures w14:val="none"/>
-              </w:rPr>
-              <w:t>9</w:t>
-            </w:r>
-          </w:p>
-        </w:tc>
-      </w:tr>
-      <w:tr>
-        <w:trPr>
-          <w:trHeight w:val="288"/>
-        </w:trPr>
-        <w:tc>
-          <w:tcPr>
-            <w:tcW w:w="960" w:type="dxa"/>
-            <w:tcBorders>
-              <w:top w:val="nil"/>
-              <w:left w:val="single" w:sz="4" w:space="0" w:color="auto"/>
-              <w:bottom w:val="single" w:sz="4" w:space="0" w:color="auto"/>
-              <w:right w:val="single" w:sz="4" w:space="0" w:color="auto"/>
-            </w:tcBorders>
-            <w:noWrap/>
-            <w:vAlign w:val="bottom"/>
-            <w:hideMark/>
-          </w:tcPr>
-          <w:p>
-            <w:pPr>
-              <w:spacing w:after="0" w:line="240" w:lineRule="auto"/>
-              <w:rPr>
-                <w:rFonts w:ascii="Calibri" w:eastAsia="Times New Roman" w:hAnsi="Calibri" w:cs="Calibri"/>
-                <w:color w:val="000000"/>
-                <w:kern w:val="0"/>
-                <w:sz w:val="22"/>
-                <w:szCs w:val="22"/>
-                <w:lang w:val="en-GB" w:eastAsia="en-GB" w:bidi="ne-NP"/>
-                <w14:ligatures w14:val="none"/>
-              </w:rPr>
-            </w:pPr>
-            <w:r>
-              <w:rPr>
-                <w:rFonts w:ascii="Calibri" w:eastAsia="Times New Roman" w:hAnsi="Calibri" w:cs="Calibri"/>
-                <w:color w:val="000000"/>
-                <w:kern w:val="0"/>
-                <w:sz w:val="22"/>
-                <w:szCs w:val="22"/>
-                <w:lang w:val="en-GB" w:eastAsia="en-GB" w:bidi="ne-NP"/>
-                <w14:ligatures w14:val="none"/>
-              </w:rPr>
-              <w:t>Total</w:t>
-            </w:r>
-          </w:p>
-        </w:tc>
-        <w:tc>
-          <w:tcPr>
-            <w:tcW w:w="1286" w:type="dxa"/>
-            <w:tcBorders>
-              <w:top w:val="nil"/>
-              <w:left w:val="nil"/>
-              <w:bottom w:val="single" w:sz="4" w:space="0" w:color="auto"/>
-              <w:right w:val="single" w:sz="4" w:space="0" w:color="auto"/>
-            </w:tcBorders>
-            <w:noWrap/>
-            <w:vAlign w:val="bottom"/>
-            <w:hideMark/>
-          </w:tcPr>
-          <w:p>
-            <w:pPr>
-              <w:spacing w:after="0" w:line="240" w:lineRule="auto"/>
-              <w:jc w:val="right"/>
-              <w:rPr>
-                <w:rFonts w:ascii="Calibri" w:eastAsia="Times New Roman" w:hAnsi="Calibri" w:cs="Calibri"/>
-                <w:color w:val="000000"/>
-                <w:kern w:val="0"/>
-                <w:sz w:val="22"/>
-                <w:szCs w:val="22"/>
-                <w:lang w:val="en-GB" w:eastAsia="en-GB" w:bidi="ne-NP"/>
-                <w14:ligatures w14:val="none"/>
-              </w:rPr>
-            </w:pPr>
-            <w:r>
-              <w:rPr>
-                <w:rFonts w:ascii="Calibri" w:eastAsia="Times New Roman" w:hAnsi="Calibri" w:cs="Calibri"/>
-                <w:color w:val="000000"/>
-                <w:kern w:val="0"/>
-                <w:sz w:val="22"/>
-                <w:szCs w:val="22"/>
-                <w:lang w:val="en-GB" w:eastAsia="en-GB" w:bidi="ne-NP"/>
-                <w14:ligatures w14:val="none"/>
-              </w:rPr>
-              <w:t>89</w:t>
-            </w:r>
-          </w:p>
-        </w:tc>
-      </w:tr>
-    </w:tbl>
-    <w:p>
-      <w:pPr>
-        <w:pStyle w:val="BodyText"/>
-      </w:pPr>
-      <w:r>
-        <w:t xml:space="preserve">#TODO remove plagiarism </w:t>
-      </w:r>
-      <w:r>
-        <w:t xml:space="preserve">The table presents the number of households affected by migration in a ward of Kathmandu over a ten-year period, from 2074 to 2083. Overall, </w:t>
-      </w:r>
-      <w:r>
-        <w:rPr>
-          <w:b/>
-          <w:bCs/>
-        </w:rPr>
-        <w:t>89 households</w:t>
-      </w:r>
-      <w:r>
-        <w:t xml:space="preserve"> were recorded as migrants during this period. The number fluctuated considerably from year to year rather than following a consistent trend. The highest figure was observed in </w:t>
-      </w:r>
-      <w:r>
-        <w:rPr>
-          <w:b/>
-          <w:bCs/>
-        </w:rPr>
-        <w:t>2082, with 16 households</w:t>
-      </w:r>
-      <w:r>
-        <w:t xml:space="preserve">, followed by </w:t>
-      </w:r>
-      <w:r>
-        <w:rPr>
-          <w:b/>
-          <w:bCs/>
-        </w:rPr>
-        <w:t>14 households in 2079</w:t>
-      </w:r>
-      <w:r>
-        <w:t xml:space="preserve"> and </w:t>
-      </w:r>
-      <w:r>
-        <w:rPr>
-          <w:b/>
-          <w:bCs/>
-        </w:rPr>
-        <w:t>12 in 2078</w:t>
-      </w:r>
-      <w:r>
-        <w:t xml:space="preserve">. In contrast, migration was relatively low in </w:t>
-      </w:r>
-      <w:r>
-        <w:rPr>
-          <w:b/>
-          <w:bCs/>
-        </w:rPr>
-        <w:t>2077, when only two households were recorded</w:t>
-      </w:r>
-      <w:r>
-        <w:t xml:space="preserve">, while the figure increased slightly to three in 2083. The remaining years showed moderate levels, ranging from five to eleven households. Notably, the data indicate a </w:t>
-      </w:r>
-      <w:r>
-        <w:lastRenderedPageBreak/>
-        <w:t>substantial increase between 2081 and 2082, when the number rose from 11 to 16 households, before declining sharply in the following year.</w:t>
+        <w:rPr>
+          <w:rFonts w:ascii="Times New Roman" w:hAnsi="Times New Roman" w:cs="Times New Roman"/>
+          <w:kern w:val="0"/>
+          <w:lang w:bidi="ne-NP"/>
+        </w:rPr>
+        <w:t xml:space="preserve">During the research study the data has been collected with the help of both structure and non-structured questionnaire, the questionnaires have included all the questions, which are needed to collect the information related to household and socio-economic activities. After the collecting of data processes the collected data has been done for 15 drawing out meaningful result, data processing has been done using software package SPSS and Excel. </w:t>
       </w:r>
     </w:p>
     <w:p>
       <w:pPr>
         <w:pStyle w:val="Heading2"/>
+        <w:numPr>
+          <w:ilvl w:val="1"/>
+          <w:numId w:val="12"/>
+        </w:numPr>
       </w:pPr>
-      <w:bookmarkStart w:id="23" w:name="_Toc230102591"/>
-      <w:r>
-        <w:t>3.4</w:t>
-      </w:r>
-      <w:r>
-        <w:t xml:space="preserve"> </w:t>
-      </w:r>
-      <w:r>
-        <w:t>Method of Data Collection</w:t>
-      </w:r>
-      <w:bookmarkEnd w:id="23"/>
-      <w:r>
-        <w:t xml:space="preserve"> </w:t>
+      <w:r>
+        <w:t xml:space="preserve">Data Analysis </w:t>
       </w:r>
     </w:p>
     <w:p>
       <w:pPr>
-        <w:pStyle w:val="BodyText"/>
+        <w:jc w:val="both"/>
+        <w:rPr>
+          <w:rFonts w:ascii="Times New Roman" w:hAnsi="Times New Roman" w:cs="Times New Roman"/>
+          <w:kern w:val="0"/>
+          <w:lang w:bidi="ne-NP"/>
+        </w:rPr>
       </w:pPr>
       <w:r>
-        <w:t>In order to obtain necessary and reliable data for thus study the researcher will use the method such as observation, unstructured interview and some case study.</w:t>
+        <w:rPr>
+          <w:rFonts w:ascii="Times New Roman" w:hAnsi="Times New Roman" w:cs="Times New Roman"/>
+          <w:kern w:val="0"/>
+          <w:lang w:bidi="ne-NP"/>
+        </w:rPr>
+        <w:t>Data has been collected from the field survey, so it needed to be analyzed to get fruitful results, the collected data has been analyzed by using SPSS programs. The result has been presented in such way: a. b. c. d. Percentage distribution Use of bar and diagram Tabulation and classification Graphical presentation</w:t>
       </w:r>
     </w:p>
     <w:p>
       <w:pPr>
-        <w:pStyle w:val="BodyText"/>
-        <w:rPr>
+        <w:rPr>
+          <w:rFonts w:ascii="Times New Roman" w:hAnsi="Times New Roman" w:cs="Times New Roman"/>
           <w:b/>
           <w:bCs/>
+          <w:color w:val="000000"/>
+          <w:kern w:val="0"/>
         </w:rPr>
       </w:pPr>
       <w:r>
@@ -6651,231 +5720,50 @@
           <w:b/>
           <w:bCs/>
         </w:rPr>
-        <w:t>Observation</w:t>
+        <w:br w:type="page"/>
       </w:r>
     </w:p>
     <w:p>
       <w:pPr>
-        <w:pStyle w:val="BodyText"/>
-        <w:rPr>
-          <w:lang w:eastAsia="en-US"/>
+        <w:pStyle w:val="Heading1"/>
+        <w:jc w:val="left"/>
+        <w:rPr>
+          <w:rStyle w:val="Strong"/>
+          <w:b/>
+          <w:bCs w:val="0"/>
         </w:rPr>
       </w:pPr>
       <w:r>
         <w:rPr>
-          <w:lang w:eastAsia="en-US"/>
-        </w:rPr>
-        <w:t>The study will use questionnaires as the main tool for primary data collection. Structured questionnaires will be administered to respondents to obtain information regarding the causes and consequences of internal migration.</w:t>
-      </w:r>
-      <w:r>
-        <w:t xml:space="preserve"> </w:t>
-      </w:r>
-      <w:r>
-        <w:rPr>
-          <w:lang w:eastAsia="en-US"/>
-        </w:rPr>
-        <w:t>The questionnaire will be divided into four sections. The first section deals with the purpose of getting information about demographic variables. The second section will deal with the main reason behind the immigration, while the third section will be the socio-economic variables. The last section includes the miscellaneous questionnaire about the causes and consequences of immigration within the study area.</w:t>
+          <w:rStyle w:val="Strong"/>
+          <w:b/>
+          <w:bCs w:val="0"/>
+        </w:rPr>
+        <w:lastRenderedPageBreak/>
+        <w:t xml:space="preserve">CHAPTER FOUR </w:t>
       </w:r>
     </w:p>
     <w:p>
       <w:pPr>
-        <w:pStyle w:val="BodyText"/>
-        <w:rPr>
-          <w:lang w:eastAsia="en-US"/>
+        <w:pStyle w:val="Heading1"/>
+        <w:spacing w:line="360" w:lineRule="auto"/>
+        <w:rPr>
+          <w:rStyle w:val="Strong"/>
+          <w:b/>
+          <w:bCs w:val="0"/>
+          <w:sz w:val="28"/>
+          <w:szCs w:val="38"/>
         </w:rPr>
       </w:pPr>
       <w:r>
         <w:rPr>
-          <w:lang w:eastAsia="en-US"/>
-        </w:rPr>
-        <w:t>In addition, secondary information will be collected from ward office records, local government reports, census data, and related literature.</w:t>
-      </w:r>
-    </w:p>
-    <w:p>
-      <w:pPr>
-        <w:pStyle w:val="BodyText"/>
-        <w:rPr>
-          <w:lang w:eastAsia="en-US"/>
-        </w:rPr>
-      </w:pPr>
-      <w:r>
-        <w:rPr>
-          <w:lang w:eastAsia="en-US"/>
-        </w:rPr>
-        <w:t>The collected data will be organized, classified, and analyzed using tables, percentages, and descriptive interpretation.</w:t>
-      </w:r>
-    </w:p>
-    <w:p>
-      <w:pPr>
-        <w:pStyle w:val="Heading2"/>
-      </w:pPr>
-      <w:bookmarkStart w:id="24" w:name="_Toc230102592"/>
-      <w:r>
-        <w:t>3.5</w:t>
-      </w:r>
-      <w:r>
-        <w:t xml:space="preserve"> </w:t>
-      </w:r>
-      <w:r>
-        <w:t>Data Analysis and Presentation</w:t>
-      </w:r>
-      <w:bookmarkEnd w:id="24"/>
-    </w:p>
-    <w:p>
-      <w:pPr>
-        <w:pStyle w:val="BodyText"/>
-        <w:rPr>
-          <w:lang w:eastAsia="en-US"/>
-        </w:rPr>
-      </w:pPr>
-      <w:r>
-        <w:rPr>
-          <w:lang w:eastAsia="en-US"/>
-        </w:rPr>
-        <w:t>For the analysis and presentation of quantitative data, the study used the Statistical Package for the Social Sciences (SPSS). SPSS was selected because it is widely used in social science research for its efficiency in handling numerical data and its ability to perform both descriptive and inferential statistical analysis.</w:t>
-      </w:r>
-    </w:p>
-    <w:p>
-      <w:pPr>
-        <w:pStyle w:val="BodyText"/>
-        <w:rPr>
-          <w:lang w:eastAsia="en-US"/>
-        </w:rPr>
-      </w:pPr>
-      <w:r>
-        <w:rPr>
-          <w:lang w:eastAsia="en-US"/>
-        </w:rPr>
-        <w:t xml:space="preserve">The collected data from questionnaires and ward records were coded and entered into SPSS for analysis. The software was used to generate frequency distributions, percentages, </w:t>
-      </w:r>
-      <w:r>
-        <w:rPr>
-          <w:lang w:eastAsia="en-US"/>
-        </w:rPr>
-        <w:lastRenderedPageBreak/>
-        <w:t>tables, and charts to clearly present the findings. These statistical outputs helped in interpreting patterns of migration among households in the study area.</w:t>
-      </w:r>
-    </w:p>
-    <w:p>
-      <w:pPr>
-        <w:pStyle w:val="BodyText"/>
-        <w:rPr>
-          <w:lang w:eastAsia="en-US"/>
-        </w:rPr>
-      </w:pPr>
-      <w:r>
-        <w:rPr>
-          <w:lang w:eastAsia="en-US"/>
-        </w:rPr>
-        <w:t>In addition to SPSS, Microsoft Excel was used for preliminary data entry, cleaning, and simple tabulation before importing data into SPSS for advanced analysis and visualization.</w:t>
-      </w:r>
-    </w:p>
-    <w:p>
-      <w:pPr>
-        <w:pStyle w:val="Heading2"/>
-      </w:pPr>
-      <w:bookmarkStart w:id="25" w:name="_Toc230102593"/>
-      <w:r>
-        <w:t>3.6</w:t>
-      </w:r>
-      <w:r>
-        <w:t xml:space="preserve"> </w:t>
-      </w:r>
-      <w:r>
-        <w:t>Ethical Consideration</w:t>
-      </w:r>
-      <w:bookmarkEnd w:id="25"/>
-      <w:r>
-        <w:t xml:space="preserve"> </w:t>
-      </w:r>
-    </w:p>
-    <w:p>
-      <w:pPr>
-        <w:pStyle w:val="Default"/>
-        <w:numPr>
-          <w:ilvl w:val="0"/>
-          <w:numId w:val="16"/>
-        </w:numPr>
-        <w:spacing w:before="240" w:after="240" w:line="360" w:lineRule="auto"/>
-        <w:jc w:val="both"/>
-      </w:pPr>
-      <w:r>
-        <w:t>Formal approval will obtain from ward office.</w:t>
-      </w:r>
-    </w:p>
-    <w:p>
-      <w:pPr>
-        <w:pStyle w:val="Default"/>
-        <w:numPr>
-          <w:ilvl w:val="0"/>
-          <w:numId w:val="16"/>
-        </w:numPr>
-        <w:spacing w:before="240" w:after="240" w:line="360" w:lineRule="auto"/>
-        <w:jc w:val="both"/>
-      </w:pPr>
-      <w:r>
-        <w:t>Verbal consent will obtain from each participant before data collection</w:t>
-      </w:r>
-    </w:p>
-    <w:p>
-      <w:pPr>
-        <w:pStyle w:val="Default"/>
-        <w:numPr>
-          <w:ilvl w:val="0"/>
-          <w:numId w:val="16"/>
-        </w:numPr>
-        <w:spacing w:before="240" w:after="240" w:line="360" w:lineRule="auto"/>
-        <w:jc w:val="both"/>
-      </w:pPr>
-      <w:r>
-        <w:t xml:space="preserve">Purpose of the study will </w:t>
-      </w:r>
-      <w:r>
-        <w:t>be briefly</w:t>
-      </w:r>
-      <w:r>
-        <w:t xml:space="preserve"> informed to participants</w:t>
-      </w:r>
-    </w:p>
-    <w:p>
-      <w:pPr>
-        <w:pStyle w:val="Default"/>
-        <w:numPr>
-          <w:ilvl w:val="0"/>
-          <w:numId w:val="16"/>
-        </w:numPr>
-        <w:spacing w:before="240" w:after="240" w:line="360" w:lineRule="auto"/>
-        <w:jc w:val="both"/>
-      </w:pPr>
-      <w:r>
-        <w:t>Confidentiality will maintain throughout the study period</w:t>
-      </w:r>
-    </w:p>
-    <w:p>
-      <w:pPr>
-        <w:pStyle w:val="Default"/>
-        <w:spacing w:before="240" w:after="240" w:line="360" w:lineRule="auto"/>
-        <w:ind w:left="720"/>
-        <w:jc w:val="both"/>
-      </w:pPr>
-    </w:p>
-    <w:p>
-      <w:pPr>
-        <w:pStyle w:val="Default"/>
-        <w:spacing w:before="240" w:after="240" w:line="360" w:lineRule="auto"/>
-        <w:ind w:left="720"/>
-        <w:jc w:val="both"/>
-        <w:rPr>
+          <w:rStyle w:val="Strong"/>
           <w:b/>
-          <w:bCs/>
-        </w:rPr>
-      </w:pPr>
-      <w:r>
-        <w:rPr>
-          <w:b/>
-          <w:bCs/>
-        </w:rPr>
-        <w:t>CHAPTER FOUR SOCIO-ECONOMIC AND DEMOGRAPHIC CHARACTERISTICS OF MIGRANTS</w:t>
+          <w:bCs w:val="0"/>
+          <w:sz w:val="28"/>
+          <w:szCs w:val="38"/>
+        </w:rPr>
+        <w:t>SOCIO-ECONOMIC AND DEMOGRAPHIC CHARACTERISTICS OF MIGRANTS</w:t>
       </w:r>
     </w:p>
     <w:p>
@@ -6953,11 +5841,7 @@
         <w:jc w:val="both"/>
       </w:pPr>
       <w:r>
-        <w:t xml:space="preserve">Education is one of the most important social characteristic of population. Education plays important role in migration. Educated people migrate in search of suitable employment opportunity and social status. Young people move and achieve better education. Educational </w:t>
-      </w:r>
-      <w:r>
-        <w:lastRenderedPageBreak/>
-        <w:t xml:space="preserve">status of migrants have an important role in overall economic and family development. If household head is </w:t>
+        <w:t xml:space="preserve">Education is one of the most important social characteristic of population. Education plays important role in migration. Educated people migrate in search of suitable employment opportunity and social status. Young people move and achieve better education. Educational status of migrants have an important role in overall economic and family development. If household head is </w:t>
       </w:r>
       <w:proofErr w:type="spellStart"/>
       <w:r>
@@ -7607,6 +6491,7 @@
                 <w:lang w:val="en-GB" w:eastAsia="en-GB" w:bidi="ne-NP"/>
                 <w14:ligatures w14:val="none"/>
               </w:rPr>
+              <w:lastRenderedPageBreak/>
               <w:t>Literate</w:t>
             </w:r>
           </w:p>
@@ -8598,7 +7483,6 @@
         <w:rPr>
           <w:noProof/>
         </w:rPr>
-        <w:lastRenderedPageBreak/>
         <w:drawing>
           <wp:inline distT="0" distB="0" distL="0" distR="0" wp14:anchorId="07D2EBA8" wp14:editId="41A73072">
             <wp:extent cx="5052060" cy="3265170"/>
@@ -8652,7 +7536,14 @@
         <w:rPr>
           <w:rFonts w:ascii="Times New Roman" w:hAnsi="Times New Roman" w:cs="Times New Roman"/>
         </w:rPr>
-        <w:t xml:space="preserve">There are various social characteristics of migrants. Among them ethnic composition is another major component that is directly affects migration. The households of migrants in </w:t>
+        <w:t xml:space="preserve">There are various social characteristics of migrants. Among them ethnic composition is another major component that is directly affects </w:t>
+      </w:r>
+      <w:r>
+        <w:rPr>
+          <w:rFonts w:ascii="Times New Roman" w:hAnsi="Times New Roman" w:cs="Times New Roman"/>
+        </w:rPr>
+        <w:lastRenderedPageBreak/>
+        <w:t xml:space="preserve">migration. The households of migrants in </w:t>
       </w:r>
       <w:proofErr w:type="spellStart"/>
       <w:r>
@@ -9591,7 +8482,6 @@
           <w:b/>
           <w:bCs/>
         </w:rPr>
-        <w:lastRenderedPageBreak/>
         <w:t>Dalit households have the lowest representation</w:t>
       </w:r>
       <w:r>
@@ -9682,6 +8572,7 @@
         <w:rPr>
           <w:rFonts w:ascii="Times New Roman" w:hAnsi="Times New Roman" w:cs="Times New Roman"/>
         </w:rPr>
+        <w:lastRenderedPageBreak/>
         <w:t>The religion is considered as the major factors determining the migration among the social and cultural determinants. Religions composition is one of the important social characteristics of population. Economic, social and cultural differences are associated with the major religions of nation. Religious composition within the country is very important because it often determines the national locality of certain groups of caste and ethnicity and also plays an important part in making decision for migration. The table of religious composition is given below.</w:t>
       </w:r>
     </w:p>
@@ -10495,7 +9386,6 @@
         <w:rPr>
           <w:noProof/>
         </w:rPr>
-        <w:lastRenderedPageBreak/>
         <w:drawing>
           <wp:inline distT="0" distB="0" distL="0" distR="0" wp14:anchorId="24D4D8CD" wp14:editId="148DE7EC">
             <wp:extent cx="4572000" cy="2605087"/>
@@ -10618,7 +9508,14 @@
         <w:rPr>
           <w:lang w:val="en-GB"/>
         </w:rPr>
-        <w:t xml:space="preserve"> of the total. No Muslim households were recorded in the surveyed area. Overall, the data indicate that Hinduism is the predominant religion, followed by Buddhism, while Christianity has a comparatively smaller presence.</w:t>
+        <w:t xml:space="preserve"> of the total. No Muslim households were </w:t>
+      </w:r>
+      <w:r>
+        <w:rPr>
+          <w:lang w:val="en-GB"/>
+        </w:rPr>
+        <w:lastRenderedPageBreak/>
+        <w:t>recorded in the surveyed area. Overall, the data indicate that Hinduism is the predominant religion, followed by Buddhism, while Christianity has a comparatively smaller presence.</w:t>
       </w:r>
     </w:p>
     <w:p>
@@ -10766,7 +9663,6 @@
                 <w:lang w:val="en-GB" w:eastAsia="en-GB" w:bidi="ne-NP"/>
                 <w14:ligatures w14:val="none"/>
               </w:rPr>
-              <w:lastRenderedPageBreak/>
               <w:t>Size of Land Holding</w:t>
             </w:r>
           </w:p>
@@ -11800,6 +10696,7 @@
         <w:rPr>
           <w:rFonts w:ascii="Times New Roman" w:hAnsi="Times New Roman" w:cs="Times New Roman"/>
         </w:rPr>
+        <w:lastRenderedPageBreak/>
         <w:t>4.</w:t>
       </w:r>
       <w:r>
@@ -12516,7 +11413,6 @@
         <w:rPr>
           <w:noProof/>
         </w:rPr>
-        <w:lastRenderedPageBreak/>
         <w:drawing>
           <wp:inline distT="0" distB="0" distL="0" distR="0" wp14:anchorId="7F028166" wp14:editId="30FC6985">
             <wp:extent cx="4572000" cy="2743200"/>
@@ -13336,6 +12232,7 @@
                 <w:lang w:val="en-GB" w:eastAsia="en-GB" w:bidi="ne-NP"/>
                 <w14:ligatures w14:val="none"/>
               </w:rPr>
+              <w:lastRenderedPageBreak/>
               <w:t>5-9</w:t>
             </w:r>
           </w:p>
@@ -17384,7 +16281,6 @@
           <w:rFonts w:ascii="Times New Roman" w:hAnsi="Times New Roman" w:cs="Times New Roman"/>
           <w:lang w:val="en-GB"/>
         </w:rPr>
-        <w:lastRenderedPageBreak/>
         <w:t xml:space="preserve">The table presents the age and sex distribution of migrants in the selected ward of Kathmandu. A total of </w:t>
       </w:r>
       <w:r>
@@ -17751,6 +16647,7 @@
                 <w:lang w:val="en-GB" w:eastAsia="en-GB" w:bidi="ne-NP"/>
                 <w14:ligatures w14:val="none"/>
               </w:rPr>
+              <w:lastRenderedPageBreak/>
               <w:t>Marital Status</w:t>
             </w:r>
           </w:p>
@@ -19157,15 +18054,7 @@
           <w:rFonts w:ascii="Times New Roman" w:hAnsi="Times New Roman" w:cs="Times New Roman"/>
           <w:lang w:val="en-GB"/>
         </w:rPr>
-        <w:t xml:space="preserve">The table presents the marital status of migrants according to sex in the selected ward of Kathmandu. A total of 324 migrants were recorded, comprising 168 males and 156 </w:t>
-      </w:r>
-      <w:r>
-        <w:rPr>
-          <w:rFonts w:ascii="Times New Roman" w:hAnsi="Times New Roman" w:cs="Times New Roman"/>
-          <w:lang w:val="en-GB"/>
-        </w:rPr>
-        <w:lastRenderedPageBreak/>
-        <w:t>females. Overall, 201 migrants, or 62.04%, are married, while 123 migrants, representing 37.96%, are unmarried.</w:t>
+        <w:t>The table presents the marital status of migrants according to sex in the selected ward of Kathmandu. A total of 324 migrants were recorded, comprising 168 males and 156 females. Overall, 201 migrants, or 62.04%, are married, while 123 migrants, representing 37.96%, are unmarried.</w:t>
       </w:r>
     </w:p>
     <w:p>
@@ -19206,6 +18095,7 @@
         <w:rPr>
           <w:noProof/>
         </w:rPr>
+        <w:lastRenderedPageBreak/>
         <w:drawing>
           <wp:inline distT="0" distB="0" distL="0" distR="0" wp14:anchorId="22FDB016" wp14:editId="11371C3D">
             <wp:extent cx="4552950" cy="3800475"/>
@@ -19244,7 +18134,6 @@
         <w:rPr>
           <w:noProof/>
         </w:rPr>
-        <w:lastRenderedPageBreak/>
         <w:drawing>
           <wp:inline distT="0" distB="0" distL="0" distR="0" wp14:anchorId="530BEEC9" wp14:editId="1BBA1BAA">
             <wp:extent cx="4366260" cy="2857500"/>
@@ -19296,6 +18185,7 @@
         <w:rPr>
           <w:rFonts w:ascii="Times New Roman" w:hAnsi="Times New Roman" w:cs="Times New Roman"/>
         </w:rPr>
+        <w:lastRenderedPageBreak/>
         <w:t>Family size is one of the most important factor for migration. Due to lack of consumption of goods and other facilities people have the trend to migrate. Large family size is one of the main push factor of migration.</w:t>
       </w:r>
     </w:p>
@@ -20099,7 +18989,6 @@
         <w:rPr>
           <w:noProof/>
         </w:rPr>
-        <w:lastRenderedPageBreak/>
         <w:drawing>
           <wp:inline distT="0" distB="0" distL="0" distR="0" wp14:anchorId="6DAE99A1" wp14:editId="1FD2912C">
             <wp:extent cx="4572000" cy="2857500"/>
@@ -21086,7 +19975,7 @@
         </w:rPr>
       </w:pPr>
     </w:p>
-    <w:bookmarkStart w:id="26" w:name="_Toc230102594" w:displacedByCustomXml="next"/>
+    <w:bookmarkStart w:id="22" w:name="_Toc230102594" w:displacedByCustomXml="next"/>
     <w:sdt>
       <w:sdtPr>
         <w:rPr>
@@ -21109,7 +19998,7 @@
           <w:r>
             <w:t>References</w:t>
           </w:r>
-          <w:bookmarkEnd w:id="26"/>
+          <w:bookmarkEnd w:id="22"/>
         </w:p>
         <w:sdt>
           <w:sdtPr>
@@ -21809,7 +20698,7 @@
           <w:bCs w:val="0"/>
         </w:rPr>
       </w:pPr>
-      <w:bookmarkStart w:id="27" w:name="_Toc230102595"/>
+      <w:bookmarkStart w:id="23" w:name="_Toc230102595"/>
       <w:r>
         <w:rPr>
           <w:rStyle w:val="Strong"/>
@@ -21819,7 +20708,7 @@
         <w:lastRenderedPageBreak/>
         <w:t>APPENDIX: Research Questionnaire</w:t>
       </w:r>
-      <w:bookmarkEnd w:id="27"/>
+      <w:bookmarkEnd w:id="23"/>
     </w:p>
     <w:p>
       <w:pPr>
@@ -25506,19 +24395,11 @@
           </w:tcPr>
           <w:p>
             <w:r>
-              <w:t xml:space="preserve">1. </w:t>
-            </w:r>
-            <w:proofErr w:type="spellStart"/>
-            <w:r>
-              <w:t>Self</w:t>
+              <w:t>1. Self</w:t>
             </w:r>
             <w:r>
               <w:br/>
-              <w:t>2</w:t>
-            </w:r>
-            <w:proofErr w:type="spellEnd"/>
-            <w:r>
-              <w:t>. Parents</w:t>
+              <w:t>2. Parents</w:t>
             </w:r>
             <w:r>
               <w:br/>
@@ -26498,7 +25379,13 @@
           <w:rPr>
             <w:noProof/>
           </w:rPr>
-          <w:t>28</w:t>
+          <w:t>2</w:t>
+        </w:r>
+        <w:r>
+          <w:rPr>
+            <w:noProof/>
+          </w:rPr>
+          <w:t>8</w:t>
         </w:r>
         <w:r>
           <w:rPr>
@@ -27656,9 +26543,9 @@
   </w:abstractNum>
   <w:abstractNum w:abstractNumId="11" w15:restartNumberingAfterBreak="0">
     <w:nsid w:val="6085207A"/>
-    <w:multiLevelType w:val="hybridMultilevel"/>
-    <w:tmpl w:val="1A6E6394"/>
-    <w:lvl w:ilvl="0" w:tplc="0409000F">
+    <w:multiLevelType w:val="multilevel"/>
+    <w:tmpl w:val="32D45970"/>
+    <w:lvl w:ilvl="0">
       <w:start w:val="1"/>
       <w:numFmt w:val="decimal"/>
       <w:lvlText w:val="%1."/>
@@ -27667,77 +26554,109 @@
         <w:ind w:left="720" w:hanging="360"/>
       </w:pPr>
     </w:lvl>
-    <w:lvl w:ilvl="1" w:tplc="04090019" w:tentative="1">
-      <w:start w:val="1"/>
-      <w:numFmt w:val="lowerLetter"/>
-      <w:lvlText w:val="%2."/>
+    <w:lvl w:ilvl="1">
+      <w:start w:val="3"/>
+      <w:numFmt w:val="decimal"/>
+      <w:isLgl/>
+      <w:lvlText w:val="%1.%2"/>
       <w:lvlJc w:val="left"/>
       <w:pPr>
-        <w:ind w:left="1440" w:hanging="360"/>
+        <w:ind w:left="420" w:hanging="420"/>
       </w:pPr>
+      <w:rPr>
+        <w:rFonts w:hint="default"/>
+      </w:rPr>
     </w:lvl>
-    <w:lvl w:ilvl="2" w:tplc="0409001B" w:tentative="1">
-      <w:start w:val="1"/>
-      <w:numFmt w:val="lowerRoman"/>
-      <w:lvlText w:val="%3."/>
-      <w:lvlJc w:val="right"/>
-      <w:pPr>
-        <w:ind w:left="2160" w:hanging="180"/>
-      </w:pPr>
-    </w:lvl>
-    <w:lvl w:ilvl="3" w:tplc="0409000F" w:tentative="1">
+    <w:lvl w:ilvl="2">
       <w:start w:val="1"/>
       <w:numFmt w:val="decimal"/>
-      <w:lvlText w:val="%4."/>
+      <w:isLgl/>
+      <w:lvlText w:val="%1.%2.%3"/>
       <w:lvlJc w:val="left"/>
       <w:pPr>
-        <w:ind w:left="2880" w:hanging="360"/>
+        <w:ind w:left="1080" w:hanging="720"/>
       </w:pPr>
+      <w:rPr>
+        <w:rFonts w:hint="default"/>
+      </w:rPr>
     </w:lvl>
-    <w:lvl w:ilvl="4" w:tplc="04090019" w:tentative="1">
+    <w:lvl w:ilvl="3">
       <w:start w:val="1"/>
-      <w:numFmt w:val="lowerLetter"/>
-      <w:lvlText w:val="%5."/>
+      <w:numFmt w:val="decimal"/>
+      <w:isLgl/>
+      <w:lvlText w:val="%1.%2.%3.%4"/>
       <w:lvlJc w:val="left"/>
       <w:pPr>
-        <w:ind w:left="3600" w:hanging="360"/>
+        <w:ind w:left="1440" w:hanging="1080"/>
       </w:pPr>
+      <w:rPr>
+        <w:rFonts w:hint="default"/>
+      </w:rPr>
     </w:lvl>
-    <w:lvl w:ilvl="5" w:tplc="0409001B" w:tentative="1">
-      <w:start w:val="1"/>
-      <w:numFmt w:val="lowerRoman"/>
-      <w:lvlText w:val="%6."/>
-      <w:lvlJc w:val="right"/>
-      <w:pPr>
-        <w:ind w:left="4320" w:hanging="180"/>
-      </w:pPr>
-    </w:lvl>
-    <w:lvl w:ilvl="6" w:tplc="0409000F" w:tentative="1">
+    <w:lvl w:ilvl="4">
       <w:start w:val="1"/>
       <w:numFmt w:val="decimal"/>
-      <w:lvlText w:val="%7."/>
+      <w:isLgl/>
+      <w:lvlText w:val="%1.%2.%3.%4.%5"/>
       <w:lvlJc w:val="left"/>
       <w:pPr>
-        <w:ind w:left="5040" w:hanging="360"/>
+        <w:ind w:left="1440" w:hanging="1080"/>
       </w:pPr>
+      <w:rPr>
+        <w:rFonts w:hint="default"/>
+      </w:rPr>
     </w:lvl>
-    <w:lvl w:ilvl="7" w:tplc="04090019" w:tentative="1">
+    <w:lvl w:ilvl="5">
       <w:start w:val="1"/>
-      <w:numFmt w:val="lowerLetter"/>
-      <w:lvlText w:val="%8."/>
+      <w:numFmt w:val="decimal"/>
+      <w:isLgl/>
+      <w:lvlText w:val="%1.%2.%3.%4.%5.%6"/>
       <w:lvlJc w:val="left"/>
       <w:pPr>
-        <w:ind w:left="5760" w:hanging="360"/>
+        <w:ind w:left="1800" w:hanging="1440"/>
       </w:pPr>
+      <w:rPr>
+        <w:rFonts w:hint="default"/>
+      </w:rPr>
     </w:lvl>
-    <w:lvl w:ilvl="8" w:tplc="0409001B" w:tentative="1">
+    <w:lvl w:ilvl="6">
       <w:start w:val="1"/>
-      <w:numFmt w:val="lowerRoman"/>
-      <w:lvlText w:val="%9."/>
-      <w:lvlJc w:val="right"/>
+      <w:numFmt w:val="decimal"/>
+      <w:isLgl/>
+      <w:lvlText w:val="%1.%2.%3.%4.%5.%6.%7"/>
+      <w:lvlJc w:val="left"/>
       <w:pPr>
-        <w:ind w:left="6480" w:hanging="180"/>
+        <w:ind w:left="1800" w:hanging="1440"/>
       </w:pPr>
+      <w:rPr>
+        <w:rFonts w:hint="default"/>
+      </w:rPr>
+    </w:lvl>
+    <w:lvl w:ilvl="7">
+      <w:start w:val="1"/>
+      <w:numFmt w:val="decimal"/>
+      <w:isLgl/>
+      <w:lvlText w:val="%1.%2.%3.%4.%5.%6.%7.%8"/>
+      <w:lvlJc w:val="left"/>
+      <w:pPr>
+        <w:ind w:left="2160" w:hanging="1800"/>
+      </w:pPr>
+      <w:rPr>
+        <w:rFonts w:hint="default"/>
+      </w:rPr>
+    </w:lvl>
+    <w:lvl w:ilvl="8">
+      <w:start w:val="1"/>
+      <w:numFmt w:val="decimal"/>
+      <w:isLgl/>
+      <w:lvlText w:val="%1.%2.%3.%4.%5.%6.%7.%8.%9"/>
+      <w:lvlJc w:val="left"/>
+      <w:pPr>
+        <w:ind w:left="2520" w:hanging="2160"/>
+      </w:pPr>
+      <w:rPr>
+        <w:rFonts w:hint="default"/>
+      </w:rPr>
     </w:lvl>
   </w:abstractNum>
   <w:abstractNum w:abstractNumId="12" w15:restartNumberingAfterBreak="0">
@@ -28872,7 +27791,6 @@
   <w:style w:type="character" w:default="1" w:styleId="DefaultParagraphFont">
     <w:name w:val="Default Paragraph Font"/>
     <w:uiPriority w:val="1"/>
-    <w:semiHidden/>
     <w:unhideWhenUsed/>
   </w:style>
   <w:style w:type="table" w:default="1" w:styleId="TableNormal">

</xml_diff>